<commit_message>
ADD new table asf_image and its processing.
</commit_message>
<xml_diff>
--- a/template/tagtemplate.docx
+++ b/template/tagtemplate.docx
@@ -7657,23 +7657,7 @@
                 <w:sz w:val="22"/>
                 <w:szCs w:val="22"/>
               </w:rPr>
-              <w:t xml:space="preserve"> сгорание части шлейфа газа в </w:t>
-            </w:r>
-            <w:proofErr w:type="spellStart"/>
-            <w:r>
-              <w:rPr>
-                <w:sz w:val="22"/>
-                <w:szCs w:val="22"/>
-              </w:rPr>
-              <w:t>дефлаграционном</w:t>
-            </w:r>
-            <w:proofErr w:type="spellEnd"/>
-            <w:r>
-              <w:rPr>
-                <w:sz w:val="22"/>
-                <w:szCs w:val="22"/>
-              </w:rPr>
-              <w:t xml:space="preserve"> режиме с образованием ударной волны </w:t>
+              <w:t xml:space="preserve"> сгорание части шлейфа газа в дефлаграционном режиме с образованием ударной волны </w:t>
             </w:r>
             <w:r>
               <w:rPr>
@@ -7825,23 +7809,7 @@
                 <w:sz w:val="22"/>
                 <w:szCs w:val="22"/>
               </w:rPr>
-              <w:t xml:space="preserve"> взрыв ГВС (</w:t>
-            </w:r>
-            <w:proofErr w:type="spellStart"/>
-            <w:r>
-              <w:rPr>
-                <w:sz w:val="22"/>
-                <w:szCs w:val="22"/>
-              </w:rPr>
-              <w:t>дефлаграционное</w:t>
-            </w:r>
-            <w:proofErr w:type="spellEnd"/>
-            <w:r>
-              <w:rPr>
-                <w:sz w:val="22"/>
-                <w:szCs w:val="22"/>
-              </w:rPr>
-              <w:t xml:space="preserve"> сгорание) при наличии источника инициирования  </w:t>
+              <w:t xml:space="preserve"> взрыв ГВС (дефлаграционное сгорание) при наличии источника инициирования  </w:t>
             </w:r>
             <w:r>
               <w:rPr>
@@ -8011,23 +7979,7 @@
                 <w:sz w:val="22"/>
                 <w:szCs w:val="22"/>
               </w:rPr>
-              <w:t xml:space="preserve"> взрыв ГВС (</w:t>
-            </w:r>
-            <w:proofErr w:type="spellStart"/>
-            <w:r>
-              <w:rPr>
-                <w:sz w:val="22"/>
-                <w:szCs w:val="22"/>
-              </w:rPr>
-              <w:t>дефлаграционное</w:t>
-            </w:r>
-            <w:proofErr w:type="spellEnd"/>
-            <w:r>
-              <w:rPr>
-                <w:sz w:val="22"/>
-                <w:szCs w:val="22"/>
-              </w:rPr>
-              <w:t xml:space="preserve"> сгорание) при наличии источника инициирования </w:t>
+              <w:t xml:space="preserve"> взрыв ГВС (дефлаграционное сгорание) при наличии источника инициирования </w:t>
             </w:r>
             <w:r>
               <w:rPr>
@@ -9296,30 +9248,28 @@
           <w:docGrid w:linePitch="360"/>
         </w:sectPr>
       </w:pPr>
-      <w:bookmarkStart w:id="37" w:name="_GoBack"/>
-      <w:bookmarkEnd w:id="37"/>
     </w:p>
     <w:p>
       <w:pPr>
         <w:pStyle w:val="2a"/>
       </w:pPr>
-      <w:bookmarkStart w:id="38" w:name="_Toc392754515"/>
-      <w:bookmarkStart w:id="39" w:name="_Toc430097611"/>
-      <w:bookmarkStart w:id="40" w:name="_Toc430255938"/>
-      <w:bookmarkStart w:id="41" w:name="_Toc209703492"/>
-      <w:bookmarkStart w:id="42" w:name="_Toc221000965"/>
+      <w:bookmarkStart w:id="37" w:name="_Toc392754515"/>
+      <w:bookmarkStart w:id="38" w:name="_Toc430097611"/>
+      <w:bookmarkStart w:id="39" w:name="_Toc430255938"/>
+      <w:bookmarkStart w:id="40" w:name="_Toc209703492"/>
+      <w:bookmarkStart w:id="41" w:name="_Toc221000965"/>
       <w:r>
         <w:lastRenderedPageBreak/>
         <w:t xml:space="preserve">2.2. </w:t>
       </w:r>
+      <w:bookmarkEnd w:id="37"/>
       <w:bookmarkEnd w:id="38"/>
       <w:bookmarkEnd w:id="39"/>
       <w:bookmarkEnd w:id="40"/>
+      <w:r>
+        <w:t>Характеристики аварийности, присущие объекту, и травматизма на нем</w:t>
+      </w:r>
       <w:bookmarkEnd w:id="41"/>
-      <w:r>
-        <w:t>Характеристики аварийности, присущие объекту, и травматизма на нем</w:t>
-      </w:r>
-      <w:bookmarkEnd w:id="42"/>
     </w:p>
     <w:p>
       <w:pPr>
@@ -9471,15 +9421,15 @@
           <w:lang w:eastAsia="en-US"/>
         </w:rPr>
       </w:pPr>
-      <w:bookmarkStart w:id="43" w:name="_Toc405384919"/>
-      <w:bookmarkStart w:id="44" w:name="_Toc405989862"/>
-      <w:bookmarkStart w:id="45" w:name="_Toc409789862"/>
-      <w:bookmarkStart w:id="46" w:name="_Toc409790164"/>
-      <w:bookmarkStart w:id="47" w:name="_Toc427057243"/>
-      <w:bookmarkStart w:id="48" w:name="_Toc430943228"/>
-      <w:bookmarkStart w:id="49" w:name="_Toc430958121"/>
-      <w:bookmarkStart w:id="50" w:name="_Toc209703493"/>
-      <w:bookmarkStart w:id="51" w:name="_Toc221000966"/>
+      <w:bookmarkStart w:id="42" w:name="_Toc405384919"/>
+      <w:bookmarkStart w:id="43" w:name="_Toc405989862"/>
+      <w:bookmarkStart w:id="44" w:name="_Toc409789862"/>
+      <w:bookmarkStart w:id="45" w:name="_Toc409790164"/>
+      <w:bookmarkStart w:id="46" w:name="_Toc427057243"/>
+      <w:bookmarkStart w:id="47" w:name="_Toc430943228"/>
+      <w:bookmarkStart w:id="48" w:name="_Toc430958121"/>
+      <w:bookmarkStart w:id="49" w:name="_Toc209703493"/>
+      <w:bookmarkStart w:id="50" w:name="_Toc221000966"/>
       <w:r>
         <w:rPr>
           <w:lang w:eastAsia="en-US"/>
@@ -9541,6 +9491,7 @@
         </w:rPr>
         <w:t>соответствие задачам ликвидации последствий аварий</w:t>
       </w:r>
+      <w:bookmarkEnd w:id="42"/>
       <w:bookmarkEnd w:id="43"/>
       <w:bookmarkEnd w:id="44"/>
       <w:bookmarkEnd w:id="45"/>
@@ -9549,7 +9500,6 @@
       <w:bookmarkEnd w:id="48"/>
       <w:bookmarkEnd w:id="49"/>
       <w:bookmarkEnd w:id="50"/>
-      <w:bookmarkEnd w:id="51"/>
     </w:p>
     <w:p>
       <w:pPr>
@@ -9789,7 +9739,7 @@
       <w:r>
         <w:t xml:space="preserve"> </w:t>
       </w:r>
-      <w:bookmarkStart w:id="52" w:name="_Hlk221181409"/>
+      <w:bookmarkStart w:id="51" w:name="_Hlk221181409"/>
       <w:sdt>
         <w:sdtPr>
           <w:tag w:val="ORG_SHORT_NAME"/>
@@ -9806,7 +9756,7 @@
           </w:r>
         </w:sdtContent>
       </w:sdt>
-      <w:bookmarkEnd w:id="52"/>
+      <w:bookmarkEnd w:id="51"/>
       <w:r>
         <w:t xml:space="preserve"> и </w:t>
       </w:r>
@@ -9965,23 +9915,24 @@
       <w:pPr>
         <w:pStyle w:val="2a"/>
       </w:pPr>
-      <w:bookmarkStart w:id="53" w:name="_Toc430943229"/>
-      <w:bookmarkStart w:id="54" w:name="_Toc430958122"/>
-      <w:bookmarkStart w:id="55" w:name="_Toc209703494"/>
-      <w:bookmarkStart w:id="56" w:name="_Toc221000967"/>
+      <w:bookmarkStart w:id="52" w:name="_Toc430943229"/>
+      <w:bookmarkStart w:id="53" w:name="_Toc430958122"/>
+      <w:bookmarkStart w:id="54" w:name="_Toc209703494"/>
+      <w:bookmarkStart w:id="55" w:name="_Toc221000967"/>
       <w:r>
         <w:t>4.</w:t>
       </w:r>
       <w:r>
         <w:t xml:space="preserve"> </w:t>
       </w:r>
-      <w:bookmarkStart w:id="57" w:name="_Toc379906092"/>
-      <w:bookmarkStart w:id="58" w:name="_Toc381802538"/>
-      <w:bookmarkStart w:id="59" w:name="_Toc391383486"/>
-      <w:bookmarkStart w:id="60" w:name="_Toc414977738"/>
+      <w:bookmarkStart w:id="56" w:name="_Toc379906092"/>
+      <w:bookmarkStart w:id="57" w:name="_Toc381802538"/>
+      <w:bookmarkStart w:id="58" w:name="_Toc391383486"/>
+      <w:bookmarkStart w:id="59" w:name="_Toc414977738"/>
       <w:r>
         <w:t>Организация взаимодействия сил и средств</w:t>
       </w:r>
+      <w:bookmarkEnd w:id="52"/>
       <w:bookmarkEnd w:id="53"/>
       <w:bookmarkEnd w:id="54"/>
       <w:bookmarkEnd w:id="55"/>
@@ -9989,7 +9940,6 @@
       <w:bookmarkEnd w:id="57"/>
       <w:bookmarkEnd w:id="58"/>
       <w:bookmarkEnd w:id="59"/>
-      <w:bookmarkEnd w:id="60"/>
     </w:p>
     <w:p>
       <w:pPr>
@@ -10183,20 +10133,20 @@
       <w:pPr>
         <w:pStyle w:val="2a"/>
       </w:pPr>
-      <w:bookmarkStart w:id="61" w:name="_Toc430943230"/>
-      <w:bookmarkStart w:id="62" w:name="_Toc430958123"/>
-      <w:bookmarkStart w:id="63" w:name="_Toc209703495"/>
-      <w:bookmarkStart w:id="64" w:name="_Toc221000968"/>
+      <w:bookmarkStart w:id="60" w:name="_Toc430943230"/>
+      <w:bookmarkStart w:id="61" w:name="_Toc430958123"/>
+      <w:bookmarkStart w:id="62" w:name="_Toc209703495"/>
+      <w:bookmarkStart w:id="63" w:name="_Toc221000968"/>
       <w:r>
         <w:t>5</w:t>
       </w:r>
       <w:r>
         <w:t>. Состав и дислокация сил и средств</w:t>
       </w:r>
+      <w:bookmarkEnd w:id="60"/>
       <w:bookmarkEnd w:id="61"/>
       <w:bookmarkEnd w:id="62"/>
       <w:bookmarkEnd w:id="63"/>
-      <w:bookmarkEnd w:id="64"/>
     </w:p>
     <w:p>
       <w:pPr>
@@ -10340,16 +10290,8 @@
               <w:rPr>
                 <w:color w:val="000000"/>
               </w:rPr>
-              <w:t xml:space="preserve">№ </w:t>
-            </w:r>
-            <w:proofErr w:type="spellStart"/>
-            <w:r>
-              <w:rPr>
-                <w:color w:val="000000"/>
-              </w:rPr>
-              <w:t>пп</w:t>
-            </w:r>
-            <w:proofErr w:type="spellEnd"/>
+              <w:t>№ пп</w:t>
+            </w:r>
           </w:p>
         </w:tc>
         <w:tc>
@@ -11356,7 +11298,7 @@
         <w:t>Привлекаемые силы и средства:</w:t>
       </w:r>
     </w:p>
-    <w:bookmarkStart w:id="65" w:name="_Hlk221181612"/>
+    <w:bookmarkStart w:id="64" w:name="_Hlk221181612"/>
     <w:p>
       <w:pPr>
         <w:spacing w:before="240" w:after="0" w:line="240" w:lineRule="auto"/>
@@ -11389,7 +11331,7 @@
           </w:r>
         </w:sdtContent>
       </w:sdt>
-      <w:bookmarkEnd w:id="65"/>
+      <w:bookmarkEnd w:id="64"/>
       <w:r>
         <w:rPr>
           <w:lang w:val="en-US"/>
@@ -11784,7 +11726,7 @@
       <w:r>
         <w:t xml:space="preserve"> </w:t>
       </w:r>
-      <w:bookmarkStart w:id="66" w:name="_Hlk221181717"/>
+      <w:bookmarkStart w:id="65" w:name="_Hlk221181717"/>
       <w:sdt>
         <w:sdtPr>
           <w:tag w:val="ASF_STATUS"/>
@@ -11826,7 +11768,7 @@
       <w:r>
         <w:t xml:space="preserve"> </w:t>
       </w:r>
-      <w:bookmarkEnd w:id="66"/>
+      <w:bookmarkEnd w:id="65"/>
       <w:r>
         <w:t>приведены в Приложении 2.</w:t>
       </w:r>
@@ -11844,10 +11786,10 @@
           <w:lang w:eastAsia="en-US"/>
         </w:rPr>
       </w:pPr>
-      <w:bookmarkStart w:id="67" w:name="_Toc430943233"/>
-      <w:bookmarkStart w:id="68" w:name="_Toc430958125"/>
-      <w:bookmarkStart w:id="69" w:name="_Toc209703496"/>
-      <w:bookmarkStart w:id="70" w:name="_Toc221000969"/>
+      <w:bookmarkStart w:id="66" w:name="_Toc430943233"/>
+      <w:bookmarkStart w:id="67" w:name="_Toc430958125"/>
+      <w:bookmarkStart w:id="68" w:name="_Toc209703496"/>
+      <w:bookmarkStart w:id="69" w:name="_Toc221000969"/>
       <w:r>
         <w:rPr>
           <w:lang w:eastAsia="en-US"/>
@@ -11860,22 +11802,22 @@
         </w:rPr>
         <w:t xml:space="preserve">. Порядок обеспечения постоянной готовности сил и средств к локализации и ликвидации последствий аварий на </w:t>
       </w:r>
+      <w:bookmarkEnd w:id="66"/>
       <w:bookmarkEnd w:id="67"/>
+      <w:r>
+        <w:rPr>
+          <w:lang w:eastAsia="en-US"/>
+        </w:rPr>
+        <w:t>объекте</w:t>
+      </w:r>
+      <w:r>
+        <w:rPr>
+          <w:lang w:eastAsia="en-US"/>
+        </w:rPr>
+        <w:t>, которые несут ответственность за поддержание этих сил и средств в надлежащей степени готовности</w:t>
+      </w:r>
       <w:bookmarkEnd w:id="68"/>
-      <w:r>
-        <w:rPr>
-          <w:lang w:eastAsia="en-US"/>
-        </w:rPr>
-        <w:t>объекте</w:t>
-      </w:r>
-      <w:r>
-        <w:rPr>
-          <w:lang w:eastAsia="en-US"/>
-        </w:rPr>
-        <w:t>, которые несут ответственность за поддержание этих сил и средств в надлежащей степени готовности</w:t>
-      </w:r>
       <w:bookmarkEnd w:id="69"/>
-      <w:bookmarkEnd w:id="70"/>
     </w:p>
     <w:p>
       <w:pPr>
@@ -12066,7 +12008,7 @@
       <w:r>
         <w:t xml:space="preserve"> </w:t>
       </w:r>
-      <w:bookmarkStart w:id="71" w:name="_Hlk221197015"/>
+      <w:bookmarkStart w:id="70" w:name="_Hlk221197015"/>
       <w:sdt>
         <w:sdtPr>
           <w:tag w:val="ASF_STATUS_SHORT"/>
@@ -12083,7 +12025,7 @@
           </w:r>
         </w:sdtContent>
       </w:sdt>
-      <w:bookmarkEnd w:id="71"/>
+      <w:bookmarkEnd w:id="70"/>
       <w:r>
         <w:t xml:space="preserve"> </w:t>
       </w:r>
@@ -12198,23 +12140,23 @@
           <w:i/>
         </w:rPr>
       </w:pPr>
-      <w:bookmarkStart w:id="72" w:name="_Toc430943234"/>
-      <w:bookmarkStart w:id="73" w:name="_Toc430958126"/>
-      <w:bookmarkStart w:id="74" w:name="_Toc209703497"/>
-      <w:bookmarkStart w:id="75" w:name="_Toc221000970"/>
+      <w:bookmarkStart w:id="71" w:name="_Toc430943234"/>
+      <w:bookmarkStart w:id="72" w:name="_Toc430958126"/>
+      <w:bookmarkStart w:id="73" w:name="_Toc209703497"/>
+      <w:bookmarkStart w:id="74" w:name="_Toc221000970"/>
       <w:r>
         <w:t>7</w:t>
       </w:r>
       <w:r>
         <w:t xml:space="preserve">. Организация управления, связи и оповещения при аварии на </w:t>
       </w:r>
+      <w:bookmarkEnd w:id="71"/>
       <w:bookmarkEnd w:id="72"/>
       <w:bookmarkEnd w:id="73"/>
+      <w:r>
+        <w:t>объекте</w:t>
+      </w:r>
       <w:bookmarkEnd w:id="74"/>
-      <w:r>
-        <w:t>объекте</w:t>
-      </w:r>
-      <w:bookmarkEnd w:id="75"/>
     </w:p>
     <w:p>
       <w:pPr>
@@ -12353,27 +12295,17 @@
       <w:r>
         <w:t xml:space="preserve"> </w:t>
       </w:r>
-      <w:proofErr w:type="gramStart"/>
       <w:r>
         <w:t xml:space="preserve">радио </w:t>
       </w:r>
       <w:r>
-        <w:t>связь</w:t>
-      </w:r>
-      <w:proofErr w:type="gramEnd"/>
-      <w:r>
-        <w:t xml:space="preserve">. </w:t>
-      </w:r>
-      <w:proofErr w:type="gramStart"/>
+        <w:t xml:space="preserve">связь. </w:t>
+      </w:r>
       <w:r>
         <w:t>Радио</w:t>
       </w:r>
       <w:r>
-        <w:t xml:space="preserve"> связь</w:t>
-      </w:r>
-      <w:proofErr w:type="gramEnd"/>
-      <w:r>
-        <w:t xml:space="preserve"> наход</w:t>
+        <w:t xml:space="preserve"> связь наход</w:t>
       </w:r>
       <w:r>
         <w:t>и</w:t>
@@ -12603,16 +12535,8 @@
               <w:rPr>
                 <w:rFonts w:eastAsia="Calibri"/>
               </w:rPr>
-              <w:t xml:space="preserve">№ </w:t>
-            </w:r>
-            <w:proofErr w:type="spellStart"/>
-            <w:r>
-              <w:rPr>
-                <w:rFonts w:eastAsia="Calibri"/>
-              </w:rPr>
-              <w:t>пп</w:t>
-            </w:r>
-            <w:proofErr w:type="spellEnd"/>
+              <w:t>№ пп</w:t>
+            </w:r>
           </w:p>
         </w:tc>
         <w:tc>
@@ -13382,21 +13306,7 @@
               <w:rPr>
                 <w:rFonts w:eastAsia="Calibri"/>
               </w:rPr>
-              <w:t xml:space="preserve">г. Владикавказ, ул. </w:t>
-            </w:r>
-            <w:proofErr w:type="spellStart"/>
-            <w:r>
-              <w:rPr>
-                <w:rFonts w:eastAsia="Calibri"/>
-              </w:rPr>
-              <w:t>Иристонская</w:t>
-            </w:r>
-            <w:proofErr w:type="spellEnd"/>
-            <w:r>
-              <w:rPr>
-                <w:rFonts w:eastAsia="Calibri"/>
-              </w:rPr>
-              <w:t xml:space="preserve">, 25а, </w:t>
+              <w:t xml:space="preserve">г. Владикавказ, ул. Иристонская, 25а, </w:t>
             </w:r>
           </w:p>
         </w:tc>
@@ -13906,15 +13816,7 @@
               <w:spacing w:after="0" w:line="240" w:lineRule="auto"/>
             </w:pPr>
             <w:r>
-              <w:t xml:space="preserve">ст. </w:t>
-            </w:r>
-            <w:proofErr w:type="spellStart"/>
-            <w:r>
-              <w:t>Луковская</w:t>
-            </w:r>
-            <w:proofErr w:type="spellEnd"/>
-            <w:r>
-              <w:t>, ул. Ермолова, 8</w:t>
+              <w:t>ст. Луковская, ул. Ермолова, 8</w:t>
             </w:r>
           </w:p>
         </w:tc>
@@ -13964,13 +13866,8 @@
             <w:pPr>
               <w:spacing w:after="0" w:line="240" w:lineRule="auto"/>
             </w:pPr>
-            <w:proofErr w:type="spellStart"/>
-            <w:r>
-              <w:t>Макиев</w:t>
-            </w:r>
-            <w:proofErr w:type="spellEnd"/>
-            <w:r>
-              <w:t xml:space="preserve"> Д.Р.</w:t>
+            <w:r>
+              <w:t>Макиев Д.Р.</w:t>
             </w:r>
           </w:p>
         </w:tc>
@@ -14160,13 +14057,8 @@
             <w:pPr>
               <w:spacing w:after="0" w:line="240" w:lineRule="auto"/>
             </w:pPr>
-            <w:proofErr w:type="spellStart"/>
-            <w:r>
-              <w:t>Дулаев</w:t>
-            </w:r>
-            <w:proofErr w:type="spellEnd"/>
-            <w:r>
-              <w:t xml:space="preserve"> Т.Х.</w:t>
+            <w:r>
+              <w:t>Дулаев Т.Х.</w:t>
             </w:r>
           </w:p>
         </w:tc>
@@ -14269,13 +14161,8 @@
             <w:pPr>
               <w:spacing w:after="0" w:line="240" w:lineRule="auto"/>
             </w:pPr>
-            <w:proofErr w:type="spellStart"/>
-            <w:r>
-              <w:t>Корсунов</w:t>
-            </w:r>
-            <w:proofErr w:type="spellEnd"/>
-            <w:r>
-              <w:t xml:space="preserve"> А.В.</w:t>
+            <w:r>
+              <w:t>Корсунов А.В.</w:t>
             </w:r>
           </w:p>
         </w:tc>
@@ -14318,23 +14205,7 @@
               <w:spacing w:after="0" w:line="240" w:lineRule="auto"/>
             </w:pPr>
             <w:r>
-              <w:t xml:space="preserve">ст. </w:t>
-            </w:r>
-            <w:proofErr w:type="spellStart"/>
-            <w:r>
-              <w:t>Луковская</w:t>
-            </w:r>
-            <w:proofErr w:type="spellEnd"/>
-            <w:r>
-              <w:t xml:space="preserve">, ул. </w:t>
-            </w:r>
-            <w:proofErr w:type="spellStart"/>
-            <w:r>
-              <w:t>Кизлярская</w:t>
-            </w:r>
-            <w:proofErr w:type="spellEnd"/>
-            <w:r>
-              <w:t>, 44</w:t>
+              <w:t>ст. Луковская, ул. Кизлярская, 44</w:t>
             </w:r>
           </w:p>
         </w:tc>
@@ -14486,16 +14357,8 @@
               <w:rPr>
                 <w:rFonts w:eastAsia="Calibri"/>
               </w:rPr>
-              <w:t xml:space="preserve">№ </w:t>
-            </w:r>
-            <w:proofErr w:type="spellStart"/>
-            <w:r>
-              <w:rPr>
-                <w:rFonts w:eastAsia="Calibri"/>
-              </w:rPr>
-              <w:t>пп</w:t>
-            </w:r>
-            <w:proofErr w:type="spellEnd"/>
+              <w:t>№ пп</w:t>
+            </w:r>
           </w:p>
         </w:tc>
         <w:tc>
@@ -14571,13 +14434,8 @@
                 <w:rFonts w:eastAsia="Calibri"/>
               </w:rPr>
             </w:pPr>
-            <w:proofErr w:type="spellStart"/>
-            <w:r>
-              <w:t>Макиев</w:t>
-            </w:r>
-            <w:proofErr w:type="spellEnd"/>
-            <w:r>
-              <w:t xml:space="preserve"> Давид Русланович</w:t>
+            <w:r>
+              <w:t>Макиев Давид Русланович</w:t>
             </w:r>
           </w:p>
         </w:tc>
@@ -14630,13 +14488,8 @@
                 <w:rFonts w:eastAsia="Calibri"/>
               </w:rPr>
             </w:pPr>
-            <w:proofErr w:type="spellStart"/>
-            <w:r>
-              <w:t>Корсунов</w:t>
-            </w:r>
-            <w:proofErr w:type="spellEnd"/>
-            <w:r>
-              <w:t xml:space="preserve"> Андрей Васильевич</w:t>
+            <w:r>
+              <w:t>Корсунов Андрей Васильевич</w:t>
             </w:r>
           </w:p>
         </w:tc>
@@ -14738,19 +14591,9 @@
               <w:spacing w:after="0" w:line="240" w:lineRule="auto"/>
               <w:contextualSpacing/>
             </w:pPr>
-            <w:proofErr w:type="spellStart"/>
-            <w:r>
-              <w:t>Дулаев</w:t>
-            </w:r>
-            <w:proofErr w:type="spellEnd"/>
-            <w:r>
-              <w:t xml:space="preserve"> Таймураз </w:t>
-            </w:r>
-            <w:proofErr w:type="spellStart"/>
-            <w:r>
-              <w:t>Хазбиевич</w:t>
-            </w:r>
-            <w:proofErr w:type="spellEnd"/>
+            <w:r>
+              <w:t>Дулаев Таймураз Хазбиевич</w:t>
+            </w:r>
           </w:p>
         </w:tc>
         <w:tc>
@@ -14817,13 +14660,8 @@
               <w:jc w:val="center"/>
             </w:pPr>
             <w:r>
-              <w:t xml:space="preserve">№ </w:t>
-            </w:r>
-            <w:proofErr w:type="spellStart"/>
-            <w:r>
-              <w:t>пп</w:t>
-            </w:r>
-            <w:proofErr w:type="spellEnd"/>
+              <w:t>№ пп</w:t>
+            </w:r>
           </w:p>
         </w:tc>
         <w:tc>
@@ -18790,11 +18628,11 @@
           <w:lang w:eastAsia="en-US"/>
         </w:rPr>
       </w:pPr>
-      <w:bookmarkStart w:id="76" w:name="_Toc427057250"/>
-      <w:bookmarkStart w:id="77" w:name="_Toc430943235"/>
-      <w:bookmarkStart w:id="78" w:name="_Toc430958127"/>
-      <w:bookmarkStart w:id="79" w:name="_Toc209703498"/>
-      <w:bookmarkStart w:id="80" w:name="_Toc221000971"/>
+      <w:bookmarkStart w:id="75" w:name="_Toc427057250"/>
+      <w:bookmarkStart w:id="76" w:name="_Toc430943235"/>
+      <w:bookmarkStart w:id="77" w:name="_Toc430958127"/>
+      <w:bookmarkStart w:id="78" w:name="_Toc209703498"/>
+      <w:bookmarkStart w:id="79" w:name="_Toc221000971"/>
       <w:r>
         <w:rPr>
           <w:lang w:eastAsia="en-US"/>
@@ -18808,11 +18646,11 @@
         </w:rPr>
         <w:t>. Система взаимного обмена информацией между организациями – участниками локализации и ликвидации последствий аварий на объекте</w:t>
       </w:r>
+      <w:bookmarkEnd w:id="75"/>
       <w:bookmarkEnd w:id="76"/>
       <w:bookmarkEnd w:id="77"/>
       <w:bookmarkEnd w:id="78"/>
       <w:bookmarkEnd w:id="79"/>
-      <w:bookmarkEnd w:id="80"/>
     </w:p>
     <w:p>
       <w:pPr>
@@ -18883,12 +18721,12 @@
           <w:lang w:eastAsia="en-US"/>
         </w:rPr>
       </w:pPr>
-      <w:bookmarkStart w:id="81" w:name="_Toc394928129"/>
-      <w:bookmarkStart w:id="82" w:name="_Toc427057251"/>
-      <w:bookmarkStart w:id="83" w:name="_Toc430943236"/>
-      <w:bookmarkStart w:id="84" w:name="_Toc430958128"/>
-      <w:bookmarkStart w:id="85" w:name="_Toc209703499"/>
-      <w:bookmarkStart w:id="86" w:name="_Toc221000972"/>
+      <w:bookmarkStart w:id="80" w:name="_Toc394928129"/>
+      <w:bookmarkStart w:id="81" w:name="_Toc427057251"/>
+      <w:bookmarkStart w:id="82" w:name="_Toc430943236"/>
+      <w:bookmarkStart w:id="83" w:name="_Toc430958128"/>
+      <w:bookmarkStart w:id="84" w:name="_Toc209703499"/>
+      <w:bookmarkStart w:id="85" w:name="_Toc221000972"/>
       <w:r>
         <w:rPr>
           <w:lang w:eastAsia="en-US"/>
@@ -18901,12 +18739,12 @@
         </w:rPr>
         <w:t>. Первоочередные действия при получении сигнала об аварии на объекте</w:t>
       </w:r>
+      <w:bookmarkEnd w:id="80"/>
       <w:bookmarkEnd w:id="81"/>
       <w:bookmarkEnd w:id="82"/>
       <w:bookmarkEnd w:id="83"/>
       <w:bookmarkEnd w:id="84"/>
       <w:bookmarkEnd w:id="85"/>
-      <w:bookmarkEnd w:id="86"/>
     </w:p>
     <w:p>
       <w:pPr>
@@ -19022,25 +18860,25 @@
           <w:szCs w:val="24"/>
         </w:rPr>
       </w:pPr>
-      <w:bookmarkStart w:id="87" w:name="_Toc430943237"/>
-      <w:bookmarkStart w:id="88" w:name="_Toc430958129"/>
+      <w:bookmarkStart w:id="86" w:name="_Toc430943237"/>
+      <w:bookmarkStart w:id="87" w:name="_Toc430958129"/>
     </w:p>
     <w:p>
       <w:pPr>
         <w:pStyle w:val="2a"/>
       </w:pPr>
-      <w:bookmarkStart w:id="89" w:name="_Toc209703500"/>
-      <w:bookmarkStart w:id="90" w:name="_Toc221000973"/>
+      <w:bookmarkStart w:id="88" w:name="_Toc209703500"/>
+      <w:bookmarkStart w:id="89" w:name="_Toc221000973"/>
       <w:r>
         <w:t>10</w:t>
       </w:r>
       <w:r>
         <w:t>. Действия производственного персонала и аварийно-спасательных служб (формирований) по локализации и ликвидации аварийных ситуаций на ОПО</w:t>
       </w:r>
+      <w:bookmarkEnd w:id="86"/>
       <w:bookmarkEnd w:id="87"/>
       <w:bookmarkEnd w:id="88"/>
       <w:bookmarkEnd w:id="89"/>
-      <w:bookmarkEnd w:id="90"/>
     </w:p>
     <w:p>
       <w:pPr>
@@ -19084,16 +18922,16 @@
       <w:pPr>
         <w:pStyle w:val="2a"/>
       </w:pPr>
-      <w:bookmarkStart w:id="91" w:name="_Toc209703501"/>
-      <w:bookmarkStart w:id="92" w:name="_Toc221000974"/>
+      <w:bookmarkStart w:id="90" w:name="_Toc209703501"/>
+      <w:bookmarkStart w:id="91" w:name="_Toc221000974"/>
       <w:r>
         <w:t>11</w:t>
       </w:r>
       <w:r>
         <w:t>. Мероприятия, направленные на обеспечение безопасности населения</w:t>
       </w:r>
+      <w:bookmarkEnd w:id="90"/>
       <w:bookmarkEnd w:id="91"/>
-      <w:bookmarkEnd w:id="92"/>
     </w:p>
     <w:p>
       <w:pPr>
@@ -19211,13 +19049,8 @@
         <w:ind w:left="0" w:firstLine="709"/>
       </w:pPr>
       <w:r>
-        <w:t xml:space="preserve">организовано оповещение об аварии (пожаре), инциденте </w:t>
-      </w:r>
-      <w:proofErr w:type="gramStart"/>
-      <w:r>
-        <w:t>согласно списков</w:t>
-      </w:r>
-      <w:proofErr w:type="gramEnd"/>
+        <w:t>организовано оповещение об аварии (пожаре), инциденте согласно списков</w:t>
+      </w:r>
       <w:r>
         <w:t xml:space="preserve"> </w:t>
       </w:r>
@@ -19754,8 +19587,8 @@
       <w:pPr>
         <w:pStyle w:val="2a"/>
       </w:pPr>
-      <w:bookmarkStart w:id="93" w:name="_Toc209703502"/>
-      <w:bookmarkStart w:id="94" w:name="_Toc221000975"/>
+      <w:bookmarkStart w:id="92" w:name="_Toc209703502"/>
+      <w:bookmarkStart w:id="93" w:name="_Toc221000975"/>
       <w:r>
         <w:t>1</w:t>
       </w:r>
@@ -19765,8 +19598,8 @@
       <w:r>
         <w:t>. Организация материально-технического, инженерного и финансового обеспечения операций по локализации и ликвидации аварий на объекте</w:t>
       </w:r>
+      <w:bookmarkEnd w:id="92"/>
       <w:bookmarkEnd w:id="93"/>
-      <w:bookmarkEnd w:id="94"/>
     </w:p>
     <w:p>
       <w:pPr>
@@ -19971,20 +19804,20 @@
       <w:pPr>
         <w:pStyle w:val="1"/>
       </w:pPr>
-      <w:bookmarkStart w:id="95" w:name="_Toc394651834"/>
-      <w:bookmarkStart w:id="96" w:name="_Toc430097612"/>
-      <w:bookmarkStart w:id="97" w:name="_Toc430255939"/>
-      <w:bookmarkStart w:id="98" w:name="_Toc209703503"/>
-      <w:bookmarkStart w:id="99" w:name="_Toc221000976"/>
+      <w:bookmarkStart w:id="94" w:name="_Toc394651834"/>
+      <w:bookmarkStart w:id="95" w:name="_Toc430097612"/>
+      <w:bookmarkStart w:id="96" w:name="_Toc430255939"/>
+      <w:bookmarkStart w:id="97" w:name="_Toc209703503"/>
+      <w:bookmarkStart w:id="98" w:name="_Toc221000976"/>
       <w:r>
         <w:lastRenderedPageBreak/>
         <w:t>Специальные разделы плана мероприятий</w:t>
       </w:r>
+      <w:bookmarkEnd w:id="94"/>
       <w:bookmarkEnd w:id="95"/>
       <w:bookmarkEnd w:id="96"/>
       <w:bookmarkEnd w:id="97"/>
       <w:bookmarkEnd w:id="98"/>
-      <w:bookmarkEnd w:id="99"/>
     </w:p>
     <w:p>
       <w:pPr>
@@ -22628,14 +22461,14 @@
           <w:lang w:eastAsia="en-US"/>
         </w:rPr>
       </w:pPr>
-      <w:bookmarkStart w:id="100" w:name="_Toc414022297"/>
-      <w:bookmarkStart w:id="101" w:name="_Toc427057254"/>
-      <w:bookmarkStart w:id="102" w:name="_Toc431390633"/>
-      <w:bookmarkStart w:id="103" w:name="_Toc209703504"/>
-      <w:bookmarkStart w:id="104" w:name="_Toc221000977"/>
-      <w:bookmarkStart w:id="105" w:name="_Toc427057264"/>
-      <w:bookmarkStart w:id="106" w:name="_Toc430943242"/>
-      <w:bookmarkStart w:id="107" w:name="_Toc430958131"/>
+      <w:bookmarkStart w:id="99" w:name="_Toc414022297"/>
+      <w:bookmarkStart w:id="100" w:name="_Toc427057254"/>
+      <w:bookmarkStart w:id="101" w:name="_Toc431390633"/>
+      <w:bookmarkStart w:id="102" w:name="_Toc209703504"/>
+      <w:bookmarkStart w:id="103" w:name="_Toc221000977"/>
+      <w:bookmarkStart w:id="104" w:name="_Toc427057264"/>
+      <w:bookmarkStart w:id="105" w:name="_Toc430943242"/>
+      <w:bookmarkStart w:id="106" w:name="_Toc430958131"/>
       <w:r>
         <w:rPr>
           <w:lang w:eastAsia="en-US"/>
@@ -22649,26 +22482,26 @@
         </w:rPr>
         <w:t>. Распределение обязанностей между отдельными лицами, участвующими в ликвидации аварии</w:t>
       </w:r>
+      <w:bookmarkEnd w:id="99"/>
       <w:bookmarkEnd w:id="100"/>
       <w:bookmarkEnd w:id="101"/>
       <w:bookmarkEnd w:id="102"/>
       <w:bookmarkEnd w:id="103"/>
-      <w:bookmarkEnd w:id="104"/>
     </w:p>
     <w:p>
       <w:pPr>
         <w:pStyle w:val="2a"/>
       </w:pPr>
-      <w:bookmarkStart w:id="108" w:name="_Toc209703505"/>
-      <w:bookmarkStart w:id="109" w:name="_Toc221000978"/>
+      <w:bookmarkStart w:id="107" w:name="_Toc209703505"/>
+      <w:bookmarkStart w:id="108" w:name="_Toc221000978"/>
       <w:r>
         <w:t>13.</w:t>
       </w:r>
       <w:r>
         <w:t>1. Общие положения</w:t>
       </w:r>
+      <w:bookmarkEnd w:id="107"/>
       <w:bookmarkEnd w:id="108"/>
-      <w:bookmarkEnd w:id="109"/>
     </w:p>
     <w:p>
       <w:pPr>
@@ -23195,8 +23028,8 @@
       <w:pPr>
         <w:pStyle w:val="2a"/>
       </w:pPr>
-      <w:bookmarkStart w:id="110" w:name="_Toc209703506"/>
-      <w:bookmarkStart w:id="111" w:name="_Toc221000979"/>
+      <w:bookmarkStart w:id="109" w:name="_Toc209703506"/>
+      <w:bookmarkStart w:id="110" w:name="_Toc221000979"/>
       <w:r>
         <w:t>13.</w:t>
       </w:r>
@@ -23209,8 +23042,8 @@
       <w:r>
         <w:t xml:space="preserve"> руководителем выполняется следующий комплекс мер:</w:t>
       </w:r>
+      <w:bookmarkEnd w:id="109"/>
       <w:bookmarkEnd w:id="110"/>
-      <w:bookmarkEnd w:id="111"/>
     </w:p>
     <w:p>
       <w:pPr>
@@ -23629,16 +23462,16 @@
       <w:pPr>
         <w:pStyle w:val="2a"/>
       </w:pPr>
-      <w:bookmarkStart w:id="112" w:name="_Toc209703507"/>
-      <w:bookmarkStart w:id="113" w:name="_Toc221000980"/>
+      <w:bookmarkStart w:id="111" w:name="_Toc209703507"/>
+      <w:bookmarkStart w:id="112" w:name="_Toc221000980"/>
       <w:r>
         <w:t>13.</w:t>
       </w:r>
       <w:r>
         <w:t>3. Обязанности технического руководителя</w:t>
       </w:r>
+      <w:bookmarkEnd w:id="111"/>
       <w:bookmarkEnd w:id="112"/>
-      <w:bookmarkEnd w:id="113"/>
     </w:p>
     <w:p>
       <w:pPr>
@@ -23670,43 +23503,7 @@
           <w:sz w:val="24"/>
           <w:szCs w:val="24"/>
         </w:rPr>
-        <w:t xml:space="preserve">- разработку специальных программ (с указанием приоритетности реализации), предусматривающих дооснащение объекта средствами контроля, автоматического регулирования, устройствами </w:t>
-      </w:r>
-      <w:proofErr w:type="spellStart"/>
-      <w:r>
-        <w:rPr>
-          <w:rFonts w:ascii="Times New Roman" w:hAnsi="Times New Roman"/>
-          <w:sz w:val="24"/>
-          <w:szCs w:val="24"/>
-        </w:rPr>
-        <w:t>взрывопредупреждения</w:t>
-      </w:r>
-      <w:proofErr w:type="spellEnd"/>
-      <w:r>
-        <w:rPr>
-          <w:rFonts w:ascii="Times New Roman" w:hAnsi="Times New Roman"/>
-          <w:sz w:val="24"/>
-          <w:szCs w:val="24"/>
-        </w:rPr>
-        <w:t xml:space="preserve"> и взрывозащиты, быстродействующими </w:t>
-      </w:r>
-      <w:proofErr w:type="spellStart"/>
-      <w:r>
-        <w:rPr>
-          <w:rFonts w:ascii="Times New Roman" w:hAnsi="Times New Roman"/>
-          <w:sz w:val="24"/>
-          <w:szCs w:val="24"/>
-        </w:rPr>
-        <w:t>отсекателями</w:t>
-      </w:r>
-      <w:proofErr w:type="spellEnd"/>
-      <w:r>
-        <w:rPr>
-          <w:rFonts w:ascii="Times New Roman" w:hAnsi="Times New Roman"/>
-          <w:sz w:val="24"/>
-          <w:szCs w:val="24"/>
-        </w:rPr>
-        <w:t xml:space="preserve">, системами безопасной аварийной остановки объекта, оповещения, защиты и спасения людей, создание запасов дегазирующих реагентов, совершенствование систем улавливания и дегазации вредных выбросов, устройство систем локализации, препятствующих распространению неорганизованных выбросов на территории организации и за ее пределами, и т.п., если при разработке </w:t>
+        <w:t xml:space="preserve">- разработку специальных программ (с указанием приоритетности реализации), предусматривающих дооснащение объекта средствами контроля, автоматического регулирования, устройствами взрывопредупреждения и взрывозащиты, быстродействующими отсекателями, системами безопасной аварийной остановки объекта, оповещения, защиты и спасения людей, создание запасов дегазирующих реагентов, совершенствование систем улавливания и дегазации вредных выбросов, устройство систем локализации, препятствующих распространению неорганизованных выбросов на территории организации и за ее пределами, и т.п., если при разработке </w:t>
       </w:r>
       <w:r>
         <w:rPr>
@@ -24047,8 +23844,8 @@
       <w:pPr>
         <w:pStyle w:val="2a"/>
       </w:pPr>
-      <w:bookmarkStart w:id="114" w:name="_Toc209703508"/>
-      <w:bookmarkStart w:id="115" w:name="_Toc221000981"/>
+      <w:bookmarkStart w:id="113" w:name="_Toc209703508"/>
+      <w:bookmarkStart w:id="114" w:name="_Toc221000981"/>
       <w:r>
         <w:t>13.4.</w:t>
       </w:r>
@@ -24061,8 +23858,8 @@
       <w:r>
         <w:t xml:space="preserve"> </w:t>
       </w:r>
-      <w:bookmarkStart w:id="116" w:name="_Hlk221183206"/>
-      <w:bookmarkEnd w:id="114"/>
+      <w:bookmarkStart w:id="115" w:name="_Hlk221183206"/>
+      <w:bookmarkEnd w:id="113"/>
       <w:sdt>
         <w:sdtPr>
           <w:rPr>
@@ -24085,8 +23882,8 @@
           </w:r>
         </w:sdtContent>
       </w:sdt>
+      <w:bookmarkEnd w:id="114"/>
       <w:bookmarkEnd w:id="115"/>
-      <w:bookmarkEnd w:id="116"/>
     </w:p>
     <w:p>
       <w:pPr>
@@ -24503,8 +24300,8 @@
       <w:pPr>
         <w:pStyle w:val="2a"/>
       </w:pPr>
-      <w:bookmarkStart w:id="117" w:name="_Toc209703509"/>
-      <w:bookmarkStart w:id="118" w:name="_Toc221000982"/>
+      <w:bookmarkStart w:id="116" w:name="_Toc209703509"/>
+      <w:bookmarkStart w:id="117" w:name="_Toc221000982"/>
       <w:r>
         <w:t>13.</w:t>
       </w:r>
@@ -24514,8 +24311,8 @@
       <w:r>
         <w:t>начальника участка</w:t>
       </w:r>
+      <w:bookmarkEnd w:id="116"/>
       <w:bookmarkEnd w:id="117"/>
-      <w:bookmarkEnd w:id="118"/>
     </w:p>
     <w:p>
       <w:pPr>
@@ -24789,8 +24586,8 @@
       <w:pPr>
         <w:pStyle w:val="2a"/>
       </w:pPr>
-      <w:bookmarkStart w:id="119" w:name="_Toc209703510"/>
-      <w:bookmarkStart w:id="120" w:name="_Toc221000983"/>
+      <w:bookmarkStart w:id="118" w:name="_Toc209703510"/>
+      <w:bookmarkStart w:id="119" w:name="_Toc221000983"/>
       <w:r>
         <w:t>13.</w:t>
       </w:r>
@@ -24800,11 +24597,11 @@
       <w:r>
         <w:t xml:space="preserve"> </w:t>
       </w:r>
+      <w:bookmarkEnd w:id="118"/>
+      <w:r>
+        <w:t>Объекта</w:t>
+      </w:r>
       <w:bookmarkEnd w:id="119"/>
-      <w:r>
-        <w:t>Объекта</w:t>
-      </w:r>
-      <w:bookmarkEnd w:id="120"/>
     </w:p>
     <w:p>
       <w:pPr>
@@ -25005,15 +24802,15 @@
       <w:pPr>
         <w:pStyle w:val="2a"/>
       </w:pPr>
-      <w:bookmarkStart w:id="121" w:name="_Toc209703511"/>
-      <w:bookmarkStart w:id="122" w:name="_Toc221000984"/>
+      <w:bookmarkStart w:id="120" w:name="_Toc209703511"/>
+      <w:bookmarkStart w:id="121" w:name="_Toc221000984"/>
       <w:r>
         <w:t>13.</w:t>
       </w:r>
       <w:r>
         <w:t xml:space="preserve">7. Обязанности членов </w:t>
       </w:r>
-      <w:bookmarkStart w:id="123" w:name="_Hlk221183488"/>
+      <w:bookmarkStart w:id="122" w:name="_Hlk221183488"/>
       <w:sdt>
         <w:sdtPr>
           <w:tag w:val="ASF_STATUS_SHORT"/>
@@ -25030,7 +24827,7 @@
           </w:r>
         </w:sdtContent>
       </w:sdt>
-      <w:bookmarkEnd w:id="123"/>
+      <w:bookmarkEnd w:id="122"/>
       <w:r>
         <w:t xml:space="preserve"> </w:t>
       </w:r>
@@ -25050,8 +24847,8 @@
           </w:r>
         </w:sdtContent>
       </w:sdt>
+      <w:bookmarkEnd w:id="120"/>
       <w:bookmarkEnd w:id="121"/>
-      <w:bookmarkEnd w:id="122"/>
     </w:p>
     <w:p>
       <w:pPr>
@@ -25490,16 +25287,16 @@
       <w:pPr>
         <w:pStyle w:val="2a"/>
       </w:pPr>
-      <w:bookmarkStart w:id="124" w:name="_Toc209703512"/>
-      <w:bookmarkStart w:id="125" w:name="_Toc221000985"/>
+      <w:bookmarkStart w:id="123" w:name="_Toc209703512"/>
+      <w:bookmarkStart w:id="124" w:name="_Toc221000985"/>
       <w:r>
         <w:t>13.</w:t>
       </w:r>
       <w:r>
         <w:t>8. Обязанности начальника ПЧ</w:t>
       </w:r>
+      <w:bookmarkEnd w:id="123"/>
       <w:bookmarkEnd w:id="124"/>
-      <w:bookmarkEnd w:id="125"/>
     </w:p>
     <w:p>
       <w:pPr>
@@ -25797,16 +25594,16 @@
       <w:pPr>
         <w:pStyle w:val="2a"/>
       </w:pPr>
-      <w:bookmarkStart w:id="126" w:name="_Toc209703513"/>
-      <w:bookmarkStart w:id="127" w:name="_Toc221000986"/>
+      <w:bookmarkStart w:id="125" w:name="_Toc209703513"/>
+      <w:bookmarkStart w:id="126" w:name="_Toc221000986"/>
       <w:r>
         <w:t>13.</w:t>
       </w:r>
       <w:r>
         <w:t>9. Обязанности медицинского врача</w:t>
       </w:r>
+      <w:bookmarkEnd w:id="125"/>
       <w:bookmarkEnd w:id="126"/>
-      <w:bookmarkEnd w:id="127"/>
     </w:p>
     <w:p>
       <w:pPr>
@@ -25852,16 +25649,16 @@
       <w:pPr>
         <w:pStyle w:val="2a"/>
       </w:pPr>
-      <w:bookmarkStart w:id="128" w:name="_Toc209703514"/>
-      <w:bookmarkStart w:id="129" w:name="_Toc221000987"/>
+      <w:bookmarkStart w:id="127" w:name="_Toc209703514"/>
+      <w:bookmarkStart w:id="128" w:name="_Toc221000987"/>
       <w:r>
         <w:t>13.10</w:t>
       </w:r>
       <w:r>
         <w:t>. Служба безопасности</w:t>
       </w:r>
+      <w:bookmarkEnd w:id="127"/>
       <w:bookmarkEnd w:id="128"/>
-      <w:bookmarkEnd w:id="129"/>
     </w:p>
     <w:p>
       <w:pPr>
@@ -25909,16 +25706,16 @@
           <w:szCs w:val="24"/>
         </w:rPr>
       </w:pPr>
-      <w:bookmarkStart w:id="130" w:name="_Toc433207695"/>
-      <w:bookmarkStart w:id="131" w:name="_Toc209703515"/>
-      <w:bookmarkStart w:id="132" w:name="_Toc221000988"/>
-      <w:bookmarkStart w:id="133" w:name="_Toc381802546"/>
-      <w:bookmarkStart w:id="134" w:name="_Toc391383493"/>
-      <w:bookmarkStart w:id="135" w:name="_Toc414977744"/>
-      <w:bookmarkStart w:id="136" w:name="_Toc430943246"/>
+      <w:bookmarkStart w:id="129" w:name="_Toc433207695"/>
+      <w:bookmarkStart w:id="130" w:name="_Toc209703515"/>
+      <w:bookmarkStart w:id="131" w:name="_Toc221000988"/>
+      <w:bookmarkStart w:id="132" w:name="_Toc381802546"/>
+      <w:bookmarkStart w:id="133" w:name="_Toc391383493"/>
+      <w:bookmarkStart w:id="134" w:name="_Toc414977744"/>
+      <w:bookmarkStart w:id="135" w:name="_Toc430943246"/>
+      <w:bookmarkEnd w:id="104"/>
       <w:bookmarkEnd w:id="105"/>
       <w:bookmarkEnd w:id="106"/>
-      <w:bookmarkEnd w:id="107"/>
       <w:r>
         <w:rPr>
           <w:rFonts w:ascii="Times New Roman" w:hAnsi="Times New Roman"/>
@@ -25970,7 +25767,7 @@
         </w:rPr>
         <w:t xml:space="preserve"> </w:t>
       </w:r>
-      <w:bookmarkEnd w:id="130"/>
+      <w:bookmarkEnd w:id="129"/>
       <w:sdt>
         <w:sdtPr>
           <w:rPr>
@@ -26001,11 +25798,12 @@
           </w:r>
         </w:sdtContent>
       </w:sdt>
+      <w:bookmarkEnd w:id="130"/>
       <w:bookmarkEnd w:id="131"/>
-      <w:bookmarkEnd w:id="132"/>
-    </w:p>
-    <w:p>
-      <w:pPr>
+    </w:p>
+    <w:p>
+      <w:pPr>
+        <w:spacing w:after="0" w:line="240" w:lineRule="auto"/>
         <w:rPr>
           <w:lang w:val="en-US"/>
         </w:rPr>
@@ -26014,20 +25812,34 @@
         <w:rPr>
           <w:lang w:val="en-US"/>
         </w:rPr>
-        <w:t>OBJ_IMAGE_</w:t>
+        <w:t>ASF</w:t>
       </w:r>
       <w:r>
         <w:rPr>
           <w:lang w:val="en-US"/>
         </w:rPr>
-        <w:t>4</w:t>
+        <w:t>_IMAGE_</w:t>
       </w:r>
       <w:r>
         <w:rPr>
           <w:lang w:val="en-US"/>
         </w:rPr>
-        <w:t>_PLACEHOLDER</w:t>
-      </w:r>
+        <w:t>1</w:t>
+      </w:r>
+      <w:r>
+        <w:rPr>
+          <w:lang w:val="en-US"/>
+        </w:rPr>
+        <w:t>_</w:t>
+      </w:r>
+      <w:r>
+        <w:rPr>
+          <w:lang w:val="en-US"/>
+        </w:rPr>
+        <w:t>APPENDIX</w:t>
+      </w:r>
+      <w:bookmarkStart w:id="136" w:name="_Toc209703516"/>
+      <w:bookmarkStart w:id="137" w:name="_Toc221000989"/>
     </w:p>
     <w:p>
       <w:pPr>
@@ -26038,15 +25850,14 @@
         <w:jc w:val="both"/>
         <w:rPr>
           <w:rFonts w:ascii="Times New Roman" w:hAnsi="Times New Roman"/>
-          <w:iCs/>
           <w:color w:val="auto"/>
           <w:sz w:val="24"/>
           <w:szCs w:val="24"/>
           <w:lang w:val="en-US"/>
         </w:rPr>
       </w:pPr>
-      <w:bookmarkStart w:id="137" w:name="_Toc209703516"/>
-      <w:bookmarkStart w:id="138" w:name="_Toc221000989"/>
+      <w:bookmarkStart w:id="138" w:name="_GoBack"/>
+      <w:bookmarkEnd w:id="138"/>
       <w:r>
         <w:rPr>
           <w:rFonts w:ascii="Times New Roman" w:hAnsi="Times New Roman"/>
@@ -26054,26 +25865,9 @@
           <w:color w:val="auto"/>
           <w:sz w:val="24"/>
           <w:szCs w:val="24"/>
-          <w:lang w:val="en-US"/>
-        </w:rPr>
-        <w:br w:type="page"/>
-      </w:r>
-    </w:p>
-    <w:p>
-      <w:pPr>
-        <w:pStyle w:val="2"/>
-        <w:keepLines w:val="0"/>
-        <w:spacing w:before="0" w:line="360" w:lineRule="auto"/>
-        <w:ind w:firstLine="720"/>
-        <w:jc w:val="both"/>
-        <w:rPr>
-          <w:rFonts w:ascii="Times New Roman" w:hAnsi="Times New Roman"/>
-          <w:color w:val="auto"/>
-          <w:sz w:val="24"/>
-          <w:szCs w:val="24"/>
-          <w:lang w:val="en-US"/>
-        </w:rPr>
-      </w:pPr>
+        </w:rPr>
+        <w:t>ПРИЛОЖЕНИЕ</w:t>
+      </w:r>
       <w:r>
         <w:rPr>
           <w:rFonts w:ascii="Times New Roman" w:hAnsi="Times New Roman"/>
@@ -26081,9 +25875,9 @@
           <w:color w:val="auto"/>
           <w:sz w:val="24"/>
           <w:szCs w:val="24"/>
-        </w:rPr>
-        <w:lastRenderedPageBreak/>
-        <w:t>ПРИЛОЖЕНИЕ</w:t>
+          <w:lang w:val="en-US"/>
+        </w:rPr>
+        <w:t xml:space="preserve"> 2. </w:t>
       </w:r>
       <w:r>
         <w:rPr>
@@ -26092,9 +25886,8 @@
           <w:color w:val="auto"/>
           <w:sz w:val="24"/>
           <w:szCs w:val="24"/>
-          <w:lang w:val="en-US"/>
-        </w:rPr>
-        <w:t xml:space="preserve"> 2. </w:t>
+        </w:rPr>
+        <w:t>Паспорт</w:t>
       </w:r>
       <w:r>
         <w:rPr>
@@ -26103,26 +25896,16 @@
           <w:color w:val="auto"/>
           <w:sz w:val="24"/>
           <w:szCs w:val="24"/>
-        </w:rPr>
-        <w:t>Паспорт</w:t>
-      </w:r>
-      <w:r>
-        <w:rPr>
-          <w:rFonts w:ascii="Times New Roman" w:hAnsi="Times New Roman"/>
-          <w:iCs/>
-          <w:color w:val="auto"/>
-          <w:sz w:val="24"/>
-          <w:szCs w:val="24"/>
           <w:lang w:val="en-US"/>
         </w:rPr>
         <w:t xml:space="preserve"> </w:t>
       </w:r>
+      <w:bookmarkEnd w:id="132"/>
       <w:bookmarkEnd w:id="133"/>
       <w:bookmarkEnd w:id="134"/>
       <w:bookmarkEnd w:id="135"/>
       <w:bookmarkEnd w:id="136"/>
       <w:bookmarkEnd w:id="137"/>
-      <w:bookmarkEnd w:id="138"/>
       <w:sdt>
         <w:sdtPr>
           <w:rPr>
@@ -26200,17 +25983,38 @@
       </w:sdt>
     </w:p>
     <w:p>
-      <w:r>
-        <w:t>OBJ_IMAGE_</w:t>
-      </w:r>
+      <w:pPr>
+        <w:spacing w:after="0"/>
+      </w:pPr>
       <w:r>
         <w:rPr>
           <w:lang w:val="en-US"/>
         </w:rPr>
-        <w:t>5</w:t>
-      </w:r>
-      <w:r>
-        <w:t>_PLACEHOLDER</w:t>
+        <w:t>ASF</w:t>
+      </w:r>
+      <w:r>
+        <w:rPr>
+          <w:lang w:val="en-US"/>
+        </w:rPr>
+        <w:t>_IMAGE_</w:t>
+      </w:r>
+      <w:r>
+        <w:rPr>
+          <w:lang w:val="en-US"/>
+        </w:rPr>
+        <w:t>2</w:t>
+      </w:r>
+      <w:r>
+        <w:rPr>
+          <w:lang w:val="en-US"/>
+        </w:rPr>
+        <w:t>_</w:t>
+      </w:r>
+      <w:r>
+        <w:rPr>
+          <w:lang w:val="en-US"/>
+        </w:rPr>
+        <w:t>APPENDIX</w:t>
       </w:r>
     </w:p>
     <w:sectPr>
@@ -33707,6 +33511,7 @@
     <w:rsid w:val="003D7834"/>
     <w:rsid w:val="00451345"/>
     <w:rsid w:val="004C0405"/>
+    <w:rsid w:val="00594162"/>
     <w:rsid w:val="005A552B"/>
     <w:rsid w:val="005E12F1"/>
     <w:rsid w:val="00691E12"/>
@@ -33715,6 +33520,7 @@
     <w:rsid w:val="006E301C"/>
     <w:rsid w:val="008568AE"/>
     <w:rsid w:val="0089646B"/>
+    <w:rsid w:val="008B6AFA"/>
     <w:rsid w:val="008C64D6"/>
     <w:rsid w:val="008D5632"/>
     <w:rsid w:val="00983331"/>
@@ -34621,7 +34427,7 @@
 </file>
 
 <file path=customXml/itemProps1.xml><?xml version="1.0" encoding="utf-8"?>
-<ds:datastoreItem xmlns:ds="http://schemas.openxmlformats.org/officeDocument/2006/customXml" ds:itemID="{0C7DBCA9-B72D-4534-BBEB-FC6D18B02AB6}">
+<ds:datastoreItem xmlns:ds="http://schemas.openxmlformats.org/officeDocument/2006/customXml" ds:itemID="{A4E5BC17-5E97-483D-A79D-08B0EF165F88}">
   <ds:schemaRefs>
     <ds:schemaRef ds:uri="http://schemas.openxmlformats.org/officeDocument/2006/bibliography"/>
   </ds:schemaRefs>

</xml_diff>

<commit_message>
Reworked the table insertion logic.
I implemented the idea that if a table doesn't exist in the database, all references to it in the document are deleted. Same as with images.
</commit_message>
<xml_diff>
--- a/template/tagtemplate.docx
+++ b/template/tagtemplate.docx
@@ -5301,7 +5301,7 @@
           <w:rPr>
             <w:lang w:val="en-US"/>
           </w:rPr>
-          <w:tag w:val="OBJ_NUM_1_LINC_IMAGE"/>
+          <w:tag w:val="OBJ_NUM_1_IMAGE"/>
           <w:id w:val="1358928698"/>
           <w:placeholder>
             <w:docPart w:val="DefaultPlaceholder_-1854013440"/>
@@ -5320,7 +5320,7 @@
             <w:rPr>
               <w:lang w:val="en-US"/>
             </w:rPr>
-            <w:t>OBJ_NUM_1_LINC_IMAGE</w:t>
+            <w:t>OBJ_NUM_1_IMAGE</w:t>
           </w:r>
           <w:r>
             <w:rPr>
@@ -5837,7 +5837,7 @@
           <w:rPr>
             <w:lang w:val="en-US"/>
           </w:rPr>
-          <w:tag w:val="OBJ_NUM_2_LINC_IMAGE"/>
+          <w:tag w:val="OBJ_NUM_2_IMAGE"/>
           <w:id w:val="-472054734"/>
           <w:placeholder>
             <w:docPart w:val="65E02D35AA15408C98BA9599EB836D50"/>
@@ -5850,7 +5850,7 @@
             <w:rPr>
               <w:lang w:val="en-US"/>
             </w:rPr>
-            <w:t>${OBJ_NUM_2_LINC_IMAGE}</w:t>
+            <w:t>${OBJ_NUM_2_IMAGE}</w:t>
           </w:r>
         </w:sdtContent>
       </w:sdt>
@@ -5891,32 +5891,204 @@
     </w:p>
     <w:p>
       <w:pPr>
-        <w:spacing w:after="0" w:line="360" w:lineRule="auto"/>
+        <w:spacing w:after="0" w:line="240" w:lineRule="auto"/>
         <w:ind w:firstLine="709"/>
         <w:jc w:val="both"/>
-      </w:pPr>
-      <w:r>
-        <w:t>Перечень основного технологического оборудования ОПО представлен в таблице 1.</w:t>
-      </w:r>
-    </w:p>
-    <w:p>
-      <w:pPr>
-        <w:spacing w:after="0" w:line="360" w:lineRule="auto"/>
+        <w:rPr>
+          <w:lang w:val="en-US"/>
+        </w:rPr>
+      </w:pPr>
+      <w:sdt>
+        <w:sdtPr>
+          <w:rPr>
+            <w:lang w:val="en-US"/>
+          </w:rPr>
+          <w:tag w:val="OBJ_LINC_TEXT_1_TABLE"/>
+          <w:id w:val="-314417629"/>
+          <w:placeholder>
+            <w:docPart w:val="DefaultPlaceholder_-1854013440"/>
+          </w:placeholder>
+          <w:text/>
+        </w:sdtPr>
+        <w:sdtEndPr/>
+        <w:sdtContent>
+          <w:r>
+            <w:rPr>
+              <w:lang w:val="en-US"/>
+            </w:rPr>
+            <w:t>${OBJ_LINC_TEXT_1_TABLE}</w:t>
+          </w:r>
+        </w:sdtContent>
+      </w:sdt>
+      <w:r>
+        <w:rPr>
+          <w:lang w:val="en-US"/>
+        </w:rPr>
+        <w:t xml:space="preserve"> </w:t>
+      </w:r>
+      <w:sdt>
+        <w:sdtPr>
+          <w:rPr>
+            <w:lang w:val="en-US"/>
+          </w:rPr>
+          <w:tag w:val="OBJ_NUM_1_TABLE"/>
+          <w:id w:val="2015337340"/>
+          <w:placeholder>
+            <w:docPart w:val="966103BC6AAA40A3BBF84D9B08ACB4BD"/>
+          </w:placeholder>
+          <w:text/>
+        </w:sdtPr>
+        <w:sdtContent>
+          <w:r>
+            <w:rPr>
+              <w:lang w:val="en-US"/>
+            </w:rPr>
+            <w:t>${OBJ_NUM_</w:t>
+          </w:r>
+          <w:r>
+            <w:rPr>
+              <w:lang w:val="en-US"/>
+            </w:rPr>
+            <w:t>1</w:t>
+          </w:r>
+          <w:r>
+            <w:rPr>
+              <w:lang w:val="en-US"/>
+            </w:rPr>
+            <w:t>_TABLE</w:t>
+          </w:r>
+          <w:r>
+            <w:rPr>
+              <w:lang w:val="en-US"/>
+            </w:rPr>
+            <w:t>}</w:t>
+          </w:r>
+        </w:sdtContent>
+      </w:sdt>
+      <w:r>
+        <w:rPr>
+          <w:lang w:val="en-US"/>
+        </w:rPr>
+        <w:t>.</w:t>
+      </w:r>
+    </w:p>
+    <w:p>
+      <w:pPr>
+        <w:spacing w:after="0" w:line="240" w:lineRule="auto"/>
         <w:ind w:firstLine="709"/>
         <w:jc w:val="both"/>
-      </w:pPr>
-      <w:r>
-        <w:t xml:space="preserve">Таблица 1 – </w:t>
-      </w:r>
-      <w:r>
-        <w:t>П</w:t>
-      </w:r>
-      <w:r>
-        <w:t xml:space="preserve">еречень основного технологического оборудования </w:t>
-      </w:r>
-      <w:r>
-        <w:t>ОПО</w:t>
-      </w:r>
+        <w:rPr>
+          <w:lang w:val="en-US"/>
+        </w:rPr>
+      </w:pPr>
+    </w:p>
+    <w:p>
+      <w:pPr>
+        <w:spacing w:after="0" w:line="240" w:lineRule="auto"/>
+        <w:ind w:firstLine="709"/>
+        <w:jc w:val="both"/>
+        <w:rPr>
+          <w:lang w:val="en-US"/>
+        </w:rPr>
+      </w:pPr>
+      <w:r>
+        <w:t>Таблица</w:t>
+      </w:r>
+      <w:r>
+        <w:rPr>
+          <w:lang w:val="en-US"/>
+        </w:rPr>
+        <w:t xml:space="preserve"> </w:t>
+      </w:r>
+      <w:sdt>
+        <w:sdtPr>
+          <w:rPr>
+            <w:lang w:val="en-US"/>
+          </w:rPr>
+          <w:tag w:val="OBJ_NUM_1_TABLE"/>
+          <w:id w:val="606242610"/>
+          <w:placeholder>
+            <w:docPart w:val="DefaultPlaceholder_-1854013440"/>
+          </w:placeholder>
+          <w:text/>
+        </w:sdtPr>
+        <w:sdtContent>
+          <w:r>
+            <w:rPr>
+              <w:lang w:val="en-US"/>
+            </w:rPr>
+            <w:t>${OBJ_NUM_</w:t>
+          </w:r>
+          <w:r>
+            <w:rPr>
+              <w:lang w:val="en-US"/>
+            </w:rPr>
+            <w:t>1</w:t>
+          </w:r>
+          <w:r>
+            <w:rPr>
+              <w:lang w:val="en-US"/>
+            </w:rPr>
+            <w:t>_TABLE</w:t>
+          </w:r>
+          <w:r>
+            <w:rPr>
+              <w:lang w:val="en-US"/>
+            </w:rPr>
+            <w:t>}</w:t>
+          </w:r>
+        </w:sdtContent>
+      </w:sdt>
+      <w:r>
+        <w:rPr>
+          <w:lang w:val="en-US"/>
+        </w:rPr>
+        <w:t xml:space="preserve"> – </w:t>
+      </w:r>
+      <w:sdt>
+        <w:sdtPr>
+          <w:rPr>
+            <w:lang w:val="en-US"/>
+          </w:rPr>
+          <w:tag w:val="OBJ_TEXT_NAME_1_TABLE"/>
+          <w:id w:val="1895999250"/>
+          <w:placeholder>
+            <w:docPart w:val="DefaultPlaceholder_-1854013440"/>
+          </w:placeholder>
+          <w:text/>
+        </w:sdtPr>
+        <w:sdtEndPr/>
+        <w:sdtContent>
+          <w:r>
+            <w:rPr>
+              <w:lang w:val="en-US"/>
+            </w:rPr>
+            <w:t>${</w:t>
+          </w:r>
+          <w:r>
+            <w:rPr>
+              <w:lang w:val="en-US"/>
+            </w:rPr>
+            <w:t>OBJ_TEXT_NAME_1_TABLE</w:t>
+          </w:r>
+          <w:r>
+            <w:rPr>
+              <w:lang w:val="en-US"/>
+            </w:rPr>
+            <w:t>}</w:t>
+          </w:r>
+        </w:sdtContent>
+      </w:sdt>
+    </w:p>
+    <w:p>
+      <w:pPr>
+        <w:spacing w:after="0" w:line="240" w:lineRule="auto"/>
+        <w:ind w:firstLine="709"/>
+        <w:jc w:val="both"/>
+        <w:rPr>
+          <w:lang w:val="en-US"/>
+        </w:rPr>
+      </w:pPr>
     </w:p>
     <w:tbl>
       <w:tblPr>
@@ -6048,7 +6220,7 @@
               <w:spacing w:after="0" w:line="240" w:lineRule="auto"/>
             </w:pPr>
             <w:r>
-              <w:t>TECHNOLOGICAL_EQUIPMENT_TABLE</w:t>
+              <w:t>OBJ_TABLE_1_PLACEHOLDER</w:t>
             </w:r>
           </w:p>
         </w:tc>
@@ -6061,7 +6233,7 @@
               <w:spacing w:after="0" w:line="240" w:lineRule="auto"/>
             </w:pPr>
             <w:r>
-              <w:t>TECHNOLOGICAL_EQUIPMENT_TABLE</w:t>
+              <w:t>OBJ_TABLE_1_PLACEHOLDER</w:t>
             </w:r>
           </w:p>
         </w:tc>
@@ -6074,7 +6246,7 @@
               <w:spacing w:after="0" w:line="240" w:lineRule="auto"/>
             </w:pPr>
             <w:r>
-              <w:t>TECHNOLOGICAL_EQUIPMENT_TABLE</w:t>
+              <w:t>OBJ_TABLE_1_PLACEHOLDER</w:t>
             </w:r>
           </w:p>
         </w:tc>
@@ -6195,32 +6367,182 @@
       <w:r>
         <w:t xml:space="preserve"> </w:t>
       </w:r>
-      <w:r>
-        <w:t>его характеристика приведена в таблице 2.</w:t>
-      </w:r>
-      <w:r>
-        <w:t xml:space="preserve"> </w:t>
-      </w:r>
-    </w:p>
-    <w:p>
-      <w:pPr>
-        <w:spacing w:after="0" w:line="360" w:lineRule="auto"/>
-        <w:ind w:right="-766" w:firstLine="709"/>
-      </w:pPr>
-      <w:r>
-        <w:t>Таблица</w:t>
-      </w:r>
-      <w:r>
-        <w:t xml:space="preserve"> 2 – </w:t>
-      </w:r>
-      <w:r>
-        <w:t>Характеристика</w:t>
-      </w:r>
-      <w:r>
-        <w:t xml:space="preserve"> </w:t>
-      </w:r>
       <w:sdt>
         <w:sdtPr>
+          <w:tag w:val="OBJ_LINC_TEXT_2_TABLE"/>
+          <w:id w:val="100380525"/>
+          <w:placeholder>
+            <w:docPart w:val="DefaultPlaceholder_-1854013440"/>
+          </w:placeholder>
+          <w:text/>
+        </w:sdtPr>
+        <w:sdtEndPr/>
+        <w:sdtContent>
+          <w:r>
+            <w:t>${OBJ_LINC_TEXT_</w:t>
+          </w:r>
+          <w:r>
+            <w:t>2</w:t>
+          </w:r>
+          <w:r>
+            <w:t>_TABLE}</w:t>
+          </w:r>
+        </w:sdtContent>
+      </w:sdt>
+      <w:r>
+        <w:t xml:space="preserve"> </w:t>
+      </w:r>
+      <w:sdt>
+        <w:sdtPr>
+          <w:tag w:val="OBJ_NUM_2_TABLE"/>
+          <w:id w:val="-1559010871"/>
+          <w:placeholder>
+            <w:docPart w:val="E2987E49481B4A8988C0D5E41A0AFDB8"/>
+          </w:placeholder>
+          <w:text/>
+        </w:sdtPr>
+        <w:sdtContent>
+          <w:r>
+            <w:t>${OBJ_NUM_</w:t>
+          </w:r>
+          <w:r>
+            <w:t>2</w:t>
+          </w:r>
+          <w:r>
+            <w:t>_TABLE}</w:t>
+          </w:r>
+        </w:sdtContent>
+      </w:sdt>
+      <w:r>
+        <w:t>.</w:t>
+      </w:r>
+    </w:p>
+    <w:p>
+      <w:pPr>
+        <w:spacing w:after="0" w:line="240" w:lineRule="auto"/>
+        <w:ind w:firstLine="720"/>
+        <w:jc w:val="both"/>
+      </w:pPr>
+    </w:p>
+    <w:p>
+      <w:pPr>
+        <w:spacing w:after="0" w:line="240" w:lineRule="auto"/>
+        <w:ind w:right="-765" w:firstLine="709"/>
+        <w:rPr>
+          <w:lang w:val="en-US"/>
+        </w:rPr>
+      </w:pPr>
+      <w:r>
+        <w:t>Таблица</w:t>
+      </w:r>
+      <w:r>
+        <w:rPr>
+          <w:lang w:val="en-US"/>
+        </w:rPr>
+        <w:t xml:space="preserve"> </w:t>
+      </w:r>
+      <w:sdt>
+        <w:sdtPr>
+          <w:rPr>
+            <w:lang w:val="en-US"/>
+          </w:rPr>
+          <w:tag w:val="OBJ_NUM_2_TABLE"/>
+          <w:id w:val="5799737"/>
+          <w:placeholder>
+            <w:docPart w:val="CE76057F9A8547B4A81853FA15C0E007"/>
+          </w:placeholder>
+          <w:text/>
+        </w:sdtPr>
+        <w:sdtContent>
+          <w:r>
+            <w:rPr>
+              <w:lang w:val="en-US"/>
+            </w:rPr>
+            <w:t>${OBJ_NUM_</w:t>
+          </w:r>
+          <w:r>
+            <w:rPr>
+              <w:lang w:val="en-US"/>
+            </w:rPr>
+            <w:t>2</w:t>
+          </w:r>
+          <w:r>
+            <w:rPr>
+              <w:lang w:val="en-US"/>
+            </w:rPr>
+            <w:t>_TABLE</w:t>
+          </w:r>
+          <w:r>
+            <w:rPr>
+              <w:lang w:val="en-US"/>
+            </w:rPr>
+            <w:t>}</w:t>
+          </w:r>
+        </w:sdtContent>
+      </w:sdt>
+      <w:r>
+        <w:rPr>
+          <w:lang w:val="en-US"/>
+        </w:rPr>
+        <w:t xml:space="preserve"> – </w:t>
+      </w:r>
+      <w:sdt>
+        <w:sdtPr>
+          <w:rPr>
+            <w:lang w:val="en-US"/>
+          </w:rPr>
+          <w:tag w:val="OBJ_TEXT_NAME_2_TABLE"/>
+          <w:id w:val="538701552"/>
+          <w:placeholder>
+            <w:docPart w:val="DefaultPlaceholder_-1854013440"/>
+          </w:placeholder>
+          <w:text/>
+        </w:sdtPr>
+        <w:sdtEndPr/>
+        <w:sdtContent>
+          <w:r>
+            <w:rPr>
+              <w:lang w:val="en-US"/>
+            </w:rPr>
+            <w:t>${</w:t>
+          </w:r>
+          <w:r>
+            <w:rPr>
+              <w:lang w:val="en-US"/>
+            </w:rPr>
+            <w:t>OBJ_TEXT_NAME_</w:t>
+          </w:r>
+          <w:r>
+            <w:rPr>
+              <w:lang w:val="en-US"/>
+            </w:rPr>
+            <w:t>2</w:t>
+          </w:r>
+          <w:r>
+            <w:rPr>
+              <w:lang w:val="en-US"/>
+            </w:rPr>
+            <w:t>_TABLE</w:t>
+          </w:r>
+          <w:r>
+            <w:rPr>
+              <w:lang w:val="en-US"/>
+            </w:rPr>
+            <w:t>}</w:t>
+          </w:r>
+        </w:sdtContent>
+      </w:sdt>
+      <w:r>
+        <w:rPr>
+          <w:lang w:val="en-US"/>
+        </w:rPr>
+        <w:t xml:space="preserve"> </w:t>
+      </w:r>
+      <w:sdt>
+        <w:sdtPr>
+          <w:rPr>
+            <w:lang w:val="en-US"/>
+          </w:rPr>
           <w:tag w:val="OBJ_HAZARDOUS_SUBSTANCE_GEN"/>
           <w:id w:val="-1043678655"/>
           <w:placeholder>
@@ -6231,10 +6553,24 @@
         <w:sdtEndPr/>
         <w:sdtContent>
           <w:r>
+            <w:rPr>
+              <w:lang w:val="en-US"/>
+            </w:rPr>
             <w:t>${OBJ_HAZARDOUS_SUBSTANCE_GEN}</w:t>
           </w:r>
         </w:sdtContent>
       </w:sdt>
+      <w:bookmarkStart w:id="25" w:name="_GoBack"/>
+      <w:bookmarkEnd w:id="25"/>
+    </w:p>
+    <w:p>
+      <w:pPr>
+        <w:spacing w:after="0" w:line="240" w:lineRule="auto"/>
+        <w:ind w:right="-765" w:firstLine="709"/>
+        <w:rPr>
+          <w:lang w:val="en-US"/>
+        </w:rPr>
+      </w:pPr>
     </w:p>
     <w:tbl>
       <w:tblPr>
@@ -6444,7 +6780,13 @@
               <w:spacing w:after="0" w:line="240" w:lineRule="auto"/>
             </w:pPr>
             <w:r>
-              <w:t>OBJ_HAZARD_TABLE</w:t>
+              <w:t>OBJ_TABLE_</w:t>
+            </w:r>
+            <w:r>
+              <w:t>2</w:t>
+            </w:r>
+            <w:r>
+              <w:t>_PLACEHOLDER</w:t>
             </w:r>
           </w:p>
         </w:tc>
@@ -6457,7 +6799,13 @@
               <w:spacing w:after="0" w:line="240" w:lineRule="auto"/>
             </w:pPr>
             <w:r>
-              <w:t>OBJ_HAZARD_TABLE</w:t>
+              <w:t>OBJ_TABLE_</w:t>
+            </w:r>
+            <w:r>
+              <w:t>2</w:t>
+            </w:r>
+            <w:r>
+              <w:t>_PLACEHOLDER</w:t>
             </w:r>
           </w:p>
         </w:tc>
@@ -6470,7 +6818,13 @@
               <w:spacing w:after="0" w:line="240" w:lineRule="auto"/>
             </w:pPr>
             <w:r>
-              <w:t>OBJ_HAZARD_TABLE</w:t>
+              <w:t>OBJ_TABLE_</w:t>
+            </w:r>
+            <w:r>
+              <w:t>2</w:t>
+            </w:r>
+            <w:r>
+              <w:t>_PLACEHOLDER</w:t>
             </w:r>
           </w:p>
         </w:tc>
@@ -6483,7 +6837,13 @@
               <w:spacing w:after="0" w:line="240" w:lineRule="auto"/>
             </w:pPr>
             <w:r>
-              <w:t>OBJ_HAZARD_TABLE</w:t>
+              <w:t>OBJ_TABLE_</w:t>
+            </w:r>
+            <w:r>
+              <w:t>2</w:t>
+            </w:r>
+            <w:r>
+              <w:t>_PLACEHOLDER</w:t>
             </w:r>
           </w:p>
         </w:tc>
@@ -6505,8 +6865,8 @@
       <w:pPr>
         <w:pStyle w:val="2a"/>
       </w:pPr>
-      <w:bookmarkStart w:id="25" w:name="_Toc209703489"/>
-      <w:bookmarkStart w:id="26" w:name="_Toc221000962"/>
+      <w:bookmarkStart w:id="26" w:name="_Toc209703489"/>
+      <w:bookmarkStart w:id="27" w:name="_Toc221000962"/>
       <w:r>
         <w:lastRenderedPageBreak/>
         <w:t>1.3 К</w:t>
@@ -6529,8 +6889,8 @@
       <w:r>
         <w:t>ОПО</w:t>
       </w:r>
-      <w:bookmarkEnd w:id="25"/>
       <w:bookmarkEnd w:id="26"/>
+      <w:bookmarkEnd w:id="27"/>
     </w:p>
     <w:p>
       <w:pPr>
@@ -6594,7 +6954,7 @@
           <w:rPr>
             <w:lang w:val="en-US"/>
           </w:rPr>
-          <w:tag w:val="OBJ_NUM_1_CAPTURE_IMAGE"/>
+          <w:tag w:val="OBJ_NUM_1_IMAGE"/>
           <w:id w:val="158193702"/>
           <w:placeholder>
             <w:docPart w:val="DefaultPlaceholder_-1854013440"/>
@@ -6625,7 +6985,7 @@
             <w:rPr>
               <w:lang w:val="en-US"/>
             </w:rPr>
-            <w:t>CAPTURE_IMAGE</w:t>
+            <w:t>IMAGE</w:t>
           </w:r>
           <w:r>
             <w:rPr>
@@ -6747,7 +7107,7 @@
           <w:rPr>
             <w:lang w:val="en-US"/>
           </w:rPr>
-          <w:tag w:val="OBJ_NUM_2_CAPTURE_IMAGE"/>
+          <w:tag w:val="OBJ_NUM_2_IMAGE"/>
           <w:id w:val="-1989159597"/>
           <w:placeholder>
             <w:docPart w:val="99E015D7842A452787601C8107156144"/>
@@ -6772,7 +7132,7 @@
             <w:rPr>
               <w:lang w:val="en-US"/>
             </w:rPr>
-            <w:t>NUM_2_CAPTURE_IMAGE}</w:t>
+            <w:t>NUM_2_IMAGE}</w:t>
           </w:r>
         </w:sdtContent>
       </w:sdt>
@@ -6854,33 +7214,33 @@
         <w:pStyle w:val="1"/>
         <w:ind w:firstLine="0"/>
       </w:pPr>
-      <w:bookmarkStart w:id="27" w:name="_Toc392754513"/>
-      <w:bookmarkStart w:id="28" w:name="_Toc430097609"/>
-      <w:bookmarkStart w:id="29" w:name="_Toc430255936"/>
-      <w:bookmarkStart w:id="30" w:name="_Toc209703490"/>
-      <w:bookmarkStart w:id="31" w:name="_Toc221000963"/>
+      <w:bookmarkStart w:id="28" w:name="_Toc392754513"/>
+      <w:bookmarkStart w:id="29" w:name="_Toc430097609"/>
+      <w:bookmarkStart w:id="30" w:name="_Toc430255936"/>
+      <w:bookmarkStart w:id="31" w:name="_Toc209703490"/>
+      <w:bookmarkStart w:id="32" w:name="_Toc221000963"/>
       <w:r>
         <w:lastRenderedPageBreak/>
         <w:t xml:space="preserve">2. Анализ опасности </w:t>
       </w:r>
-      <w:bookmarkEnd w:id="27"/>
       <w:bookmarkEnd w:id="28"/>
       <w:bookmarkEnd w:id="29"/>
       <w:bookmarkEnd w:id="30"/>
+      <w:bookmarkEnd w:id="31"/>
       <w:r>
         <w:t>объекта</w:t>
       </w:r>
-      <w:bookmarkEnd w:id="31"/>
+      <w:bookmarkEnd w:id="32"/>
     </w:p>
     <w:p>
       <w:pPr>
         <w:pStyle w:val="2a"/>
       </w:pPr>
-      <w:bookmarkStart w:id="32" w:name="_Toc392754514"/>
-      <w:bookmarkStart w:id="33" w:name="_Toc430097610"/>
-      <w:bookmarkStart w:id="34" w:name="_Toc430255937"/>
-      <w:bookmarkStart w:id="35" w:name="_Toc209703491"/>
-      <w:bookmarkStart w:id="36" w:name="_Toc221000964"/>
+      <w:bookmarkStart w:id="33" w:name="_Toc392754514"/>
+      <w:bookmarkStart w:id="34" w:name="_Toc430097610"/>
+      <w:bookmarkStart w:id="35" w:name="_Toc430255937"/>
+      <w:bookmarkStart w:id="36" w:name="_Toc209703491"/>
+      <w:bookmarkStart w:id="37" w:name="_Toc221000964"/>
       <w:r>
         <w:t xml:space="preserve">2.1. </w:t>
       </w:r>
@@ -6908,11 +7268,11 @@
       <w:r>
         <w:t xml:space="preserve"> возникновения</w:t>
       </w:r>
-      <w:bookmarkEnd w:id="32"/>
       <w:bookmarkEnd w:id="33"/>
       <w:bookmarkEnd w:id="34"/>
       <w:bookmarkEnd w:id="35"/>
       <w:bookmarkEnd w:id="36"/>
+      <w:bookmarkEnd w:id="37"/>
     </w:p>
     <w:p>
       <w:pPr>
@@ -7182,53 +7542,131 @@
         <w:jc w:val="both"/>
       </w:pPr>
       <w:r>
-        <w:t xml:space="preserve">При анализе обобщённых сценариев аварий можно выделить специальные сценарии, относящиеся непосредственно к Объекту. </w:t>
-      </w:r>
-      <w:r>
-        <w:t xml:space="preserve">Схема развития сценариев аварий на </w:t>
-      </w:r>
-      <w:r>
-        <w:t>Объекте</w:t>
-      </w:r>
-      <w:r>
-        <w:t xml:space="preserve"> приведена в таблице </w:t>
-      </w:r>
-      <w:r>
-        <w:t>3</w:t>
-      </w:r>
-      <w:r>
-        <w:t>.</w:t>
-      </w:r>
-    </w:p>
-    <w:p>
-      <w:pPr>
-        <w:spacing w:after="0" w:line="360" w:lineRule="auto"/>
+        <w:t>При анализе обобщённых сценариев аварий можно выделить специальные сценарии, относящиеся непосредственно к Объекту.</w:t>
+      </w:r>
+    </w:p>
+    <w:bookmarkStart w:id="38" w:name="_Hlk221785402"/>
+    <w:p>
+      <w:pPr>
+        <w:spacing w:after="0" w:line="240" w:lineRule="auto"/>
+        <w:ind w:right="-2" w:firstLine="720"/>
+        <w:jc w:val="both"/>
+        <w:rPr>
+          <w:lang w:val="en-US"/>
+        </w:rPr>
+      </w:pPr>
+      <w:sdt>
+        <w:sdtPr>
+          <w:rPr>
+            <w:lang w:val="en-US"/>
+          </w:rPr>
+          <w:tag w:val="OBJ_LINC_TEXT_3_TABLE"/>
+          <w:id w:val="-1334440400"/>
+          <w:placeholder>
+            <w:docPart w:val="DefaultPlaceholder_-1854013440"/>
+          </w:placeholder>
+          <w:text/>
+        </w:sdtPr>
+        <w:sdtEndPr/>
+        <w:sdtContent>
+          <w:r>
+            <w:rPr>
+              <w:lang w:val="en-US"/>
+            </w:rPr>
+            <w:t>${</w:t>
+          </w:r>
+          <w:r>
+            <w:rPr>
+              <w:lang w:val="en-US"/>
+            </w:rPr>
+            <w:t>OBJ_LINC_TEXT_3_TABLE</w:t>
+          </w:r>
+          <w:r>
+            <w:rPr>
+              <w:lang w:val="en-US"/>
+            </w:rPr>
+            <w:t>}</w:t>
+          </w:r>
+        </w:sdtContent>
+      </w:sdt>
+      <w:bookmarkEnd w:id="38"/>
+      <w:r>
+        <w:rPr>
+          <w:lang w:val="en-US"/>
+        </w:rPr>
+        <w:t xml:space="preserve"> 3.</w:t>
+      </w:r>
+    </w:p>
+    <w:p>
+      <w:pPr>
+        <w:spacing w:after="0" w:line="240" w:lineRule="auto"/>
+        <w:ind w:right="-2" w:firstLine="720"/>
+        <w:jc w:val="both"/>
+        <w:rPr>
+          <w:lang w:val="en-US"/>
+        </w:rPr>
+      </w:pPr>
+    </w:p>
+    <w:p>
+      <w:pPr>
+        <w:spacing w:after="0" w:line="240" w:lineRule="auto"/>
         <w:ind w:firstLine="720"/>
-      </w:pPr>
-      <w:r>
-        <w:t xml:space="preserve">Таблица </w:t>
-      </w:r>
-      <w:r>
-        <w:t>3</w:t>
-      </w:r>
-      <w:r>
-        <w:t xml:space="preserve"> –</w:t>
-      </w:r>
-      <w:r>
-        <w:t xml:space="preserve"> Р</w:t>
-      </w:r>
-      <w:r>
-        <w:t>азвити</w:t>
-      </w:r>
-      <w:r>
-        <w:t>е</w:t>
-      </w:r>
-      <w:r>
-        <w:t xml:space="preserve"> сценариев аварий</w:t>
-      </w:r>
-      <w:r>
-        <w:t xml:space="preserve"> на Объекте</w:t>
-      </w:r>
+        <w:rPr>
+          <w:lang w:val="en-US"/>
+        </w:rPr>
+      </w:pPr>
+      <w:r>
+        <w:t>Таблица</w:t>
+      </w:r>
+      <w:r>
+        <w:rPr>
+          <w:lang w:val="en-US"/>
+        </w:rPr>
+        <w:t xml:space="preserve"> 3 – </w:t>
+      </w:r>
+      <w:sdt>
+        <w:sdtPr>
+          <w:rPr>
+            <w:lang w:val="en-US"/>
+          </w:rPr>
+          <w:tag w:val="OBJ_TEXT_NAME_3_TABLE"/>
+          <w:id w:val="-1811321998"/>
+          <w:placeholder>
+            <w:docPart w:val="DefaultPlaceholder_-1854013440"/>
+          </w:placeholder>
+          <w:text/>
+        </w:sdtPr>
+        <w:sdtEndPr/>
+        <w:sdtContent>
+          <w:r>
+            <w:rPr>
+              <w:lang w:val="en-US"/>
+            </w:rPr>
+            <w:t>${OBJ_TEXT_NAME_</w:t>
+          </w:r>
+          <w:r>
+            <w:rPr>
+              <w:lang w:val="en-US"/>
+            </w:rPr>
+            <w:t>3</w:t>
+          </w:r>
+          <w:r>
+            <w:rPr>
+              <w:lang w:val="en-US"/>
+            </w:rPr>
+            <w:t>_TABLE}</w:t>
+          </w:r>
+        </w:sdtContent>
+      </w:sdt>
+    </w:p>
+    <w:p>
+      <w:pPr>
+        <w:spacing w:after="0" w:line="240" w:lineRule="auto"/>
+        <w:ind w:firstLine="720"/>
+        <w:rPr>
+          <w:lang w:val="en-US"/>
+        </w:rPr>
+      </w:pPr>
     </w:p>
     <w:tbl>
       <w:tblPr>
@@ -7657,7 +8095,23 @@
                 <w:sz w:val="22"/>
                 <w:szCs w:val="22"/>
               </w:rPr>
-              <w:t xml:space="preserve"> сгорание части шлейфа газа в дефлаграционном режиме с образованием ударной волны </w:t>
+              <w:t xml:space="preserve"> сгорание части шлейфа газа в </w:t>
+            </w:r>
+            <w:proofErr w:type="spellStart"/>
+            <w:r>
+              <w:rPr>
+                <w:sz w:val="22"/>
+                <w:szCs w:val="22"/>
+              </w:rPr>
+              <w:t>дефлаграционном</w:t>
+            </w:r>
+            <w:proofErr w:type="spellEnd"/>
+            <w:r>
+              <w:rPr>
+                <w:sz w:val="22"/>
+                <w:szCs w:val="22"/>
+              </w:rPr>
+              <w:t xml:space="preserve"> режиме с образованием ударной волны </w:t>
             </w:r>
             <w:r>
               <w:rPr>
@@ -7809,7 +8263,23 @@
                 <w:sz w:val="22"/>
                 <w:szCs w:val="22"/>
               </w:rPr>
-              <w:t xml:space="preserve"> взрыв ГВС (дефлаграционное сгорание) при наличии источника инициирования  </w:t>
+              <w:t xml:space="preserve"> взрыв ГВС (</w:t>
+            </w:r>
+            <w:proofErr w:type="spellStart"/>
+            <w:r>
+              <w:rPr>
+                <w:sz w:val="22"/>
+                <w:szCs w:val="22"/>
+              </w:rPr>
+              <w:t>дефлаграционное</w:t>
+            </w:r>
+            <w:proofErr w:type="spellEnd"/>
+            <w:r>
+              <w:rPr>
+                <w:sz w:val="22"/>
+                <w:szCs w:val="22"/>
+              </w:rPr>
+              <w:t xml:space="preserve"> сгорание) при наличии источника инициирования  </w:t>
             </w:r>
             <w:r>
               <w:rPr>
@@ -7979,7 +8449,23 @@
                 <w:sz w:val="22"/>
                 <w:szCs w:val="22"/>
               </w:rPr>
-              <w:t xml:space="preserve"> взрыв ГВС (дефлаграционное сгорание) при наличии источника инициирования </w:t>
+              <w:t xml:space="preserve"> взрыв ГВС (</w:t>
+            </w:r>
+            <w:proofErr w:type="spellStart"/>
+            <w:r>
+              <w:rPr>
+                <w:sz w:val="22"/>
+                <w:szCs w:val="22"/>
+              </w:rPr>
+              <w:t>дефлаграционное</w:t>
+            </w:r>
+            <w:proofErr w:type="spellEnd"/>
+            <w:r>
+              <w:rPr>
+                <w:sz w:val="22"/>
+                <w:szCs w:val="22"/>
+              </w:rPr>
+              <w:t xml:space="preserve"> сгорание) при наличии источника инициирования </w:t>
             </w:r>
             <w:r>
               <w:rPr>
@@ -8220,53 +8706,115 @@
     <w:p>
       <w:pPr>
         <w:pStyle w:val="25"/>
-        <w:spacing w:before="240" w:line="240" w:lineRule="auto"/>
-      </w:pPr>
-      <w:r>
-        <w:t>Схемы развития возможных аварийных ситуаций</w:t>
-      </w:r>
-      <w:r>
-        <w:t>,</w:t>
-      </w:r>
-      <w:r>
-        <w:t xml:space="preserve"> </w:t>
-      </w:r>
-      <w:r>
-        <w:t xml:space="preserve">источники (места) возникновения аварий </w:t>
-      </w:r>
-      <w:r>
-        <w:t xml:space="preserve">применительно для оборудования приведены в таблице </w:t>
-      </w:r>
-      <w:r>
-        <w:t>4</w:t>
-      </w:r>
-      <w:r>
-        <w:t>.</w:t>
-      </w:r>
+        <w:spacing w:line="240" w:lineRule="auto"/>
+      </w:pPr>
+    </w:p>
+    <w:p>
+      <w:pPr>
+        <w:pStyle w:val="25"/>
+        <w:spacing w:line="240" w:lineRule="auto"/>
+        <w:rPr>
+          <w:lang w:val="en-US"/>
+        </w:rPr>
+      </w:pPr>
+      <w:sdt>
+        <w:sdtPr>
+          <w:rPr>
+            <w:lang w:val="en-US"/>
+          </w:rPr>
+          <w:tag w:val="OBJ_LINC_TEXT_4_TABLE"/>
+          <w:id w:val="-1626920933"/>
+          <w:placeholder>
+            <w:docPart w:val="DefaultPlaceholder_-1854013440"/>
+          </w:placeholder>
+          <w:text/>
+        </w:sdtPr>
+        <w:sdtEndPr/>
+        <w:sdtContent>
+          <w:r>
+            <w:rPr>
+              <w:lang w:val="en-US"/>
+            </w:rPr>
+            <w:t>${OBJ_LINC_TEXT_4_TABLE}</w:t>
+          </w:r>
+        </w:sdtContent>
+      </w:sdt>
+      <w:r>
+        <w:rPr>
+          <w:lang w:val="en-US"/>
+        </w:rPr>
+        <w:t xml:space="preserve"> 4.</w:t>
+      </w:r>
+    </w:p>
+    <w:p>
+      <w:pPr>
+        <w:pStyle w:val="25"/>
+        <w:spacing w:line="240" w:lineRule="auto"/>
+        <w:rPr>
+          <w:lang w:val="en-US"/>
+        </w:rPr>
+      </w:pPr>
     </w:p>
     <w:p>
       <w:pPr>
         <w:pStyle w:val="af4"/>
-        <w:ind w:firstLine="709"/>
-      </w:pPr>
-      <w:r>
-        <w:t xml:space="preserve">Таблица </w:t>
-      </w:r>
-      <w:r>
-        <w:t>4</w:t>
-      </w:r>
-      <w:r>
-        <w:t xml:space="preserve"> – Основные сценарии аварии</w:t>
-      </w:r>
-      <w:r>
-        <w:t xml:space="preserve"> и </w:t>
-      </w:r>
-      <w:r>
-        <w:t>источники (места) возникновения</w:t>
-      </w:r>
-      <w:r>
-        <w:t xml:space="preserve"> </w:t>
-      </w:r>
+        <w:spacing w:line="240" w:lineRule="auto"/>
+        <w:ind w:firstLine="708"/>
+        <w:rPr>
+          <w:lang w:val="en-US"/>
+        </w:rPr>
+      </w:pPr>
+      <w:r>
+        <w:t>Таблица</w:t>
+      </w:r>
+      <w:r>
+        <w:rPr>
+          <w:lang w:val="en-US"/>
+        </w:rPr>
+        <w:t xml:space="preserve"> 4 – </w:t>
+      </w:r>
+      <w:sdt>
+        <w:sdtPr>
+          <w:rPr>
+            <w:lang w:val="en-US"/>
+          </w:rPr>
+          <w:tag w:val="OBJ_TEXT_NAME_4_TABLE"/>
+          <w:id w:val="1696183723"/>
+          <w:placeholder>
+            <w:docPart w:val="9D4C5225C9F54DC4A8D9AE4B943C120F"/>
+          </w:placeholder>
+          <w:text/>
+        </w:sdtPr>
+        <w:sdtEndPr/>
+        <w:sdtContent>
+          <w:r>
+            <w:rPr>
+              <w:lang w:val="en-US"/>
+            </w:rPr>
+            <w:t>${OBJ_TEXT_NAME_</w:t>
+          </w:r>
+          <w:r>
+            <w:rPr>
+              <w:lang w:val="en-US"/>
+            </w:rPr>
+            <w:t>4</w:t>
+          </w:r>
+          <w:r>
+            <w:rPr>
+              <w:lang w:val="en-US"/>
+            </w:rPr>
+            <w:t>_TABLE}</w:t>
+          </w:r>
+        </w:sdtContent>
+      </w:sdt>
+    </w:p>
+    <w:p>
+      <w:pPr>
+        <w:spacing w:after="0" w:line="240" w:lineRule="auto"/>
+        <w:rPr>
+          <w:lang w:val="en-US"/>
+        </w:rPr>
+      </w:pPr>
     </w:p>
     <w:tbl>
       <w:tblPr>
@@ -9038,7 +9586,7 @@
           <w:rPr>
             <w:lang w:val="en-US"/>
           </w:rPr>
-          <w:tag w:val="OBJ_NUM_3_LINC_IMAGE"/>
+          <w:tag w:val="OBJ_NUM_3_IMAGE"/>
           <w:id w:val="-1778789155"/>
           <w:placeholder>
             <w:docPart w:val="DefaultPlaceholder_-1854013440"/>
@@ -9063,7 +9611,7 @@
             <w:rPr>
               <w:lang w:val="en-US"/>
             </w:rPr>
-            <w:t>_LINC_IMAGE}</w:t>
+            <w:t>_IMAGE}</w:t>
           </w:r>
         </w:sdtContent>
       </w:sdt>
@@ -9151,7 +9699,7 @@
           <w:rPr>
             <w:lang w:val="en-US"/>
           </w:rPr>
-          <w:tag w:val="OBJ_NUM_3_CAPTURE_IMAGE"/>
+          <w:tag w:val="OBJ_NUM_3_IMAGE"/>
           <w:id w:val="555131170"/>
           <w:placeholder>
             <w:docPart w:val="DefaultPlaceholder_-1854013440"/>
@@ -9176,7 +9724,7 @@
             <w:rPr>
               <w:lang w:val="en-US"/>
             </w:rPr>
-            <w:t>_CAPTURE_IMAGE}</w:t>
+            <w:t>_IMAGE}</w:t>
           </w:r>
         </w:sdtContent>
       </w:sdt>
@@ -9253,23 +9801,23 @@
       <w:pPr>
         <w:pStyle w:val="2a"/>
       </w:pPr>
-      <w:bookmarkStart w:id="37" w:name="_Toc392754515"/>
-      <w:bookmarkStart w:id="38" w:name="_Toc430097611"/>
-      <w:bookmarkStart w:id="39" w:name="_Toc430255938"/>
-      <w:bookmarkStart w:id="40" w:name="_Toc209703492"/>
-      <w:bookmarkStart w:id="41" w:name="_Toc221000965"/>
+      <w:bookmarkStart w:id="39" w:name="_Toc392754515"/>
+      <w:bookmarkStart w:id="40" w:name="_Toc430097611"/>
+      <w:bookmarkStart w:id="41" w:name="_Toc430255938"/>
+      <w:bookmarkStart w:id="42" w:name="_Toc209703492"/>
+      <w:bookmarkStart w:id="43" w:name="_Toc221000965"/>
       <w:r>
         <w:lastRenderedPageBreak/>
         <w:t xml:space="preserve">2.2. </w:t>
       </w:r>
-      <w:bookmarkEnd w:id="37"/>
-      <w:bookmarkEnd w:id="38"/>
       <w:bookmarkEnd w:id="39"/>
       <w:bookmarkEnd w:id="40"/>
+      <w:bookmarkEnd w:id="41"/>
+      <w:bookmarkEnd w:id="42"/>
       <w:r>
         <w:t>Характеристики аварийности, присущие объекту, и травматизма на нем</w:t>
       </w:r>
-      <w:bookmarkEnd w:id="41"/>
+      <w:bookmarkEnd w:id="43"/>
     </w:p>
     <w:p>
       <w:pPr>
@@ -9421,15 +9969,15 @@
           <w:lang w:eastAsia="en-US"/>
         </w:rPr>
       </w:pPr>
-      <w:bookmarkStart w:id="42" w:name="_Toc405384919"/>
-      <w:bookmarkStart w:id="43" w:name="_Toc405989862"/>
-      <w:bookmarkStart w:id="44" w:name="_Toc409789862"/>
-      <w:bookmarkStart w:id="45" w:name="_Toc409790164"/>
-      <w:bookmarkStart w:id="46" w:name="_Toc427057243"/>
-      <w:bookmarkStart w:id="47" w:name="_Toc430943228"/>
-      <w:bookmarkStart w:id="48" w:name="_Toc430958121"/>
-      <w:bookmarkStart w:id="49" w:name="_Toc209703493"/>
-      <w:bookmarkStart w:id="50" w:name="_Toc221000966"/>
+      <w:bookmarkStart w:id="44" w:name="_Toc405384919"/>
+      <w:bookmarkStart w:id="45" w:name="_Toc405989862"/>
+      <w:bookmarkStart w:id="46" w:name="_Toc409789862"/>
+      <w:bookmarkStart w:id="47" w:name="_Toc409790164"/>
+      <w:bookmarkStart w:id="48" w:name="_Toc427057243"/>
+      <w:bookmarkStart w:id="49" w:name="_Toc430943228"/>
+      <w:bookmarkStart w:id="50" w:name="_Toc430958121"/>
+      <w:bookmarkStart w:id="51" w:name="_Toc209703493"/>
+      <w:bookmarkStart w:id="52" w:name="_Toc221000966"/>
       <w:r>
         <w:rPr>
           <w:lang w:eastAsia="en-US"/>
@@ -9491,8 +10039,6 @@
         </w:rPr>
         <w:t>соответствие задачам ликвидации последствий аварий</w:t>
       </w:r>
-      <w:bookmarkEnd w:id="42"/>
-      <w:bookmarkEnd w:id="43"/>
       <w:bookmarkEnd w:id="44"/>
       <w:bookmarkEnd w:id="45"/>
       <w:bookmarkEnd w:id="46"/>
@@ -9500,6 +10046,8 @@
       <w:bookmarkEnd w:id="48"/>
       <w:bookmarkEnd w:id="49"/>
       <w:bookmarkEnd w:id="50"/>
+      <w:bookmarkEnd w:id="51"/>
+      <w:bookmarkEnd w:id="52"/>
     </w:p>
     <w:p>
       <w:pPr>
@@ -9739,7 +10287,7 @@
       <w:r>
         <w:t xml:space="preserve"> </w:t>
       </w:r>
-      <w:bookmarkStart w:id="51" w:name="_Hlk221181409"/>
+      <w:bookmarkStart w:id="53" w:name="_Hlk221181409"/>
       <w:sdt>
         <w:sdtPr>
           <w:tag w:val="ORG_SHORT_NAME"/>
@@ -9756,7 +10304,7 @@
           </w:r>
         </w:sdtContent>
       </w:sdt>
-      <w:bookmarkEnd w:id="51"/>
+      <w:bookmarkEnd w:id="53"/>
       <w:r>
         <w:t xml:space="preserve"> и </w:t>
       </w:r>
@@ -9915,31 +10463,31 @@
       <w:pPr>
         <w:pStyle w:val="2a"/>
       </w:pPr>
-      <w:bookmarkStart w:id="52" w:name="_Toc430943229"/>
-      <w:bookmarkStart w:id="53" w:name="_Toc430958122"/>
-      <w:bookmarkStart w:id="54" w:name="_Toc209703494"/>
-      <w:bookmarkStart w:id="55" w:name="_Toc221000967"/>
+      <w:bookmarkStart w:id="54" w:name="_Toc430943229"/>
+      <w:bookmarkStart w:id="55" w:name="_Toc430958122"/>
+      <w:bookmarkStart w:id="56" w:name="_Toc209703494"/>
+      <w:bookmarkStart w:id="57" w:name="_Toc221000967"/>
       <w:r>
         <w:t>4.</w:t>
       </w:r>
       <w:r>
         <w:t xml:space="preserve"> </w:t>
       </w:r>
-      <w:bookmarkStart w:id="56" w:name="_Toc379906092"/>
-      <w:bookmarkStart w:id="57" w:name="_Toc381802538"/>
-      <w:bookmarkStart w:id="58" w:name="_Toc391383486"/>
-      <w:bookmarkStart w:id="59" w:name="_Toc414977738"/>
+      <w:bookmarkStart w:id="58" w:name="_Toc379906092"/>
+      <w:bookmarkStart w:id="59" w:name="_Toc381802538"/>
+      <w:bookmarkStart w:id="60" w:name="_Toc391383486"/>
+      <w:bookmarkStart w:id="61" w:name="_Toc414977738"/>
       <w:r>
         <w:t>Организация взаимодействия сил и средств</w:t>
       </w:r>
-      <w:bookmarkEnd w:id="52"/>
-      <w:bookmarkEnd w:id="53"/>
       <w:bookmarkEnd w:id="54"/>
       <w:bookmarkEnd w:id="55"/>
       <w:bookmarkEnd w:id="56"/>
       <w:bookmarkEnd w:id="57"/>
       <w:bookmarkEnd w:id="58"/>
       <w:bookmarkEnd w:id="59"/>
+      <w:bookmarkEnd w:id="60"/>
+      <w:bookmarkEnd w:id="61"/>
     </w:p>
     <w:p>
       <w:pPr>
@@ -10115,9 +10663,22 @@
       <w:r>
         <w:t xml:space="preserve"> при возникновении ЧС приведена на рисунке </w:t>
       </w:r>
-      <w:r>
-        <w:t>4</w:t>
-      </w:r>
+      <w:sdt>
+        <w:sdtPr>
+          <w:tag w:val="OBJ_NUM_4_IMAGE"/>
+          <w:id w:val="-816187138"/>
+          <w:placeholder>
+            <w:docPart w:val="A6AB2859CD35495595DC1B44C13997D9"/>
+          </w:placeholder>
+          <w:text/>
+        </w:sdtPr>
+        <w:sdtEndPr/>
+        <w:sdtContent>
+          <w:r>
+            <w:t>${OBJ_NUM_4_IMAGE}</w:t>
+          </w:r>
+        </w:sdtContent>
+      </w:sdt>
       <w:r>
         <w:t>.</w:t>
       </w:r>
@@ -10133,20 +10694,20 @@
       <w:pPr>
         <w:pStyle w:val="2a"/>
       </w:pPr>
-      <w:bookmarkStart w:id="60" w:name="_Toc430943230"/>
-      <w:bookmarkStart w:id="61" w:name="_Toc430958123"/>
-      <w:bookmarkStart w:id="62" w:name="_Toc209703495"/>
-      <w:bookmarkStart w:id="63" w:name="_Toc221000968"/>
+      <w:bookmarkStart w:id="62" w:name="_Toc430943230"/>
+      <w:bookmarkStart w:id="63" w:name="_Toc430958123"/>
+      <w:bookmarkStart w:id="64" w:name="_Toc209703495"/>
+      <w:bookmarkStart w:id="65" w:name="_Toc221000968"/>
       <w:r>
         <w:t>5</w:t>
       </w:r>
       <w:r>
         <w:t>. Состав и дислокация сил и средств</w:t>
       </w:r>
-      <w:bookmarkEnd w:id="60"/>
-      <w:bookmarkEnd w:id="61"/>
       <w:bookmarkEnd w:id="62"/>
       <w:bookmarkEnd w:id="63"/>
+      <w:bookmarkEnd w:id="64"/>
+      <w:bookmarkEnd w:id="65"/>
     </w:p>
     <w:p>
       <w:pPr>
@@ -10218,32 +10779,136 @@
         <w:t xml:space="preserve"> для ликвидации аварии</w:t>
       </w:r>
       <w:r>
-        <w:t>. Перечень первичных средств приведён в таблице 5</w:t>
+        <w:t xml:space="preserve">. </w:t>
       </w:r>
     </w:p>
     <w:p>
       <w:pPr>
         <w:spacing w:after="0" w:line="240" w:lineRule="auto"/>
         <w:ind w:firstLine="708"/>
-      </w:pPr>
+        <w:rPr>
+          <w:lang w:val="en-US"/>
+        </w:rPr>
+      </w:pPr>
+      <w:sdt>
+        <w:sdtPr>
+          <w:rPr>
+            <w:lang w:val="en-US"/>
+          </w:rPr>
+          <w:tag w:val="OBJ_LINC_TEXT_5_TABLE"/>
+          <w:id w:val="1712078816"/>
+          <w:placeholder>
+            <w:docPart w:val="B1B1AD10BCF345B3B7E8AB8A6E0A0185"/>
+          </w:placeholder>
+          <w:text/>
+        </w:sdtPr>
+        <w:sdtEndPr/>
+        <w:sdtContent>
+          <w:r>
+            <w:rPr>
+              <w:lang w:val="en-US"/>
+            </w:rPr>
+            <w:t>${</w:t>
+          </w:r>
+          <w:r>
+            <w:rPr>
+              <w:lang w:val="en-US"/>
+            </w:rPr>
+            <w:t>OBJ_LINC_TEXT_</w:t>
+          </w:r>
+          <w:r>
+            <w:rPr>
+              <w:lang w:val="en-US"/>
+            </w:rPr>
+            <w:t>5</w:t>
+          </w:r>
+          <w:r>
+            <w:rPr>
+              <w:lang w:val="en-US"/>
+            </w:rPr>
+            <w:t>_TABLE</w:t>
+          </w:r>
+          <w:r>
+            <w:rPr>
+              <w:lang w:val="en-US"/>
+            </w:rPr>
+            <w:t>}</w:t>
+          </w:r>
+        </w:sdtContent>
+      </w:sdt>
+      <w:r>
+        <w:rPr>
+          <w:lang w:val="en-US"/>
+        </w:rPr>
+        <w:t xml:space="preserve"> 5</w:t>
+      </w:r>
     </w:p>
     <w:p>
       <w:pPr>
         <w:spacing w:after="0" w:line="240" w:lineRule="auto"/>
-      </w:pPr>
-      <w:r>
-        <w:t xml:space="preserve">Таблица 5 - </w:t>
-      </w:r>
-      <w:r>
-        <w:t>Перечень первичных средств пожаротушения, инструментов и материалов для ликвидации аварии с указанием мест расположения п</w:t>
-      </w:r>
-      <w:r>
-        <w:t>ервичных средств пожаротушения</w:t>
-      </w:r>
+        <w:ind w:firstLine="708"/>
+        <w:rPr>
+          <w:lang w:val="en-US"/>
+        </w:rPr>
+      </w:pPr>
     </w:p>
     <w:p>
       <w:pPr>
         <w:spacing w:after="0" w:line="240" w:lineRule="auto"/>
+        <w:rPr>
+          <w:lang w:val="en-US"/>
+        </w:rPr>
+      </w:pPr>
+      <w:r>
+        <w:t>Таблица</w:t>
+      </w:r>
+      <w:r>
+        <w:rPr>
+          <w:lang w:val="en-US"/>
+        </w:rPr>
+        <w:t xml:space="preserve"> 5 - </w:t>
+      </w:r>
+      <w:sdt>
+        <w:sdtPr>
+          <w:rPr>
+            <w:lang w:val="en-US"/>
+          </w:rPr>
+          <w:tag w:val="OBJ_TEXT_NAME_5_TABLE"/>
+          <w:id w:val="1698965655"/>
+          <w:placeholder>
+            <w:docPart w:val="CC9BEDD1E228474AB3018C21A34D8E1A"/>
+          </w:placeholder>
+          <w:text/>
+        </w:sdtPr>
+        <w:sdtEndPr/>
+        <w:sdtContent>
+          <w:r>
+            <w:rPr>
+              <w:lang w:val="en-US"/>
+            </w:rPr>
+            <w:t>${OBJ_TEXT_NAME_</w:t>
+          </w:r>
+          <w:r>
+            <w:rPr>
+              <w:lang w:val="en-US"/>
+            </w:rPr>
+            <w:t>5</w:t>
+          </w:r>
+          <w:r>
+            <w:rPr>
+              <w:lang w:val="en-US"/>
+            </w:rPr>
+            <w:t>_TABLE}</w:t>
+          </w:r>
+        </w:sdtContent>
+      </w:sdt>
+    </w:p>
+    <w:p>
+      <w:pPr>
+        <w:spacing w:after="0" w:line="240" w:lineRule="auto"/>
+        <w:rPr>
+          <w:lang w:val="en-US"/>
+        </w:rPr>
       </w:pPr>
     </w:p>
     <w:tbl>
@@ -10290,8 +10955,16 @@
               <w:rPr>
                 <w:color w:val="000000"/>
               </w:rPr>
-              <w:t>№ пп</w:t>
-            </w:r>
+              <w:t xml:space="preserve">№ </w:t>
+            </w:r>
+            <w:proofErr w:type="spellStart"/>
+            <w:r>
+              <w:rPr>
+                <w:color w:val="000000"/>
+              </w:rPr>
+              <w:t>пп</w:t>
+            </w:r>
+            <w:proofErr w:type="spellEnd"/>
           </w:p>
         </w:tc>
         <w:tc>
@@ -11298,7 +11971,7 @@
         <w:t>Привлекаемые силы и средства:</w:t>
       </w:r>
     </w:p>
-    <w:bookmarkStart w:id="64" w:name="_Hlk221181612"/>
+    <w:bookmarkStart w:id="66" w:name="_Hlk221181612"/>
     <w:p>
       <w:pPr>
         <w:spacing w:before="240" w:after="0" w:line="240" w:lineRule="auto"/>
@@ -11331,7 +12004,7 @@
           </w:r>
         </w:sdtContent>
       </w:sdt>
-      <w:bookmarkEnd w:id="64"/>
+      <w:bookmarkEnd w:id="66"/>
       <w:r>
         <w:rPr>
           <w:lang w:val="en-US"/>
@@ -11524,113 +12197,113 @@
           <w:szCs w:val="24"/>
           <w:u w:val="single"/>
         </w:rPr>
-        <w:t xml:space="preserve">. Аттестованных спасателей </w:t>
+        <w:t xml:space="preserve">. Аттестованных спасателей – всего </w:t>
       </w:r>
       <w:r>
         <w:rPr>
           <w:szCs w:val="24"/>
           <w:u w:val="single"/>
         </w:rPr>
-        <w:lastRenderedPageBreak/>
-        <w:t xml:space="preserve">– всего </w:t>
+        <w:t>74</w:t>
       </w:r>
       <w:r>
         <w:rPr>
           <w:szCs w:val="24"/>
           <w:u w:val="single"/>
         </w:rPr>
-        <w:t>74</w:t>
+        <w:t xml:space="preserve">, из них имеют классную квалификацию – </w:t>
       </w:r>
       <w:r>
         <w:rPr>
           <w:szCs w:val="24"/>
           <w:u w:val="single"/>
         </w:rPr>
-        <w:t xml:space="preserve">, из них имеют классную квалификацию – </w:t>
+        <w:t>46</w:t>
       </w:r>
       <w:r>
         <w:rPr>
           <w:szCs w:val="24"/>
           <w:u w:val="single"/>
         </w:rPr>
-        <w:t>46</w:t>
+        <w:t xml:space="preserve"> спасателей; 3 кл</w:t>
       </w:r>
       <w:r>
         <w:rPr>
           <w:szCs w:val="24"/>
           <w:u w:val="single"/>
         </w:rPr>
-        <w:t xml:space="preserve"> спасателей; 3 кл</w:t>
+        <w:t>.</w:t>
       </w:r>
       <w:r>
         <w:rPr>
           <w:szCs w:val="24"/>
           <w:u w:val="single"/>
         </w:rPr>
-        <w:t>.</w:t>
+        <w:t xml:space="preserve"> – 1</w:t>
       </w:r>
       <w:r>
         <w:rPr>
           <w:szCs w:val="24"/>
           <w:u w:val="single"/>
         </w:rPr>
-        <w:t xml:space="preserve"> – 1</w:t>
+        <w:t>3</w:t>
       </w:r>
       <w:r>
         <w:rPr>
           <w:szCs w:val="24"/>
           <w:u w:val="single"/>
         </w:rPr>
-        <w:t>3</w:t>
+        <w:t>; 2 кл</w:t>
       </w:r>
       <w:r>
         <w:rPr>
           <w:szCs w:val="24"/>
           <w:u w:val="single"/>
         </w:rPr>
-        <w:t>; 2 кл</w:t>
+        <w:t>.</w:t>
       </w:r>
       <w:r>
         <w:rPr>
           <w:szCs w:val="24"/>
           <w:u w:val="single"/>
         </w:rPr>
-        <w:t>.</w:t>
+        <w:t xml:space="preserve"> – </w:t>
       </w:r>
       <w:r>
         <w:rPr>
           <w:szCs w:val="24"/>
           <w:u w:val="single"/>
         </w:rPr>
-        <w:t xml:space="preserve"> – </w:t>
+        <w:t>7</w:t>
       </w:r>
       <w:r>
         <w:rPr>
           <w:szCs w:val="24"/>
           <w:u w:val="single"/>
         </w:rPr>
-        <w:t>7</w:t>
+        <w:t>; 1 кл</w:t>
       </w:r>
       <w:r>
         <w:rPr>
           <w:szCs w:val="24"/>
           <w:u w:val="single"/>
         </w:rPr>
-        <w:t>; 1 кл</w:t>
+        <w:t>.</w:t>
       </w:r>
       <w:r>
         <w:rPr>
           <w:szCs w:val="24"/>
           <w:u w:val="single"/>
         </w:rPr>
-        <w:t>.</w:t>
+        <w:t xml:space="preserve"> </w:t>
       </w:r>
       <w:r>
         <w:rPr>
           <w:szCs w:val="24"/>
           <w:u w:val="single"/>
         </w:rPr>
-        <w:t xml:space="preserve"> – </w:t>
+        <w:lastRenderedPageBreak/>
+        <w:t xml:space="preserve">– </w:t>
       </w:r>
       <w:r>
         <w:rPr>
@@ -11726,7 +12399,7 @@
       <w:r>
         <w:t xml:space="preserve"> </w:t>
       </w:r>
-      <w:bookmarkStart w:id="65" w:name="_Hlk221181717"/>
+      <w:bookmarkStart w:id="67" w:name="_Hlk221181717"/>
       <w:sdt>
         <w:sdtPr>
           <w:tag w:val="ASF_STATUS"/>
@@ -11768,7 +12441,7 @@
       <w:r>
         <w:t xml:space="preserve"> </w:t>
       </w:r>
-      <w:bookmarkEnd w:id="65"/>
+      <w:bookmarkEnd w:id="67"/>
       <w:r>
         <w:t>приведены в Приложении 2.</w:t>
       </w:r>
@@ -11786,10 +12459,10 @@
           <w:lang w:eastAsia="en-US"/>
         </w:rPr>
       </w:pPr>
-      <w:bookmarkStart w:id="66" w:name="_Toc430943233"/>
-      <w:bookmarkStart w:id="67" w:name="_Toc430958125"/>
-      <w:bookmarkStart w:id="68" w:name="_Toc209703496"/>
-      <w:bookmarkStart w:id="69" w:name="_Toc221000969"/>
+      <w:bookmarkStart w:id="68" w:name="_Toc430943233"/>
+      <w:bookmarkStart w:id="69" w:name="_Toc430958125"/>
+      <w:bookmarkStart w:id="70" w:name="_Toc209703496"/>
+      <w:bookmarkStart w:id="71" w:name="_Toc221000969"/>
       <w:r>
         <w:rPr>
           <w:lang w:eastAsia="en-US"/>
@@ -11801,23 +12474,23 @@
           <w:lang w:eastAsia="en-US"/>
         </w:rPr>
         <w:t xml:space="preserve">. Порядок обеспечения постоянной готовности сил и средств к локализации и ликвидации последствий аварий на </w:t>
-      </w:r>
-      <w:bookmarkEnd w:id="66"/>
-      <w:bookmarkEnd w:id="67"/>
-      <w:r>
-        <w:rPr>
-          <w:lang w:eastAsia="en-US"/>
-        </w:rPr>
-        <w:t>объекте</w:t>
-      </w:r>
-      <w:r>
-        <w:rPr>
-          <w:lang w:eastAsia="en-US"/>
-        </w:rPr>
-        <w:t>, которые несут ответственность за поддержание этих сил и средств в надлежащей степени готовности</w:t>
       </w:r>
       <w:bookmarkEnd w:id="68"/>
       <w:bookmarkEnd w:id="69"/>
+      <w:r>
+        <w:rPr>
+          <w:lang w:eastAsia="en-US"/>
+        </w:rPr>
+        <w:t>объекте</w:t>
+      </w:r>
+      <w:r>
+        <w:rPr>
+          <w:lang w:eastAsia="en-US"/>
+        </w:rPr>
+        <w:t>, которые несут ответственность за поддержание этих сил и средств в надлежащей степени готовности</w:t>
+      </w:r>
+      <w:bookmarkEnd w:id="70"/>
+      <w:bookmarkEnd w:id="71"/>
     </w:p>
     <w:p>
       <w:pPr>
@@ -12008,7 +12681,7 @@
       <w:r>
         <w:t xml:space="preserve"> </w:t>
       </w:r>
-      <w:bookmarkStart w:id="70" w:name="_Hlk221197015"/>
+      <w:bookmarkStart w:id="72" w:name="_Hlk221197015"/>
       <w:sdt>
         <w:sdtPr>
           <w:tag w:val="ASF_STATUS_SHORT"/>
@@ -12025,7 +12698,7 @@
           </w:r>
         </w:sdtContent>
       </w:sdt>
-      <w:bookmarkEnd w:id="70"/>
+      <w:bookmarkEnd w:id="72"/>
       <w:r>
         <w:t xml:space="preserve"> </w:t>
       </w:r>
@@ -12140,23 +12813,23 @@
           <w:i/>
         </w:rPr>
       </w:pPr>
-      <w:bookmarkStart w:id="71" w:name="_Toc430943234"/>
-      <w:bookmarkStart w:id="72" w:name="_Toc430958126"/>
-      <w:bookmarkStart w:id="73" w:name="_Toc209703497"/>
-      <w:bookmarkStart w:id="74" w:name="_Toc221000970"/>
+      <w:bookmarkStart w:id="73" w:name="_Toc430943234"/>
+      <w:bookmarkStart w:id="74" w:name="_Toc430958126"/>
+      <w:bookmarkStart w:id="75" w:name="_Toc209703497"/>
+      <w:bookmarkStart w:id="76" w:name="_Toc221000970"/>
       <w:r>
         <w:t>7</w:t>
       </w:r>
       <w:r>
         <w:t xml:space="preserve">. Организация управления, связи и оповещения при аварии на </w:t>
       </w:r>
-      <w:bookmarkEnd w:id="71"/>
-      <w:bookmarkEnd w:id="72"/>
       <w:bookmarkEnd w:id="73"/>
+      <w:bookmarkEnd w:id="74"/>
+      <w:bookmarkEnd w:id="75"/>
       <w:r>
         <w:t>объекте</w:t>
       </w:r>
-      <w:bookmarkEnd w:id="74"/>
+      <w:bookmarkEnd w:id="76"/>
     </w:p>
     <w:p>
       <w:pPr>
@@ -12321,7 +12994,6 @@
         <w:jc w:val="both"/>
       </w:pPr>
       <w:r>
-        <w:lastRenderedPageBreak/>
         <w:t xml:space="preserve">В организации </w:t>
       </w:r>
       <w:sdt>
@@ -12363,25 +13035,36 @@
         <w:jc w:val="both"/>
         <w:rPr>
           <w:highlight w:val="yellow"/>
-        </w:rPr>
-      </w:pPr>
-      <w:r>
-        <w:t xml:space="preserve"> </w:t>
-      </w:r>
-      <w:r>
-        <w:t>Список должностных лиц и учреждений, которые должны быть немедленно извещены об аварии, взрыве, пожаре</w:t>
-      </w:r>
-      <w:r>
-        <w:t xml:space="preserve"> показан в</w:t>
-      </w:r>
-      <w:r>
-        <w:t xml:space="preserve"> таблице </w:t>
-      </w:r>
-      <w:r>
-        <w:t>6</w:t>
-      </w:r>
-      <w:r>
-        <w:t>.</w:t>
+          <w:lang w:val="en-US"/>
+        </w:rPr>
+      </w:pPr>
+      <w:sdt>
+        <w:sdtPr>
+          <w:rPr>
+            <w:lang w:val="en-US"/>
+          </w:rPr>
+          <w:tag w:val="OBJ_LINC_TEXT_6_TABLE"/>
+          <w:id w:val="1223405610"/>
+          <w:placeholder>
+            <w:docPart w:val="7687FF12CCEE48EE93BCB1987E5A8179"/>
+          </w:placeholder>
+          <w:text/>
+        </w:sdtPr>
+        <w:sdtEndPr/>
+        <w:sdtContent>
+          <w:r>
+            <w:rPr>
+              <w:lang w:val="en-US"/>
+            </w:rPr>
+            <w:t>${OBJ_LINC_TEXT_6_TABLE}</w:t>
+          </w:r>
+        </w:sdtContent>
+      </w:sdt>
+      <w:r>
+        <w:rPr>
+          <w:lang w:val="en-US"/>
+        </w:rPr>
+        <w:t xml:space="preserve"> 6.</w:t>
       </w:r>
     </w:p>
     <w:p>
@@ -12389,21 +13072,61 @@
         <w:spacing w:after="0" w:line="240" w:lineRule="auto"/>
         <w:ind w:firstLine="709"/>
         <w:jc w:val="both"/>
-      </w:pPr>
-      <w:r>
-        <w:t xml:space="preserve">Список лиц ответственных за выполнения мероприятий, предусмотренных </w:t>
-      </w:r>
-      <w:r>
-        <w:t>ПМЛЛПА показан</w:t>
-      </w:r>
-      <w:r>
-        <w:t xml:space="preserve"> в таблице </w:t>
-      </w:r>
-      <w:r>
-        <w:t>7</w:t>
-      </w:r>
-      <w:r>
-        <w:t>.</w:t>
+        <w:rPr>
+          <w:lang w:val="en-US"/>
+        </w:rPr>
+      </w:pPr>
+      <w:sdt>
+        <w:sdtPr>
+          <w:rPr>
+            <w:lang w:val="en-US"/>
+          </w:rPr>
+          <w:tag w:val="OBJ_LINC_TEXT_7_TABLE"/>
+          <w:id w:val="-394585725"/>
+          <w:placeholder>
+            <w:docPart w:val="76C728EAE1A04C2E9C7CE67DC0682365"/>
+          </w:placeholder>
+          <w:text/>
+        </w:sdtPr>
+        <w:sdtEndPr/>
+        <w:sdtContent>
+          <w:r>
+            <w:rPr>
+              <w:lang w:val="en-US"/>
+            </w:rPr>
+            <w:t>${</w:t>
+          </w:r>
+          <w:r>
+            <w:rPr>
+              <w:lang w:val="en-US"/>
+            </w:rPr>
+            <w:t>OBJ_LINC_TEXT_</w:t>
+          </w:r>
+          <w:r>
+            <w:rPr>
+              <w:lang w:val="en-US"/>
+            </w:rPr>
+            <w:t>7</w:t>
+          </w:r>
+          <w:r>
+            <w:rPr>
+              <w:lang w:val="en-US"/>
+            </w:rPr>
+            <w:t>_TABLE</w:t>
+          </w:r>
+          <w:r>
+            <w:rPr>
+              <w:lang w:val="en-US"/>
+            </w:rPr>
+            <w:t>}</w:t>
+          </w:r>
+        </w:sdtContent>
+      </w:sdt>
+      <w:r>
+        <w:rPr>
+          <w:lang w:val="en-US"/>
+        </w:rPr>
+        <w:t xml:space="preserve"> 7.</w:t>
       </w:r>
     </w:p>
     <w:p>
@@ -12413,18 +13136,71 @@
         <w:jc w:val="both"/>
         <w:rPr>
           <w:highlight w:val="yellow"/>
-        </w:rPr>
-      </w:pPr>
-      <w:r>
-        <w:t>Состав КЧС орг</w:t>
-      </w:r>
-      <w:r>
-        <w:t xml:space="preserve">анизации показан в таблице </w:t>
-      </w:r>
-      <w:r>
+          <w:lang w:val="en-US"/>
+        </w:rPr>
+      </w:pPr>
+      <w:sdt>
+        <w:sdtPr>
+          <w:rPr>
+            <w:lang w:val="en-US"/>
+          </w:rPr>
+          <w:tag w:val="OBJ_LINC_TEXT_8_TABLE"/>
+          <w:id w:val="2085107456"/>
+          <w:placeholder>
+            <w:docPart w:val="6BDB6FDC91FA4D5087A7980222DCCAA8"/>
+          </w:placeholder>
+          <w:text/>
+        </w:sdtPr>
+        <w:sdtEndPr/>
+        <w:sdtContent>
+          <w:r>
+            <w:rPr>
+              <w:lang w:val="en-US"/>
+            </w:rPr>
+            <w:t>${</w:t>
+          </w:r>
+          <w:r>
+            <w:rPr>
+              <w:lang w:val="en-US"/>
+            </w:rPr>
+            <w:t>OBJ_LINC_TEXT_</w:t>
+          </w:r>
+          <w:r>
+            <w:rPr>
+              <w:lang w:val="en-US"/>
+            </w:rPr>
+            <w:t>8</w:t>
+          </w:r>
+          <w:r>
+            <w:rPr>
+              <w:lang w:val="en-US"/>
+            </w:rPr>
+            <w:t>_TABLE</w:t>
+          </w:r>
+          <w:r>
+            <w:rPr>
+              <w:lang w:val="en-US"/>
+            </w:rPr>
+            <w:t>}</w:t>
+          </w:r>
+        </w:sdtContent>
+      </w:sdt>
+      <w:r>
+        <w:rPr>
+          <w:lang w:val="en-US"/>
+        </w:rPr>
+        <w:t xml:space="preserve"> </w:t>
+      </w:r>
+      <w:r>
+        <w:rPr>
+          <w:lang w:val="en-US"/>
+        </w:rPr>
         <w:t>8</w:t>
       </w:r>
       <w:r>
+        <w:rPr>
+          <w:lang w:val="en-US"/>
+        </w:rPr>
         <w:t>.</w:t>
       </w:r>
     </w:p>
@@ -12433,15 +13209,54 @@
         <w:spacing w:after="0" w:line="240" w:lineRule="auto"/>
         <w:ind w:firstLine="709"/>
         <w:jc w:val="both"/>
-      </w:pPr>
-      <w:r>
-        <w:t>Схема вз</w:t>
-      </w:r>
-      <w:r>
-        <w:t xml:space="preserve">аимодействия и оповещения </w:t>
+        <w:rPr>
+          <w:lang w:val="en-US"/>
+        </w:rPr>
+      </w:pPr>
+      <w:r>
+        <w:t>Схема</w:t>
+      </w:r>
+      <w:r>
+        <w:rPr>
+          <w:lang w:val="en-US"/>
+        </w:rPr>
+        <w:t xml:space="preserve"> </w:t>
+      </w:r>
+      <w:r>
+        <w:t>вз</w:t>
+      </w:r>
+      <w:r>
+        <w:t>аимодействия</w:t>
+      </w:r>
+      <w:r>
+        <w:rPr>
+          <w:lang w:val="en-US"/>
+        </w:rPr>
+        <w:t xml:space="preserve"> </w:t>
+      </w:r>
+      <w:r>
+        <w:t>и</w:t>
+      </w:r>
+      <w:r>
+        <w:rPr>
+          <w:lang w:val="en-US"/>
+        </w:rPr>
+        <w:t xml:space="preserve"> </w:t>
+      </w:r>
+      <w:r>
+        <w:t>оповещения</w:t>
+      </w:r>
+      <w:r>
+        <w:rPr>
+          <w:lang w:val="en-US"/>
+        </w:rPr>
+        <w:t xml:space="preserve"> </w:t>
       </w:r>
       <w:sdt>
         <w:sdtPr>
+          <w:rPr>
+            <w:lang w:val="en-US"/>
+          </w:rPr>
           <w:tag w:val="ASF_STATUS_SHORT"/>
           <w:id w:val="-2098780095"/>
           <w:placeholder>
@@ -12452,20 +13267,99 @@
         <w:sdtEndPr/>
         <w:sdtContent>
           <w:r>
+            <w:rPr>
+              <w:lang w:val="en-US"/>
+            </w:rPr>
             <w:t>${ASF_STATUS_SHORT}</w:t>
           </w:r>
         </w:sdtContent>
       </w:sdt>
       <w:r>
+        <w:rPr>
+          <w:lang w:val="en-US"/>
+        </w:rPr>
         <w:t xml:space="preserve"> </w:t>
       </w:r>
       <w:r>
-        <w:t xml:space="preserve">при возникновении ЧС приведена на рисунке </w:t>
-      </w:r>
-      <w:r>
-        <w:t>4</w:t>
-      </w:r>
-      <w:r>
+        <w:t>при</w:t>
+      </w:r>
+      <w:r>
+        <w:rPr>
+          <w:lang w:val="en-US"/>
+        </w:rPr>
+        <w:t xml:space="preserve"> </w:t>
+      </w:r>
+      <w:r>
+        <w:t>возникновении</w:t>
+      </w:r>
+      <w:r>
+        <w:rPr>
+          <w:lang w:val="en-US"/>
+        </w:rPr>
+        <w:t xml:space="preserve"> </w:t>
+      </w:r>
+      <w:r>
+        <w:t>ЧС</w:t>
+      </w:r>
+      <w:r>
+        <w:rPr>
+          <w:lang w:val="en-US"/>
+        </w:rPr>
+        <w:t xml:space="preserve"> </w:t>
+      </w:r>
+      <w:r>
+        <w:t>приведена</w:t>
+      </w:r>
+      <w:r>
+        <w:rPr>
+          <w:lang w:val="en-US"/>
+        </w:rPr>
+        <w:t xml:space="preserve"> </w:t>
+      </w:r>
+      <w:r>
+        <w:t>на</w:t>
+      </w:r>
+      <w:r>
+        <w:rPr>
+          <w:lang w:val="en-US"/>
+        </w:rPr>
+        <w:t xml:space="preserve"> </w:t>
+      </w:r>
+      <w:r>
+        <w:t>рисунке</w:t>
+      </w:r>
+      <w:r>
+        <w:rPr>
+          <w:lang w:val="en-US"/>
+        </w:rPr>
+        <w:t xml:space="preserve"> </w:t>
+      </w:r>
+      <w:sdt>
+        <w:sdtPr>
+          <w:rPr>
+            <w:lang w:val="en-US"/>
+          </w:rPr>
+          <w:tag w:val="OBJ_NUM_4_IMAGE"/>
+          <w:id w:val="1497924021"/>
+          <w:placeholder>
+            <w:docPart w:val="0825214F32474CDF8EE20883F9103C87"/>
+          </w:placeholder>
+          <w:text/>
+        </w:sdtPr>
+        <w:sdtEndPr/>
+        <w:sdtContent>
+          <w:r>
+            <w:rPr>
+              <w:lang w:val="en-US"/>
+            </w:rPr>
+            <w:t>${OBJ_NUM_4_IMAGE}</w:t>
+          </w:r>
+        </w:sdtContent>
+      </w:sdt>
+      <w:r>
+        <w:rPr>
+          <w:lang w:val="en-US"/>
+        </w:rPr>
         <w:t>.</w:t>
       </w:r>
     </w:p>
@@ -12473,33 +13367,70 @@
       <w:pPr>
         <w:spacing w:after="0" w:line="240" w:lineRule="auto"/>
         <w:jc w:val="both"/>
+        <w:rPr>
+          <w:lang w:val="en-US"/>
+        </w:rPr>
       </w:pPr>
     </w:p>
     <w:p>
       <w:pPr>
         <w:spacing w:after="0" w:line="240" w:lineRule="auto"/>
         <w:jc w:val="both"/>
-      </w:pPr>
-      <w:r>
-        <w:t xml:space="preserve">Таблица </w:t>
-      </w:r>
-      <w:r>
-        <w:t>6</w:t>
-      </w:r>
-      <w:r>
-        <w:t xml:space="preserve"> – </w:t>
-      </w:r>
-      <w:r>
-        <w:t>Список должностных лиц и учреждений, которые должны быть немедленно извещены об аварии, взрыве, пожаре</w:t>
-      </w:r>
-      <w:r>
-        <w:t>.</w:t>
-      </w:r>
+        <w:rPr>
+          <w:lang w:val="en-US"/>
+        </w:rPr>
+      </w:pPr>
+      <w:r>
+        <w:t>Таблица</w:t>
+      </w:r>
+      <w:r>
+        <w:rPr>
+          <w:lang w:val="en-US"/>
+        </w:rPr>
+        <w:t xml:space="preserve"> 6 – </w:t>
+      </w:r>
+      <w:sdt>
+        <w:sdtPr>
+          <w:rPr>
+            <w:lang w:val="en-US"/>
+          </w:rPr>
+          <w:tag w:val="OBJ_TEXT_NAME_6_TABLE"/>
+          <w:id w:val="207388156"/>
+          <w:placeholder>
+            <w:docPart w:val="1DBABD64649B4DEE9C5688C6D9AC5E97"/>
+          </w:placeholder>
+          <w:text/>
+        </w:sdtPr>
+        <w:sdtEndPr/>
+        <w:sdtContent>
+          <w:r>
+            <w:rPr>
+              <w:lang w:val="en-US"/>
+            </w:rPr>
+            <w:t>${OBJ_TEXT_NAME_</w:t>
+          </w:r>
+          <w:r>
+            <w:rPr>
+              <w:lang w:val="en-US"/>
+            </w:rPr>
+            <w:t>6</w:t>
+          </w:r>
+          <w:r>
+            <w:rPr>
+              <w:lang w:val="en-US"/>
+            </w:rPr>
+            <w:t>_TABLE}</w:t>
+          </w:r>
+        </w:sdtContent>
+      </w:sdt>
     </w:p>
     <w:p>
       <w:pPr>
         <w:spacing w:after="0" w:line="240" w:lineRule="auto"/>
         <w:jc w:val="both"/>
+        <w:rPr>
+          <w:lang w:val="en-US"/>
+        </w:rPr>
       </w:pPr>
     </w:p>
     <w:tbl>
@@ -12535,8 +13466,16 @@
               <w:rPr>
                 <w:rFonts w:eastAsia="Calibri"/>
               </w:rPr>
-              <w:t>№ пп</w:t>
-            </w:r>
+              <w:t xml:space="preserve">№ </w:t>
+            </w:r>
+            <w:proofErr w:type="spellStart"/>
+            <w:r>
+              <w:rPr>
+                <w:rFonts w:eastAsia="Calibri"/>
+              </w:rPr>
+              <w:t>пп</w:t>
+            </w:r>
+            <w:proofErr w:type="spellEnd"/>
           </w:p>
         </w:tc>
         <w:tc>
@@ -13306,7 +14245,21 @@
               <w:rPr>
                 <w:rFonts w:eastAsia="Calibri"/>
               </w:rPr>
-              <w:t xml:space="preserve">г. Владикавказ, ул. Иристонская, 25а, </w:t>
+              <w:t xml:space="preserve">г. Владикавказ, ул. </w:t>
+            </w:r>
+            <w:proofErr w:type="spellStart"/>
+            <w:r>
+              <w:rPr>
+                <w:rFonts w:eastAsia="Calibri"/>
+              </w:rPr>
+              <w:t>Иристонская</w:t>
+            </w:r>
+            <w:proofErr w:type="spellEnd"/>
+            <w:r>
+              <w:rPr>
+                <w:rFonts w:eastAsia="Calibri"/>
+              </w:rPr>
+              <w:t xml:space="preserve">, 25а, </w:t>
             </w:r>
           </w:p>
         </w:tc>
@@ -13816,7 +14769,15 @@
               <w:spacing w:after="0" w:line="240" w:lineRule="auto"/>
             </w:pPr>
             <w:r>
-              <w:t>ст. Луковская, ул. Ермолова, 8</w:t>
+              <w:t xml:space="preserve">ст. </w:t>
+            </w:r>
+            <w:proofErr w:type="spellStart"/>
+            <w:r>
+              <w:t>Луковская</w:t>
+            </w:r>
+            <w:proofErr w:type="spellEnd"/>
+            <w:r>
+              <w:t>, ул. Ермолова, 8</w:t>
             </w:r>
           </w:p>
         </w:tc>
@@ -13837,7 +14798,6 @@
               <w:rPr>
                 <w:rFonts w:eastAsia="Calibri"/>
               </w:rPr>
-              <w:lastRenderedPageBreak/>
               <w:t>10</w:t>
             </w:r>
           </w:p>
@@ -13866,8 +14826,13 @@
             <w:pPr>
               <w:spacing w:after="0" w:line="240" w:lineRule="auto"/>
             </w:pPr>
-            <w:r>
-              <w:t>Макиев Д.Р.</w:t>
+            <w:proofErr w:type="spellStart"/>
+            <w:r>
+              <w:t>Макиев</w:t>
+            </w:r>
+            <w:proofErr w:type="spellEnd"/>
+            <w:r>
+              <w:t xml:space="preserve"> Д.Р.</w:t>
             </w:r>
           </w:p>
         </w:tc>
@@ -14025,6 +14990,7 @@
               <w:rPr>
                 <w:rFonts w:eastAsia="Calibri"/>
               </w:rPr>
+              <w:lastRenderedPageBreak/>
               <w:t>12</w:t>
             </w:r>
           </w:p>
@@ -14057,8 +15023,13 @@
             <w:pPr>
               <w:spacing w:after="0" w:line="240" w:lineRule="auto"/>
             </w:pPr>
-            <w:r>
-              <w:t>Дулаев Т.Х.</w:t>
+            <w:proofErr w:type="spellStart"/>
+            <w:r>
+              <w:t>Дулаев</w:t>
+            </w:r>
+            <w:proofErr w:type="spellEnd"/>
+            <w:r>
+              <w:t xml:space="preserve"> Т.Х.</w:t>
             </w:r>
           </w:p>
         </w:tc>
@@ -14161,8 +15132,13 @@
             <w:pPr>
               <w:spacing w:after="0" w:line="240" w:lineRule="auto"/>
             </w:pPr>
-            <w:r>
-              <w:t>Корсунов А.В.</w:t>
+            <w:proofErr w:type="spellStart"/>
+            <w:r>
+              <w:t>Корсунов</w:t>
+            </w:r>
+            <w:proofErr w:type="spellEnd"/>
+            <w:r>
+              <w:t xml:space="preserve"> А.В.</w:t>
             </w:r>
           </w:p>
         </w:tc>
@@ -14205,7 +15181,23 @@
               <w:spacing w:after="0" w:line="240" w:lineRule="auto"/>
             </w:pPr>
             <w:r>
-              <w:t>ст. Луковская, ул. Кизлярская, 44</w:t>
+              <w:t xml:space="preserve">ст. </w:t>
+            </w:r>
+            <w:proofErr w:type="spellStart"/>
+            <w:r>
+              <w:t>Луковская</w:t>
+            </w:r>
+            <w:proofErr w:type="spellEnd"/>
+            <w:r>
+              <w:t xml:space="preserve">, ул. </w:t>
+            </w:r>
+            <w:proofErr w:type="spellStart"/>
+            <w:r>
+              <w:t>Кизлярская</w:t>
+            </w:r>
+            <w:proofErr w:type="spellEnd"/>
+            <w:r>
+              <w:t>, 44</w:t>
             </w:r>
           </w:p>
         </w:tc>
@@ -14304,27 +15296,61 @@
       <w:pPr>
         <w:spacing w:after="0" w:line="240" w:lineRule="auto"/>
         <w:jc w:val="both"/>
-      </w:pPr>
+        <w:rPr>
+          <w:lang w:val="en-US"/>
+        </w:rPr>
+      </w:pPr>
+      <w:r>
+        <w:t>Таблица</w:t>
+      </w:r>
+      <w:r>
+        <w:rPr>
+          <w:lang w:val="en-US"/>
+        </w:rPr>
+        <w:t xml:space="preserve"> 7 – </w:t>
+      </w:r>
+      <w:sdt>
+        <w:sdtPr>
+          <w:rPr>
+            <w:lang w:val="en-US"/>
+          </w:rPr>
+          <w:tag w:val="OBJ_TEXT_NAME_7_TABLE"/>
+          <w:id w:val="-1912919203"/>
+          <w:placeholder>
+            <w:docPart w:val="759EDD12A804487E82E849137AFC2B1D"/>
+          </w:placeholder>
+          <w:text/>
+        </w:sdtPr>
+        <w:sdtEndPr/>
+        <w:sdtContent>
+          <w:r>
+            <w:rPr>
+              <w:lang w:val="en-US"/>
+            </w:rPr>
+            <w:t>${OBJ_TEXT_NAME_</w:t>
+          </w:r>
+          <w:r>
+            <w:rPr>
+              <w:lang w:val="en-US"/>
+            </w:rPr>
+            <w:t>7</w:t>
+          </w:r>
+          <w:r>
+            <w:rPr>
+              <w:lang w:val="en-US"/>
+            </w:rPr>
+            <w:t>_TABLE}</w:t>
+          </w:r>
+        </w:sdtContent>
+      </w:sdt>
     </w:p>
     <w:p>
       <w:pPr>
         <w:spacing w:after="0" w:line="240" w:lineRule="auto"/>
         <w:jc w:val="both"/>
-      </w:pPr>
-      <w:r>
-        <w:t>Таблица 7</w:t>
-      </w:r>
-      <w:r>
-        <w:t xml:space="preserve"> – </w:t>
-      </w:r>
-      <w:r>
-        <w:t>Список лиц ответственных за выполнения мероприятий, предусмотренных планом</w:t>
-      </w:r>
-    </w:p>
-    <w:p>
-      <w:pPr>
-        <w:spacing w:after="0" w:line="360" w:lineRule="auto"/>
-        <w:jc w:val="both"/>
+        <w:rPr>
+          <w:lang w:val="en-US"/>
+        </w:rPr>
       </w:pPr>
     </w:p>
     <w:tbl>
@@ -14357,8 +15383,16 @@
               <w:rPr>
                 <w:rFonts w:eastAsia="Calibri"/>
               </w:rPr>
-              <w:t>№ пп</w:t>
-            </w:r>
+              <w:t xml:space="preserve">№ </w:t>
+            </w:r>
+            <w:proofErr w:type="spellStart"/>
+            <w:r>
+              <w:rPr>
+                <w:rFonts w:eastAsia="Calibri"/>
+              </w:rPr>
+              <w:t>пп</w:t>
+            </w:r>
+            <w:proofErr w:type="spellEnd"/>
           </w:p>
         </w:tc>
         <w:tc>
@@ -14434,8 +15468,13 @@
                 <w:rFonts w:eastAsia="Calibri"/>
               </w:rPr>
             </w:pPr>
-            <w:r>
-              <w:t>Макиев Давид Русланович</w:t>
+            <w:proofErr w:type="spellStart"/>
+            <w:r>
+              <w:t>Макиев</w:t>
+            </w:r>
+            <w:proofErr w:type="spellEnd"/>
+            <w:r>
+              <w:t xml:space="preserve"> Давид Русланович</w:t>
             </w:r>
           </w:p>
         </w:tc>
@@ -14488,8 +15527,13 @@
                 <w:rFonts w:eastAsia="Calibri"/>
               </w:rPr>
             </w:pPr>
-            <w:r>
-              <w:t>Корсунов Андрей Васильевич</w:t>
+            <w:proofErr w:type="spellStart"/>
+            <w:r>
+              <w:t>Корсунов</w:t>
+            </w:r>
+            <w:proofErr w:type="spellEnd"/>
+            <w:r>
+              <w:t xml:space="preserve"> Андрей Васильевич</w:t>
             </w:r>
           </w:p>
         </w:tc>
@@ -14591,9 +15635,19 @@
               <w:spacing w:after="0" w:line="240" w:lineRule="auto"/>
               <w:contextualSpacing/>
             </w:pPr>
-            <w:r>
-              <w:t>Дулаев Таймураз Хазбиевич</w:t>
-            </w:r>
+            <w:proofErr w:type="spellStart"/>
+            <w:r>
+              <w:t>Дулаев</w:t>
+            </w:r>
+            <w:proofErr w:type="spellEnd"/>
+            <w:r>
+              <w:t xml:space="preserve"> Таймураз </w:t>
+            </w:r>
+            <w:proofErr w:type="spellStart"/>
+            <w:r>
+              <w:t>Хазбиевич</w:t>
+            </w:r>
+            <w:proofErr w:type="spellEnd"/>
           </w:p>
         </w:tc>
         <w:tc>
@@ -14612,26 +15666,87 @@
         </w:tc>
       </w:tr>
     </w:tbl>
-    <w:p/>
-    <w:p>
-      <w:r>
-        <w:t xml:space="preserve">Таблица </w:t>
-      </w:r>
-      <w:r>
+    <w:p>
+      <w:pPr>
+        <w:spacing w:after="0" w:line="240" w:lineRule="auto"/>
+      </w:pPr>
+    </w:p>
+    <w:p>
+      <w:pPr>
+        <w:spacing w:after="0" w:line="240" w:lineRule="auto"/>
+        <w:rPr>
+          <w:lang w:val="en-US"/>
+        </w:rPr>
+      </w:pPr>
+      <w:r>
+        <w:t>Таблица</w:t>
+      </w:r>
+      <w:r>
+        <w:rPr>
+          <w:lang w:val="en-US"/>
+        </w:rPr>
+        <w:t xml:space="preserve"> </w:t>
+      </w:r>
+      <w:r>
+        <w:rPr>
+          <w:lang w:val="en-US"/>
+        </w:rPr>
         <w:t>8</w:t>
       </w:r>
       <w:r>
+        <w:rPr>
+          <w:lang w:val="en-US"/>
+        </w:rPr>
         <w:t xml:space="preserve"> </w:t>
       </w:r>
       <w:r>
-        <w:t>–</w:t>
-      </w:r>
-      <w:r>
-        <w:t xml:space="preserve"> Состав </w:t>
-      </w:r>
-      <w:r>
-        <w:t>КСЧ и ОПБ Объекта</w:t>
-      </w:r>
+        <w:rPr>
+          <w:lang w:val="en-US"/>
+        </w:rPr>
+        <w:t xml:space="preserve">– </w:t>
+      </w:r>
+      <w:sdt>
+        <w:sdtPr>
+          <w:rPr>
+            <w:lang w:val="en-US"/>
+          </w:rPr>
+          <w:tag w:val="OBJ_TEXT_NAME_8_TABLE"/>
+          <w:id w:val="-2070185096"/>
+          <w:placeholder>
+            <w:docPart w:val="1471732E123F4223ACD4D704DEC4FDD1"/>
+          </w:placeholder>
+          <w:text/>
+        </w:sdtPr>
+        <w:sdtEndPr/>
+        <w:sdtContent>
+          <w:r>
+            <w:rPr>
+              <w:lang w:val="en-US"/>
+            </w:rPr>
+            <w:t>${OBJ_TEXT_NAME_</w:t>
+          </w:r>
+          <w:r>
+            <w:rPr>
+              <w:lang w:val="en-US"/>
+            </w:rPr>
+            <w:t>8</w:t>
+          </w:r>
+          <w:r>
+            <w:rPr>
+              <w:lang w:val="en-US"/>
+            </w:rPr>
+            <w:t>_TABLE}</w:t>
+          </w:r>
+        </w:sdtContent>
+      </w:sdt>
+    </w:p>
+    <w:p>
+      <w:pPr>
+        <w:spacing w:after="0" w:line="240" w:lineRule="auto"/>
+        <w:rPr>
+          <w:lang w:val="en-US"/>
+        </w:rPr>
+      </w:pPr>
     </w:p>
     <w:tbl>
       <w:tblPr>
@@ -14660,8 +15775,13 @@
               <w:jc w:val="center"/>
             </w:pPr>
             <w:r>
-              <w:t>№ пп</w:t>
-            </w:r>
+              <w:t xml:space="preserve">№ </w:t>
+            </w:r>
+            <w:proofErr w:type="spellStart"/>
+            <w:r>
+              <w:t>пп</w:t>
+            </w:r>
+            <w:proofErr w:type="spellEnd"/>
           </w:p>
         </w:tc>
         <w:tc>
@@ -18583,7 +19703,26 @@
         <w:jc w:val="center"/>
       </w:pPr>
       <w:r>
-        <w:t xml:space="preserve">Рисунок 4 </w:t>
+        <w:t xml:space="preserve">Рисунок </w:t>
+      </w:r>
+      <w:sdt>
+        <w:sdtPr>
+          <w:tag w:val="OBJ_NUM_4_IMAGE"/>
+          <w:id w:val="343449069"/>
+          <w:placeholder>
+            <w:docPart w:val="EF14DDBA4A6D4538BED443C6C116647B"/>
+          </w:placeholder>
+          <w:text/>
+        </w:sdtPr>
+        <w:sdtEndPr/>
+        <w:sdtContent>
+          <w:r>
+            <w:t>${OBJ_NUM_4_IMAGE}</w:t>
+          </w:r>
+        </w:sdtContent>
+      </w:sdt>
+      <w:r>
+        <w:t xml:space="preserve"> </w:t>
       </w:r>
       <w:r>
         <w:t xml:space="preserve">– Схема взаимодействия и оповещения </w:t>
@@ -18628,11 +19767,11 @@
           <w:lang w:eastAsia="en-US"/>
         </w:rPr>
       </w:pPr>
-      <w:bookmarkStart w:id="75" w:name="_Toc427057250"/>
-      <w:bookmarkStart w:id="76" w:name="_Toc430943235"/>
-      <w:bookmarkStart w:id="77" w:name="_Toc430958127"/>
-      <w:bookmarkStart w:id="78" w:name="_Toc209703498"/>
-      <w:bookmarkStart w:id="79" w:name="_Toc221000971"/>
+      <w:bookmarkStart w:id="77" w:name="_Toc427057250"/>
+      <w:bookmarkStart w:id="78" w:name="_Toc430943235"/>
+      <w:bookmarkStart w:id="79" w:name="_Toc430958127"/>
+      <w:bookmarkStart w:id="80" w:name="_Toc209703498"/>
+      <w:bookmarkStart w:id="81" w:name="_Toc221000971"/>
       <w:r>
         <w:rPr>
           <w:lang w:eastAsia="en-US"/>
@@ -18646,11 +19785,11 @@
         </w:rPr>
         <w:t>. Система взаимного обмена информацией между организациями – участниками локализации и ликвидации последствий аварий на объекте</w:t>
       </w:r>
-      <w:bookmarkEnd w:id="75"/>
-      <w:bookmarkEnd w:id="76"/>
       <w:bookmarkEnd w:id="77"/>
       <w:bookmarkEnd w:id="78"/>
       <w:bookmarkEnd w:id="79"/>
+      <w:bookmarkEnd w:id="80"/>
+      <w:bookmarkEnd w:id="81"/>
     </w:p>
     <w:p>
       <w:pPr>
@@ -18721,12 +19860,12 @@
           <w:lang w:eastAsia="en-US"/>
         </w:rPr>
       </w:pPr>
-      <w:bookmarkStart w:id="80" w:name="_Toc394928129"/>
-      <w:bookmarkStart w:id="81" w:name="_Toc427057251"/>
-      <w:bookmarkStart w:id="82" w:name="_Toc430943236"/>
-      <w:bookmarkStart w:id="83" w:name="_Toc430958128"/>
-      <w:bookmarkStart w:id="84" w:name="_Toc209703499"/>
-      <w:bookmarkStart w:id="85" w:name="_Toc221000972"/>
+      <w:bookmarkStart w:id="82" w:name="_Toc394928129"/>
+      <w:bookmarkStart w:id="83" w:name="_Toc427057251"/>
+      <w:bookmarkStart w:id="84" w:name="_Toc430943236"/>
+      <w:bookmarkStart w:id="85" w:name="_Toc430958128"/>
+      <w:bookmarkStart w:id="86" w:name="_Toc209703499"/>
+      <w:bookmarkStart w:id="87" w:name="_Toc221000972"/>
       <w:r>
         <w:rPr>
           <w:lang w:eastAsia="en-US"/>
@@ -18739,12 +19878,12 @@
         </w:rPr>
         <w:t>. Первоочередные действия при получении сигнала об аварии на объекте</w:t>
       </w:r>
-      <w:bookmarkEnd w:id="80"/>
-      <w:bookmarkEnd w:id="81"/>
       <w:bookmarkEnd w:id="82"/>
       <w:bookmarkEnd w:id="83"/>
       <w:bookmarkEnd w:id="84"/>
       <w:bookmarkEnd w:id="85"/>
+      <w:bookmarkEnd w:id="86"/>
+      <w:bookmarkEnd w:id="87"/>
     </w:p>
     <w:p>
       <w:pPr>
@@ -18860,25 +19999,25 @@
           <w:szCs w:val="24"/>
         </w:rPr>
       </w:pPr>
-      <w:bookmarkStart w:id="86" w:name="_Toc430943237"/>
-      <w:bookmarkStart w:id="87" w:name="_Toc430958129"/>
+      <w:bookmarkStart w:id="88" w:name="_Toc430943237"/>
+      <w:bookmarkStart w:id="89" w:name="_Toc430958129"/>
     </w:p>
     <w:p>
       <w:pPr>
         <w:pStyle w:val="2a"/>
       </w:pPr>
-      <w:bookmarkStart w:id="88" w:name="_Toc209703500"/>
-      <w:bookmarkStart w:id="89" w:name="_Toc221000973"/>
+      <w:bookmarkStart w:id="90" w:name="_Toc209703500"/>
+      <w:bookmarkStart w:id="91" w:name="_Toc221000973"/>
       <w:r>
         <w:t>10</w:t>
       </w:r>
       <w:r>
         <w:t>. Действия производственного персонала и аварийно-спасательных служб (формирований) по локализации и ликвидации аварийных ситуаций на ОПО</w:t>
       </w:r>
-      <w:bookmarkEnd w:id="86"/>
-      <w:bookmarkEnd w:id="87"/>
       <w:bookmarkEnd w:id="88"/>
       <w:bookmarkEnd w:id="89"/>
+      <w:bookmarkEnd w:id="90"/>
+      <w:bookmarkEnd w:id="91"/>
     </w:p>
     <w:p>
       <w:pPr>
@@ -18895,14 +20034,24 @@
       <w:r>
         <w:t xml:space="preserve">и сигнала об аварии на объекте </w:t>
       </w:r>
-      <w:r>
-        <w:t>привед</w:t>
-      </w:r>
-      <w:r>
-        <w:t>ё</w:t>
-      </w:r>
-      <w:r>
-        <w:t xml:space="preserve">н в таблице </w:t>
+      <w:sdt>
+        <w:sdtPr>
+          <w:tag w:val="OBJ_LINC_TEXT_9_TABLE"/>
+          <w:id w:val="-1640867996"/>
+          <w:placeholder>
+            <w:docPart w:val="223CEE558B09480CA6141FB049D92A20"/>
+          </w:placeholder>
+          <w:text/>
+        </w:sdtPr>
+        <w:sdtEndPr/>
+        <w:sdtContent>
+          <w:r>
+            <w:t>${OBJ_LINC_TEXT_9_TABLE}</w:t>
+          </w:r>
+        </w:sdtContent>
+      </w:sdt>
+      <w:r>
+        <w:t xml:space="preserve"> </w:t>
       </w:r>
       <w:r>
         <w:t>9</w:t>
@@ -18922,16 +20071,16 @@
       <w:pPr>
         <w:pStyle w:val="2a"/>
       </w:pPr>
-      <w:bookmarkStart w:id="90" w:name="_Toc209703501"/>
-      <w:bookmarkStart w:id="91" w:name="_Toc221000974"/>
+      <w:bookmarkStart w:id="92" w:name="_Toc209703501"/>
+      <w:bookmarkStart w:id="93" w:name="_Toc221000974"/>
       <w:r>
         <w:t>11</w:t>
       </w:r>
       <w:r>
         <w:t>. Мероприятия, направленные на обеспечение безопасности населения</w:t>
       </w:r>
-      <w:bookmarkEnd w:id="90"/>
-      <w:bookmarkEnd w:id="91"/>
+      <w:bookmarkEnd w:id="92"/>
+      <w:bookmarkEnd w:id="93"/>
     </w:p>
     <w:p>
       <w:pPr>
@@ -19587,8 +20736,8 @@
       <w:pPr>
         <w:pStyle w:val="2a"/>
       </w:pPr>
-      <w:bookmarkStart w:id="92" w:name="_Toc209703502"/>
-      <w:bookmarkStart w:id="93" w:name="_Toc221000975"/>
+      <w:bookmarkStart w:id="94" w:name="_Toc209703502"/>
+      <w:bookmarkStart w:id="95" w:name="_Toc221000975"/>
       <w:r>
         <w:t>1</w:t>
       </w:r>
@@ -19598,8 +20747,8 @@
       <w:r>
         <w:t>. Организация материально-технического, инженерного и финансового обеспечения операций по локализации и ликвидации аварий на объекте</w:t>
       </w:r>
-      <w:bookmarkEnd w:id="92"/>
-      <w:bookmarkEnd w:id="93"/>
+      <w:bookmarkEnd w:id="94"/>
+      <w:bookmarkEnd w:id="95"/>
     </w:p>
     <w:p>
       <w:pPr>
@@ -19804,41 +20953,60 @@
       <w:pPr>
         <w:pStyle w:val="1"/>
       </w:pPr>
-      <w:bookmarkStart w:id="94" w:name="_Toc394651834"/>
-      <w:bookmarkStart w:id="95" w:name="_Toc430097612"/>
-      <w:bookmarkStart w:id="96" w:name="_Toc430255939"/>
-      <w:bookmarkStart w:id="97" w:name="_Toc209703503"/>
-      <w:bookmarkStart w:id="98" w:name="_Toc221000976"/>
+      <w:bookmarkStart w:id="96" w:name="_Toc394651834"/>
+      <w:bookmarkStart w:id="97" w:name="_Toc430097612"/>
+      <w:bookmarkStart w:id="98" w:name="_Toc430255939"/>
+      <w:bookmarkStart w:id="99" w:name="_Toc209703503"/>
+      <w:bookmarkStart w:id="100" w:name="_Toc221000976"/>
       <w:r>
         <w:lastRenderedPageBreak/>
         <w:t>Специальные разделы плана мероприятий</w:t>
       </w:r>
-      <w:bookmarkEnd w:id="94"/>
-      <w:bookmarkEnd w:id="95"/>
       <w:bookmarkEnd w:id="96"/>
       <w:bookmarkEnd w:id="97"/>
       <w:bookmarkEnd w:id="98"/>
-    </w:p>
-    <w:p>
-      <w:pPr>
-        <w:spacing w:after="0" w:line="360" w:lineRule="auto"/>
+      <w:bookmarkEnd w:id="99"/>
+      <w:bookmarkEnd w:id="100"/>
+    </w:p>
+    <w:p>
+      <w:pPr>
+        <w:spacing w:after="0" w:line="240" w:lineRule="auto"/>
         <w:ind w:firstLine="709"/>
       </w:pPr>
       <w:r>
-        <w:t xml:space="preserve">Таблица </w:t>
-      </w:r>
-      <w:r>
-        <w:t>8</w:t>
+        <w:t>Таблица</w:t>
+      </w:r>
+      <w:r>
+        <w:t xml:space="preserve"> </w:t>
+      </w:r>
+      <w:r>
+        <w:t>9</w:t>
       </w:r>
       <w:r>
         <w:t xml:space="preserve"> – </w:t>
       </w:r>
-      <w:r>
-        <w:t xml:space="preserve">Порядок действия в случае аварии </w:t>
-      </w:r>
-      <w:r>
-        <w:t>на ОПО</w:t>
-      </w:r>
+      <w:sdt>
+        <w:sdtPr>
+          <w:tag w:val="OBJ_TEXT_NAME_9_TABLE"/>
+          <w:id w:val="-1704402631"/>
+          <w:placeholder>
+            <w:docPart w:val="5AAFAEC2D3C344E39A90A06977C5E3AB"/>
+          </w:placeholder>
+          <w:text/>
+        </w:sdtPr>
+        <w:sdtEndPr/>
+        <w:sdtContent>
+          <w:r>
+            <w:t>${OBJ_TEXT_NAME_9_TABLE}</w:t>
+          </w:r>
+        </w:sdtContent>
+      </w:sdt>
+    </w:p>
+    <w:p>
+      <w:pPr>
+        <w:spacing w:after="0" w:line="240" w:lineRule="auto"/>
+        <w:ind w:firstLine="709"/>
+      </w:pPr>
     </w:p>
     <w:tbl>
       <w:tblPr>
@@ -22461,14 +23629,14 @@
           <w:lang w:eastAsia="en-US"/>
         </w:rPr>
       </w:pPr>
-      <w:bookmarkStart w:id="99" w:name="_Toc414022297"/>
-      <w:bookmarkStart w:id="100" w:name="_Toc427057254"/>
-      <w:bookmarkStart w:id="101" w:name="_Toc431390633"/>
-      <w:bookmarkStart w:id="102" w:name="_Toc209703504"/>
-      <w:bookmarkStart w:id="103" w:name="_Toc221000977"/>
-      <w:bookmarkStart w:id="104" w:name="_Toc427057264"/>
-      <w:bookmarkStart w:id="105" w:name="_Toc430943242"/>
-      <w:bookmarkStart w:id="106" w:name="_Toc430958131"/>
+      <w:bookmarkStart w:id="101" w:name="_Toc414022297"/>
+      <w:bookmarkStart w:id="102" w:name="_Toc427057254"/>
+      <w:bookmarkStart w:id="103" w:name="_Toc431390633"/>
+      <w:bookmarkStart w:id="104" w:name="_Toc209703504"/>
+      <w:bookmarkStart w:id="105" w:name="_Toc221000977"/>
+      <w:bookmarkStart w:id="106" w:name="_Toc427057264"/>
+      <w:bookmarkStart w:id="107" w:name="_Toc430943242"/>
+      <w:bookmarkStart w:id="108" w:name="_Toc430958131"/>
       <w:r>
         <w:rPr>
           <w:lang w:eastAsia="en-US"/>
@@ -22482,26 +23650,26 @@
         </w:rPr>
         <w:t>. Распределение обязанностей между отдельными лицами, участвующими в ликвидации аварии</w:t>
       </w:r>
-      <w:bookmarkEnd w:id="99"/>
-      <w:bookmarkEnd w:id="100"/>
       <w:bookmarkEnd w:id="101"/>
       <w:bookmarkEnd w:id="102"/>
       <w:bookmarkEnd w:id="103"/>
+      <w:bookmarkEnd w:id="104"/>
+      <w:bookmarkEnd w:id="105"/>
     </w:p>
     <w:p>
       <w:pPr>
         <w:pStyle w:val="2a"/>
       </w:pPr>
-      <w:bookmarkStart w:id="107" w:name="_Toc209703505"/>
-      <w:bookmarkStart w:id="108" w:name="_Toc221000978"/>
+      <w:bookmarkStart w:id="109" w:name="_Toc209703505"/>
+      <w:bookmarkStart w:id="110" w:name="_Toc221000978"/>
       <w:r>
         <w:t>13.</w:t>
       </w:r>
       <w:r>
         <w:t>1. Общие положения</w:t>
       </w:r>
-      <w:bookmarkEnd w:id="107"/>
-      <w:bookmarkEnd w:id="108"/>
+      <w:bookmarkEnd w:id="109"/>
+      <w:bookmarkEnd w:id="110"/>
     </w:p>
     <w:p>
       <w:pPr>
@@ -23028,8 +24196,8 @@
       <w:pPr>
         <w:pStyle w:val="2a"/>
       </w:pPr>
-      <w:bookmarkStart w:id="109" w:name="_Toc209703506"/>
-      <w:bookmarkStart w:id="110" w:name="_Toc221000979"/>
+      <w:bookmarkStart w:id="111" w:name="_Toc209703506"/>
+      <w:bookmarkStart w:id="112" w:name="_Toc221000979"/>
       <w:r>
         <w:t>13.</w:t>
       </w:r>
@@ -23042,8 +24210,8 @@
       <w:r>
         <w:t xml:space="preserve"> руководителем выполняется следующий комплекс мер:</w:t>
       </w:r>
-      <w:bookmarkEnd w:id="109"/>
-      <w:bookmarkEnd w:id="110"/>
+      <w:bookmarkEnd w:id="111"/>
+      <w:bookmarkEnd w:id="112"/>
     </w:p>
     <w:p>
       <w:pPr>
@@ -23462,16 +24630,16 @@
       <w:pPr>
         <w:pStyle w:val="2a"/>
       </w:pPr>
-      <w:bookmarkStart w:id="111" w:name="_Toc209703507"/>
-      <w:bookmarkStart w:id="112" w:name="_Toc221000980"/>
+      <w:bookmarkStart w:id="113" w:name="_Toc209703507"/>
+      <w:bookmarkStart w:id="114" w:name="_Toc221000980"/>
       <w:r>
         <w:t>13.</w:t>
       </w:r>
       <w:r>
         <w:t>3. Обязанности технического руководителя</w:t>
       </w:r>
-      <w:bookmarkEnd w:id="111"/>
-      <w:bookmarkEnd w:id="112"/>
+      <w:bookmarkEnd w:id="113"/>
+      <w:bookmarkEnd w:id="114"/>
     </w:p>
     <w:p>
       <w:pPr>
@@ -23503,22 +24671,58 @@
           <w:sz w:val="24"/>
           <w:szCs w:val="24"/>
         </w:rPr>
-        <w:t xml:space="preserve">- разработку специальных программ (с указанием приоритетности реализации), предусматривающих дооснащение объекта средствами контроля, автоматического регулирования, устройствами взрывопредупреждения и взрывозащиты, быстродействующими отсекателями, системами безопасной аварийной остановки объекта, оповещения, защиты и спасения людей, создание запасов дегазирующих реагентов, совершенствование систем улавливания и дегазации вредных выбросов, устройство систем локализации, препятствующих распространению неорганизованных выбросов на территории организации и за ее пределами, и т.п., если при разработке </w:t>
-      </w:r>
+        <w:t xml:space="preserve">- разработку специальных программ (с указанием приоритетности реализации), предусматривающих дооснащение объекта средствами контроля, автоматического регулирования, устройствами </w:t>
+      </w:r>
+      <w:proofErr w:type="spellStart"/>
       <w:r>
         <w:rPr>
           <w:rFonts w:ascii="Times New Roman" w:hAnsi="Times New Roman"/>
           <w:sz w:val="24"/>
           <w:szCs w:val="24"/>
         </w:rPr>
-        <w:t>ПМЛЛПА</w:t>
-      </w:r>
+        <w:t>взрывопредупреждения</w:t>
+      </w:r>
+      <w:proofErr w:type="spellEnd"/>
       <w:r>
         <w:rPr>
           <w:rFonts w:ascii="Times New Roman" w:hAnsi="Times New Roman"/>
           <w:sz w:val="24"/>
           <w:szCs w:val="24"/>
         </w:rPr>
+        <w:t xml:space="preserve"> и взрывозащиты, быстродействующими </w:t>
+      </w:r>
+      <w:proofErr w:type="spellStart"/>
+      <w:r>
+        <w:rPr>
+          <w:rFonts w:ascii="Times New Roman" w:hAnsi="Times New Roman"/>
+          <w:sz w:val="24"/>
+          <w:szCs w:val="24"/>
+        </w:rPr>
+        <w:t>отсекателями</w:t>
+      </w:r>
+      <w:proofErr w:type="spellEnd"/>
+      <w:r>
+        <w:rPr>
+          <w:rFonts w:ascii="Times New Roman" w:hAnsi="Times New Roman"/>
+          <w:sz w:val="24"/>
+          <w:szCs w:val="24"/>
+        </w:rPr>
+        <w:t xml:space="preserve">, системами безопасной аварийной остановки объекта, оповещения, защиты и спасения людей, создание запасов дегазирующих реагентов, совершенствование систем улавливания и дегазации вредных выбросов, устройство систем локализации, препятствующих распространению неорганизованных выбросов на территории организации и за ее пределами, и т.п., если при разработке </w:t>
+      </w:r>
+      <w:r>
+        <w:rPr>
+          <w:rFonts w:ascii="Times New Roman" w:hAnsi="Times New Roman"/>
+          <w:sz w:val="24"/>
+          <w:szCs w:val="24"/>
+        </w:rPr>
+        <w:t>ПМЛЛПА</w:t>
+      </w:r>
+      <w:r>
+        <w:rPr>
+          <w:rFonts w:ascii="Times New Roman" w:hAnsi="Times New Roman"/>
+          <w:sz w:val="24"/>
+          <w:szCs w:val="24"/>
+        </w:rPr>
         <w:t xml:space="preserve"> выявляется недостаточная готовность объекта к противоаварийной защите;</w:t>
       </w:r>
     </w:p>
@@ -23844,8 +25048,8 @@
       <w:pPr>
         <w:pStyle w:val="2a"/>
       </w:pPr>
-      <w:bookmarkStart w:id="113" w:name="_Toc209703508"/>
-      <w:bookmarkStart w:id="114" w:name="_Toc221000981"/>
+      <w:bookmarkStart w:id="115" w:name="_Toc209703508"/>
+      <w:bookmarkStart w:id="116" w:name="_Toc221000981"/>
       <w:r>
         <w:t>13.4.</w:t>
       </w:r>
@@ -23858,8 +25062,8 @@
       <w:r>
         <w:t xml:space="preserve"> </w:t>
       </w:r>
-      <w:bookmarkStart w:id="115" w:name="_Hlk221183206"/>
-      <w:bookmarkEnd w:id="113"/>
+      <w:bookmarkStart w:id="117" w:name="_Hlk221183206"/>
+      <w:bookmarkEnd w:id="115"/>
       <w:sdt>
         <w:sdtPr>
           <w:rPr>
@@ -23882,8 +25086,8 @@
           </w:r>
         </w:sdtContent>
       </w:sdt>
-      <w:bookmarkEnd w:id="114"/>
-      <w:bookmarkEnd w:id="115"/>
+      <w:bookmarkEnd w:id="116"/>
+      <w:bookmarkEnd w:id="117"/>
     </w:p>
     <w:p>
       <w:pPr>
@@ -24300,8 +25504,8 @@
       <w:pPr>
         <w:pStyle w:val="2a"/>
       </w:pPr>
-      <w:bookmarkStart w:id="116" w:name="_Toc209703509"/>
-      <w:bookmarkStart w:id="117" w:name="_Toc221000982"/>
+      <w:bookmarkStart w:id="118" w:name="_Toc209703509"/>
+      <w:bookmarkStart w:id="119" w:name="_Toc221000982"/>
       <w:r>
         <w:t>13.</w:t>
       </w:r>
@@ -24311,8 +25515,8 @@
       <w:r>
         <w:t>начальника участка</w:t>
       </w:r>
-      <w:bookmarkEnd w:id="116"/>
-      <w:bookmarkEnd w:id="117"/>
+      <w:bookmarkEnd w:id="118"/>
+      <w:bookmarkEnd w:id="119"/>
     </w:p>
     <w:p>
       <w:pPr>
@@ -24586,8 +25790,8 @@
       <w:pPr>
         <w:pStyle w:val="2a"/>
       </w:pPr>
-      <w:bookmarkStart w:id="118" w:name="_Toc209703510"/>
-      <w:bookmarkStart w:id="119" w:name="_Toc221000983"/>
+      <w:bookmarkStart w:id="120" w:name="_Toc209703510"/>
+      <w:bookmarkStart w:id="121" w:name="_Toc221000983"/>
       <w:r>
         <w:t>13.</w:t>
       </w:r>
@@ -24597,11 +25801,11 @@
       <w:r>
         <w:t xml:space="preserve"> </w:t>
       </w:r>
-      <w:bookmarkEnd w:id="118"/>
+      <w:bookmarkEnd w:id="120"/>
       <w:r>
         <w:t>Объекта</w:t>
       </w:r>
-      <w:bookmarkEnd w:id="119"/>
+      <w:bookmarkEnd w:id="121"/>
     </w:p>
     <w:p>
       <w:pPr>
@@ -24802,15 +26006,15 @@
       <w:pPr>
         <w:pStyle w:val="2a"/>
       </w:pPr>
-      <w:bookmarkStart w:id="120" w:name="_Toc209703511"/>
-      <w:bookmarkStart w:id="121" w:name="_Toc221000984"/>
+      <w:bookmarkStart w:id="122" w:name="_Toc209703511"/>
+      <w:bookmarkStart w:id="123" w:name="_Toc221000984"/>
       <w:r>
         <w:t>13.</w:t>
       </w:r>
       <w:r>
         <w:t xml:space="preserve">7. Обязанности членов </w:t>
       </w:r>
-      <w:bookmarkStart w:id="122" w:name="_Hlk221183488"/>
+      <w:bookmarkStart w:id="124" w:name="_Hlk221183488"/>
       <w:sdt>
         <w:sdtPr>
           <w:tag w:val="ASF_STATUS_SHORT"/>
@@ -24827,7 +26031,7 @@
           </w:r>
         </w:sdtContent>
       </w:sdt>
-      <w:bookmarkEnd w:id="122"/>
+      <w:bookmarkEnd w:id="124"/>
       <w:r>
         <w:t xml:space="preserve"> </w:t>
       </w:r>
@@ -24847,8 +26051,8 @@
           </w:r>
         </w:sdtContent>
       </w:sdt>
-      <w:bookmarkEnd w:id="120"/>
-      <w:bookmarkEnd w:id="121"/>
+      <w:bookmarkEnd w:id="122"/>
+      <w:bookmarkEnd w:id="123"/>
     </w:p>
     <w:p>
       <w:pPr>
@@ -25287,16 +26491,16 @@
       <w:pPr>
         <w:pStyle w:val="2a"/>
       </w:pPr>
-      <w:bookmarkStart w:id="123" w:name="_Toc209703512"/>
-      <w:bookmarkStart w:id="124" w:name="_Toc221000985"/>
+      <w:bookmarkStart w:id="125" w:name="_Toc209703512"/>
+      <w:bookmarkStart w:id="126" w:name="_Toc221000985"/>
       <w:r>
         <w:t>13.</w:t>
       </w:r>
       <w:r>
         <w:t>8. Обязанности начальника ПЧ</w:t>
       </w:r>
-      <w:bookmarkEnd w:id="123"/>
-      <w:bookmarkEnd w:id="124"/>
+      <w:bookmarkEnd w:id="125"/>
+      <w:bookmarkEnd w:id="126"/>
     </w:p>
     <w:p>
       <w:pPr>
@@ -25594,16 +26798,16 @@
       <w:pPr>
         <w:pStyle w:val="2a"/>
       </w:pPr>
-      <w:bookmarkStart w:id="125" w:name="_Toc209703513"/>
-      <w:bookmarkStart w:id="126" w:name="_Toc221000986"/>
+      <w:bookmarkStart w:id="127" w:name="_Toc209703513"/>
+      <w:bookmarkStart w:id="128" w:name="_Toc221000986"/>
       <w:r>
         <w:t>13.</w:t>
       </w:r>
       <w:r>
         <w:t>9. Обязанности медицинского врача</w:t>
       </w:r>
-      <w:bookmarkEnd w:id="125"/>
-      <w:bookmarkEnd w:id="126"/>
+      <w:bookmarkEnd w:id="127"/>
+      <w:bookmarkEnd w:id="128"/>
     </w:p>
     <w:p>
       <w:pPr>
@@ -25649,16 +26853,16 @@
       <w:pPr>
         <w:pStyle w:val="2a"/>
       </w:pPr>
-      <w:bookmarkStart w:id="127" w:name="_Toc209703514"/>
-      <w:bookmarkStart w:id="128" w:name="_Toc221000987"/>
+      <w:bookmarkStart w:id="129" w:name="_Toc209703514"/>
+      <w:bookmarkStart w:id="130" w:name="_Toc221000987"/>
       <w:r>
         <w:t>13.10</w:t>
       </w:r>
       <w:r>
         <w:t>. Служба безопасности</w:t>
       </w:r>
-      <w:bookmarkEnd w:id="127"/>
-      <w:bookmarkEnd w:id="128"/>
+      <w:bookmarkEnd w:id="129"/>
+      <w:bookmarkEnd w:id="130"/>
     </w:p>
     <w:p>
       <w:pPr>
@@ -25706,16 +26910,16 @@
           <w:szCs w:val="24"/>
         </w:rPr>
       </w:pPr>
-      <w:bookmarkStart w:id="129" w:name="_Toc433207695"/>
-      <w:bookmarkStart w:id="130" w:name="_Toc209703515"/>
-      <w:bookmarkStart w:id="131" w:name="_Toc221000988"/>
-      <w:bookmarkStart w:id="132" w:name="_Toc381802546"/>
-      <w:bookmarkStart w:id="133" w:name="_Toc391383493"/>
-      <w:bookmarkStart w:id="134" w:name="_Toc414977744"/>
-      <w:bookmarkStart w:id="135" w:name="_Toc430943246"/>
-      <w:bookmarkEnd w:id="104"/>
-      <w:bookmarkEnd w:id="105"/>
+      <w:bookmarkStart w:id="131" w:name="_Toc433207695"/>
+      <w:bookmarkStart w:id="132" w:name="_Toc209703515"/>
+      <w:bookmarkStart w:id="133" w:name="_Toc221000988"/>
+      <w:bookmarkStart w:id="134" w:name="_Toc381802546"/>
+      <w:bookmarkStart w:id="135" w:name="_Toc391383493"/>
+      <w:bookmarkStart w:id="136" w:name="_Toc414977744"/>
+      <w:bookmarkStart w:id="137" w:name="_Toc430943246"/>
       <w:bookmarkEnd w:id="106"/>
+      <w:bookmarkEnd w:id="107"/>
+      <w:bookmarkEnd w:id="108"/>
       <w:r>
         <w:rPr>
           <w:rFonts w:ascii="Times New Roman" w:hAnsi="Times New Roman"/>
@@ -25767,7 +26971,7 @@
         </w:rPr>
         <w:t xml:space="preserve"> </w:t>
       </w:r>
-      <w:bookmarkEnd w:id="129"/>
+      <w:bookmarkEnd w:id="131"/>
       <w:sdt>
         <w:sdtPr>
           <w:rPr>
@@ -25798,8 +27002,8 @@
           </w:r>
         </w:sdtContent>
       </w:sdt>
-      <w:bookmarkEnd w:id="130"/>
-      <w:bookmarkEnd w:id="131"/>
+      <w:bookmarkEnd w:id="132"/>
+      <w:bookmarkEnd w:id="133"/>
     </w:p>
     <w:p>
       <w:pPr>
@@ -25838,8 +27042,8 @@
         </w:rPr>
         <w:t>APPENDIX</w:t>
       </w:r>
-      <w:bookmarkStart w:id="136" w:name="_Toc209703516"/>
-      <w:bookmarkStart w:id="137" w:name="_Toc221000989"/>
+      <w:bookmarkStart w:id="138" w:name="_Toc209703516"/>
+      <w:bookmarkStart w:id="139" w:name="_Toc221000989"/>
     </w:p>
     <w:p>
       <w:pPr>
@@ -25856,8 +27060,6 @@
           <w:lang w:val="en-US"/>
         </w:rPr>
       </w:pPr>
-      <w:bookmarkStart w:id="138" w:name="_GoBack"/>
-      <w:bookmarkEnd w:id="138"/>
       <w:r>
         <w:rPr>
           <w:rFonts w:ascii="Times New Roman" w:hAnsi="Times New Roman"/>
@@ -25900,12 +27102,12 @@
         </w:rPr>
         <w:t xml:space="preserve"> </w:t>
       </w:r>
-      <w:bookmarkEnd w:id="132"/>
-      <w:bookmarkEnd w:id="133"/>
       <w:bookmarkEnd w:id="134"/>
       <w:bookmarkEnd w:id="135"/>
       <w:bookmarkEnd w:id="136"/>
       <w:bookmarkEnd w:id="137"/>
+      <w:bookmarkEnd w:id="138"/>
+      <w:bookmarkEnd w:id="139"/>
       <w:sdt>
         <w:sdtPr>
           <w:rPr>
@@ -33378,6 +34580,499 @@
         </w:p>
       </w:docPartBody>
     </w:docPart>
+    <w:docPart>
+      <w:docPartPr>
+        <w:name w:val="A6AB2859CD35495595DC1B44C13997D9"/>
+        <w:category>
+          <w:name w:val="Общие"/>
+          <w:gallery w:val="placeholder"/>
+        </w:category>
+        <w:types>
+          <w:type w:val="bbPlcHdr"/>
+        </w:types>
+        <w:behaviors>
+          <w:behavior w:val="content"/>
+        </w:behaviors>
+        <w:guid w:val="{23C51C8B-71E5-4416-B192-CFD8906B9C1B}"/>
+      </w:docPartPr>
+      <w:docPartBody>
+        <w:p>
+          <w:pPr>
+            <w:pStyle w:val="A6AB2859CD35495595DC1B44C13997D9"/>
+          </w:pPr>
+          <w:r>
+            <w:rPr>
+              <w:rStyle w:val="a3"/>
+            </w:rPr>
+            <w:t>Место для ввода текста.</w:t>
+          </w:r>
+        </w:p>
+      </w:docPartBody>
+    </w:docPart>
+    <w:docPart>
+      <w:docPartPr>
+        <w:name w:val="9D4C5225C9F54DC4A8D9AE4B943C120F"/>
+        <w:category>
+          <w:name w:val="Общие"/>
+          <w:gallery w:val="placeholder"/>
+        </w:category>
+        <w:types>
+          <w:type w:val="bbPlcHdr"/>
+        </w:types>
+        <w:behaviors>
+          <w:behavior w:val="content"/>
+        </w:behaviors>
+        <w:guid w:val="{6D32BA92-7E82-4783-8137-7DA27E536F70}"/>
+      </w:docPartPr>
+      <w:docPartBody>
+        <w:p>
+          <w:pPr>
+            <w:pStyle w:val="9D4C5225C9F54DC4A8D9AE4B943C120F"/>
+          </w:pPr>
+          <w:r>
+            <w:rPr>
+              <w:rStyle w:val="a3"/>
+            </w:rPr>
+            <w:t>Место для ввода текста.</w:t>
+          </w:r>
+        </w:p>
+      </w:docPartBody>
+    </w:docPart>
+    <w:docPart>
+      <w:docPartPr>
+        <w:name w:val="B1B1AD10BCF345B3B7E8AB8A6E0A0185"/>
+        <w:category>
+          <w:name w:val="Общие"/>
+          <w:gallery w:val="placeholder"/>
+        </w:category>
+        <w:types>
+          <w:type w:val="bbPlcHdr"/>
+        </w:types>
+        <w:behaviors>
+          <w:behavior w:val="content"/>
+        </w:behaviors>
+        <w:guid w:val="{96BE731D-CFBE-40A5-A37D-806B051168AF}"/>
+      </w:docPartPr>
+      <w:docPartBody>
+        <w:p>
+          <w:pPr>
+            <w:pStyle w:val="B1B1AD10BCF345B3B7E8AB8A6E0A0185"/>
+          </w:pPr>
+          <w:r>
+            <w:rPr>
+              <w:rStyle w:val="a3"/>
+            </w:rPr>
+            <w:t>Место для ввода текста.</w:t>
+          </w:r>
+        </w:p>
+      </w:docPartBody>
+    </w:docPart>
+    <w:docPart>
+      <w:docPartPr>
+        <w:name w:val="CC9BEDD1E228474AB3018C21A34D8E1A"/>
+        <w:category>
+          <w:name w:val="Общие"/>
+          <w:gallery w:val="placeholder"/>
+        </w:category>
+        <w:types>
+          <w:type w:val="bbPlcHdr"/>
+        </w:types>
+        <w:behaviors>
+          <w:behavior w:val="content"/>
+        </w:behaviors>
+        <w:guid w:val="{9E4B49E7-9817-4362-B7A2-C00271F7FE2F}"/>
+      </w:docPartPr>
+      <w:docPartBody>
+        <w:p>
+          <w:pPr>
+            <w:pStyle w:val="CC9BEDD1E228474AB3018C21A34D8E1A"/>
+          </w:pPr>
+          <w:r>
+            <w:rPr>
+              <w:rStyle w:val="a3"/>
+            </w:rPr>
+            <w:t>Место для ввода текста.</w:t>
+          </w:r>
+        </w:p>
+      </w:docPartBody>
+    </w:docPart>
+    <w:docPart>
+      <w:docPartPr>
+        <w:name w:val="1DBABD64649B4DEE9C5688C6D9AC5E97"/>
+        <w:category>
+          <w:name w:val="Общие"/>
+          <w:gallery w:val="placeholder"/>
+        </w:category>
+        <w:types>
+          <w:type w:val="bbPlcHdr"/>
+        </w:types>
+        <w:behaviors>
+          <w:behavior w:val="content"/>
+        </w:behaviors>
+        <w:guid w:val="{4CCDBA74-4C04-4F0B-B33D-F9733141573F}"/>
+      </w:docPartPr>
+      <w:docPartBody>
+        <w:p>
+          <w:pPr>
+            <w:pStyle w:val="1DBABD64649B4DEE9C5688C6D9AC5E97"/>
+          </w:pPr>
+          <w:r>
+            <w:rPr>
+              <w:rStyle w:val="a3"/>
+            </w:rPr>
+            <w:t>Место для ввода текста.</w:t>
+          </w:r>
+        </w:p>
+      </w:docPartBody>
+    </w:docPart>
+    <w:docPart>
+      <w:docPartPr>
+        <w:name w:val="759EDD12A804487E82E849137AFC2B1D"/>
+        <w:category>
+          <w:name w:val="Общие"/>
+          <w:gallery w:val="placeholder"/>
+        </w:category>
+        <w:types>
+          <w:type w:val="bbPlcHdr"/>
+        </w:types>
+        <w:behaviors>
+          <w:behavior w:val="content"/>
+        </w:behaviors>
+        <w:guid w:val="{1BE4343E-338C-4E02-BC86-38DF5D7500FF}"/>
+      </w:docPartPr>
+      <w:docPartBody>
+        <w:p>
+          <w:pPr>
+            <w:pStyle w:val="759EDD12A804487E82E849137AFC2B1D"/>
+          </w:pPr>
+          <w:r>
+            <w:rPr>
+              <w:rStyle w:val="a3"/>
+            </w:rPr>
+            <w:t>Место для ввода текста.</w:t>
+          </w:r>
+        </w:p>
+      </w:docPartBody>
+    </w:docPart>
+    <w:docPart>
+      <w:docPartPr>
+        <w:name w:val="1471732E123F4223ACD4D704DEC4FDD1"/>
+        <w:category>
+          <w:name w:val="Общие"/>
+          <w:gallery w:val="placeholder"/>
+        </w:category>
+        <w:types>
+          <w:type w:val="bbPlcHdr"/>
+        </w:types>
+        <w:behaviors>
+          <w:behavior w:val="content"/>
+        </w:behaviors>
+        <w:guid w:val="{AAA1CF48-DE4C-40BE-9BEE-32C07BAB1CFD}"/>
+      </w:docPartPr>
+      <w:docPartBody>
+        <w:p>
+          <w:pPr>
+            <w:pStyle w:val="1471732E123F4223ACD4D704DEC4FDD1"/>
+          </w:pPr>
+          <w:r>
+            <w:rPr>
+              <w:rStyle w:val="a3"/>
+            </w:rPr>
+            <w:t>Место для ввода текста.</w:t>
+          </w:r>
+        </w:p>
+      </w:docPartBody>
+    </w:docPart>
+    <w:docPart>
+      <w:docPartPr>
+        <w:name w:val="7687FF12CCEE48EE93BCB1987E5A8179"/>
+        <w:category>
+          <w:name w:val="Общие"/>
+          <w:gallery w:val="placeholder"/>
+        </w:category>
+        <w:types>
+          <w:type w:val="bbPlcHdr"/>
+        </w:types>
+        <w:behaviors>
+          <w:behavior w:val="content"/>
+        </w:behaviors>
+        <w:guid w:val="{C44F92DB-BC0E-4BAF-86B1-DC17AA145273}"/>
+      </w:docPartPr>
+      <w:docPartBody>
+        <w:p>
+          <w:pPr>
+            <w:pStyle w:val="7687FF12CCEE48EE93BCB1987E5A8179"/>
+          </w:pPr>
+          <w:r>
+            <w:rPr>
+              <w:rStyle w:val="a3"/>
+            </w:rPr>
+            <w:t>Место для ввода текста.</w:t>
+          </w:r>
+        </w:p>
+      </w:docPartBody>
+    </w:docPart>
+    <w:docPart>
+      <w:docPartPr>
+        <w:name w:val="76C728EAE1A04C2E9C7CE67DC0682365"/>
+        <w:category>
+          <w:name w:val="Общие"/>
+          <w:gallery w:val="placeholder"/>
+        </w:category>
+        <w:types>
+          <w:type w:val="bbPlcHdr"/>
+        </w:types>
+        <w:behaviors>
+          <w:behavior w:val="content"/>
+        </w:behaviors>
+        <w:guid w:val="{147A5834-725F-4B11-8F4E-E147F3F21F0B}"/>
+      </w:docPartPr>
+      <w:docPartBody>
+        <w:p>
+          <w:pPr>
+            <w:pStyle w:val="76C728EAE1A04C2E9C7CE67DC0682365"/>
+          </w:pPr>
+          <w:r>
+            <w:rPr>
+              <w:rStyle w:val="a3"/>
+            </w:rPr>
+            <w:t>Место для ввода текста.</w:t>
+          </w:r>
+        </w:p>
+      </w:docPartBody>
+    </w:docPart>
+    <w:docPart>
+      <w:docPartPr>
+        <w:name w:val="6BDB6FDC91FA4D5087A7980222DCCAA8"/>
+        <w:category>
+          <w:name w:val="Общие"/>
+          <w:gallery w:val="placeholder"/>
+        </w:category>
+        <w:types>
+          <w:type w:val="bbPlcHdr"/>
+        </w:types>
+        <w:behaviors>
+          <w:behavior w:val="content"/>
+        </w:behaviors>
+        <w:guid w:val="{7DC592F1-3E47-434D-9857-E029D19134B8}"/>
+      </w:docPartPr>
+      <w:docPartBody>
+        <w:p>
+          <w:pPr>
+            <w:pStyle w:val="6BDB6FDC91FA4D5087A7980222DCCAA8"/>
+          </w:pPr>
+          <w:r>
+            <w:rPr>
+              <w:rStyle w:val="a3"/>
+            </w:rPr>
+            <w:t>Место для ввода текста.</w:t>
+          </w:r>
+        </w:p>
+      </w:docPartBody>
+    </w:docPart>
+    <w:docPart>
+      <w:docPartPr>
+        <w:name w:val="0825214F32474CDF8EE20883F9103C87"/>
+        <w:category>
+          <w:name w:val="Общие"/>
+          <w:gallery w:val="placeholder"/>
+        </w:category>
+        <w:types>
+          <w:type w:val="bbPlcHdr"/>
+        </w:types>
+        <w:behaviors>
+          <w:behavior w:val="content"/>
+        </w:behaviors>
+        <w:guid w:val="{CF6ACD12-69E1-4FA9-B874-BEBA29FDE69C}"/>
+      </w:docPartPr>
+      <w:docPartBody>
+        <w:p>
+          <w:pPr>
+            <w:pStyle w:val="0825214F32474CDF8EE20883F9103C87"/>
+          </w:pPr>
+          <w:r>
+            <w:rPr>
+              <w:rStyle w:val="a3"/>
+            </w:rPr>
+            <w:t>Место для ввода текста.</w:t>
+          </w:r>
+        </w:p>
+      </w:docPartBody>
+    </w:docPart>
+    <w:docPart>
+      <w:docPartPr>
+        <w:name w:val="EF14DDBA4A6D4538BED443C6C116647B"/>
+        <w:category>
+          <w:name w:val="Общие"/>
+          <w:gallery w:val="placeholder"/>
+        </w:category>
+        <w:types>
+          <w:type w:val="bbPlcHdr"/>
+        </w:types>
+        <w:behaviors>
+          <w:behavior w:val="content"/>
+        </w:behaviors>
+        <w:guid w:val="{B384A457-03AD-4245-AA7A-E312B08F4EFD}"/>
+      </w:docPartPr>
+      <w:docPartBody>
+        <w:p>
+          <w:pPr>
+            <w:pStyle w:val="EF14DDBA4A6D4538BED443C6C116647B"/>
+          </w:pPr>
+          <w:r>
+            <w:rPr>
+              <w:rStyle w:val="a3"/>
+            </w:rPr>
+            <w:t>Место для ввода текста.</w:t>
+          </w:r>
+        </w:p>
+      </w:docPartBody>
+    </w:docPart>
+    <w:docPart>
+      <w:docPartPr>
+        <w:name w:val="223CEE558B09480CA6141FB049D92A20"/>
+        <w:category>
+          <w:name w:val="Общие"/>
+          <w:gallery w:val="placeholder"/>
+        </w:category>
+        <w:types>
+          <w:type w:val="bbPlcHdr"/>
+        </w:types>
+        <w:behaviors>
+          <w:behavior w:val="content"/>
+        </w:behaviors>
+        <w:guid w:val="{C1C62E73-745D-4DE6-B98F-0FA9B6E13259}"/>
+      </w:docPartPr>
+      <w:docPartBody>
+        <w:p>
+          <w:pPr>
+            <w:pStyle w:val="223CEE558B09480CA6141FB049D92A20"/>
+          </w:pPr>
+          <w:r>
+            <w:rPr>
+              <w:rStyle w:val="a3"/>
+            </w:rPr>
+            <w:t>Место для ввода текста.</w:t>
+          </w:r>
+        </w:p>
+      </w:docPartBody>
+    </w:docPart>
+    <w:docPart>
+      <w:docPartPr>
+        <w:name w:val="5AAFAEC2D3C344E39A90A06977C5E3AB"/>
+        <w:category>
+          <w:name w:val="Общие"/>
+          <w:gallery w:val="placeholder"/>
+        </w:category>
+        <w:types>
+          <w:type w:val="bbPlcHdr"/>
+        </w:types>
+        <w:behaviors>
+          <w:behavior w:val="content"/>
+        </w:behaviors>
+        <w:guid w:val="{DB08A386-AD4E-4A8D-9443-0BD0D81127F5}"/>
+      </w:docPartPr>
+      <w:docPartBody>
+        <w:p>
+          <w:pPr>
+            <w:pStyle w:val="5AAFAEC2D3C344E39A90A06977C5E3AB"/>
+          </w:pPr>
+          <w:r>
+            <w:rPr>
+              <w:rStyle w:val="a3"/>
+            </w:rPr>
+            <w:t>Место для ввода текста.</w:t>
+          </w:r>
+        </w:p>
+      </w:docPartBody>
+    </w:docPart>
+    <w:docPart>
+      <w:docPartPr>
+        <w:name w:val="966103BC6AAA40A3BBF84D9B08ACB4BD"/>
+        <w:category>
+          <w:name w:val="Общие"/>
+          <w:gallery w:val="placeholder"/>
+        </w:category>
+        <w:types>
+          <w:type w:val="bbPlcHdr"/>
+        </w:types>
+        <w:behaviors>
+          <w:behavior w:val="content"/>
+        </w:behaviors>
+        <w:guid w:val="{98613EFA-EC3E-4ABC-8FDC-BBC8036748EB}"/>
+      </w:docPartPr>
+      <w:docPartBody>
+        <w:p>
+          <w:pPr>
+            <w:pStyle w:val="966103BC6AAA40A3BBF84D9B08ACB4BD"/>
+          </w:pPr>
+          <w:r>
+            <w:rPr>
+              <w:rStyle w:val="a3"/>
+            </w:rPr>
+            <w:t>Место для ввода текста.</w:t>
+          </w:r>
+        </w:p>
+      </w:docPartBody>
+    </w:docPart>
+    <w:docPart>
+      <w:docPartPr>
+        <w:name w:val="E2987E49481B4A8988C0D5E41A0AFDB8"/>
+        <w:category>
+          <w:name w:val="Общие"/>
+          <w:gallery w:val="placeholder"/>
+        </w:category>
+        <w:types>
+          <w:type w:val="bbPlcHdr"/>
+        </w:types>
+        <w:behaviors>
+          <w:behavior w:val="content"/>
+        </w:behaviors>
+        <w:guid w:val="{EEF1ECFC-6557-4087-BCB6-3BFF8F71CFF3}"/>
+      </w:docPartPr>
+      <w:docPartBody>
+        <w:p>
+          <w:pPr>
+            <w:pStyle w:val="E2987E49481B4A8988C0D5E41A0AFDB8"/>
+          </w:pPr>
+          <w:r>
+            <w:rPr>
+              <w:rStyle w:val="a3"/>
+            </w:rPr>
+            <w:t>Место для ввода текста.</w:t>
+          </w:r>
+        </w:p>
+      </w:docPartBody>
+    </w:docPart>
+    <w:docPart>
+      <w:docPartPr>
+        <w:name w:val="CE76057F9A8547B4A81853FA15C0E007"/>
+        <w:category>
+          <w:name w:val="Общие"/>
+          <w:gallery w:val="placeholder"/>
+        </w:category>
+        <w:types>
+          <w:type w:val="bbPlcHdr"/>
+        </w:types>
+        <w:behaviors>
+          <w:behavior w:val="content"/>
+        </w:behaviors>
+        <w:guid w:val="{5703CFBB-5134-49F3-87A4-D9257AE5CB63}"/>
+      </w:docPartPr>
+      <w:docPartBody>
+        <w:p>
+          <w:pPr>
+            <w:pStyle w:val="CE76057F9A8547B4A81853FA15C0E007"/>
+          </w:pPr>
+          <w:r>
+            <w:rPr>
+              <w:rStyle w:val="a3"/>
+            </w:rPr>
+            <w:t>Место для ввода текста.</w:t>
+          </w:r>
+        </w:p>
+      </w:docPartBody>
+    </w:docPart>
   </w:docParts>
 </w:glossaryDocument>
 </file>
@@ -33435,7 +35130,7 @@
   </w:font>
   <w:font w:name="Arial">
     <w:panose1 w:val="020B0604020202020204"/>
-    <w:charset w:val="CC"/>
+    <w:charset w:val="00"/>
     <w:family w:val="swiss"/>
     <w:pitch w:val="variable"/>
     <w:sig w:usb0="E0002EFF" w:usb1="C000785B" w:usb2="00000009" w:usb3="00000000" w:csb0="000001FF" w:csb1="00000000"/>
@@ -33500,6 +35195,7 @@
     <w:rsid w:val="00152D9F"/>
     <w:rsid w:val="00161281"/>
     <w:rsid w:val="001B085C"/>
+    <w:rsid w:val="00222FCC"/>
     <w:rsid w:val="002234A2"/>
     <w:rsid w:val="0022586E"/>
     <w:rsid w:val="002E32E4"/>
@@ -33510,6 +35206,7 @@
     <w:rsid w:val="00383679"/>
     <w:rsid w:val="003D7834"/>
     <w:rsid w:val="00451345"/>
+    <w:rsid w:val="00482A4F"/>
     <w:rsid w:val="004C0405"/>
     <w:rsid w:val="00594162"/>
     <w:rsid w:val="005A552B"/>
@@ -33523,6 +35220,7 @@
     <w:rsid w:val="008B6AFA"/>
     <w:rsid w:val="008C64D6"/>
     <w:rsid w:val="008D5632"/>
+    <w:rsid w:val="008F7EFA"/>
     <w:rsid w:val="00983331"/>
     <w:rsid w:val="00987BD2"/>
     <w:rsid w:val="00991C9C"/>
@@ -33535,10 +35233,12 @@
     <w:rsid w:val="00C10959"/>
     <w:rsid w:val="00C14CD6"/>
     <w:rsid w:val="00CD19C9"/>
+    <w:rsid w:val="00CF1004"/>
     <w:rsid w:val="00D40919"/>
     <w:rsid w:val="00DC1856"/>
     <w:rsid w:val="00DF152C"/>
     <w:rsid w:val="00E429B7"/>
+    <w:rsid w:val="00E511F3"/>
     <w:rsid w:val="00E95897"/>
     <w:rsid w:val="00EC2765"/>
     <w:rsid w:val="00EC6E2E"/>
@@ -33996,7 +35696,7 @@
     <w:basedOn w:val="a0"/>
     <w:uiPriority w:val="99"/>
     <w:semiHidden/>
-    <w:rsid w:val="00B66477"/>
+    <w:rsid w:val="00CF1004"/>
     <w:rPr>
       <w:color w:val="808080"/>
     </w:rPr>
@@ -34116,6 +35816,78 @@
   <w:style w:type="paragraph" w:customStyle="1" w:styleId="65E02D35AA15408C98BA9599EB836D50">
     <w:name w:val="65E02D35AA15408C98BA9599EB836D50"/>
     <w:rsid w:val="00B66477"/>
+  </w:style>
+  <w:style w:type="paragraph" w:customStyle="1" w:styleId="A6AB2859CD35495595DC1B44C13997D9">
+    <w:name w:val="A6AB2859CD35495595DC1B44C13997D9"/>
+    <w:rsid w:val="008F7EFA"/>
+  </w:style>
+  <w:style w:type="paragraph" w:customStyle="1" w:styleId="9D4C5225C9F54DC4A8D9AE4B943C120F">
+    <w:name w:val="9D4C5225C9F54DC4A8D9AE4B943C120F"/>
+    <w:rsid w:val="00482A4F"/>
+  </w:style>
+  <w:style w:type="paragraph" w:customStyle="1" w:styleId="B1B1AD10BCF345B3B7E8AB8A6E0A0185">
+    <w:name w:val="B1B1AD10BCF345B3B7E8AB8A6E0A0185"/>
+    <w:rsid w:val="00482A4F"/>
+  </w:style>
+  <w:style w:type="paragraph" w:customStyle="1" w:styleId="CC9BEDD1E228474AB3018C21A34D8E1A">
+    <w:name w:val="CC9BEDD1E228474AB3018C21A34D8E1A"/>
+    <w:rsid w:val="00482A4F"/>
+  </w:style>
+  <w:style w:type="paragraph" w:customStyle="1" w:styleId="1DBABD64649B4DEE9C5688C6D9AC5E97">
+    <w:name w:val="1DBABD64649B4DEE9C5688C6D9AC5E97"/>
+    <w:rsid w:val="00482A4F"/>
+  </w:style>
+  <w:style w:type="paragraph" w:customStyle="1" w:styleId="759EDD12A804487E82E849137AFC2B1D">
+    <w:name w:val="759EDD12A804487E82E849137AFC2B1D"/>
+    <w:rsid w:val="00482A4F"/>
+  </w:style>
+  <w:style w:type="paragraph" w:customStyle="1" w:styleId="1471732E123F4223ACD4D704DEC4FDD1">
+    <w:name w:val="1471732E123F4223ACD4D704DEC4FDD1"/>
+    <w:rsid w:val="00482A4F"/>
+  </w:style>
+  <w:style w:type="paragraph" w:customStyle="1" w:styleId="7687FF12CCEE48EE93BCB1987E5A8179">
+    <w:name w:val="7687FF12CCEE48EE93BCB1987E5A8179"/>
+    <w:rsid w:val="00482A4F"/>
+  </w:style>
+  <w:style w:type="paragraph" w:customStyle="1" w:styleId="76C728EAE1A04C2E9C7CE67DC0682365">
+    <w:name w:val="76C728EAE1A04C2E9C7CE67DC0682365"/>
+    <w:rsid w:val="00482A4F"/>
+  </w:style>
+  <w:style w:type="paragraph" w:customStyle="1" w:styleId="6BDB6FDC91FA4D5087A7980222DCCAA8">
+    <w:name w:val="6BDB6FDC91FA4D5087A7980222DCCAA8"/>
+    <w:rsid w:val="00482A4F"/>
+  </w:style>
+  <w:style w:type="paragraph" w:customStyle="1" w:styleId="0825214F32474CDF8EE20883F9103C87">
+    <w:name w:val="0825214F32474CDF8EE20883F9103C87"/>
+    <w:rsid w:val="00482A4F"/>
+  </w:style>
+  <w:style w:type="paragraph" w:customStyle="1" w:styleId="EF14DDBA4A6D4538BED443C6C116647B">
+    <w:name w:val="EF14DDBA4A6D4538BED443C6C116647B"/>
+    <w:rsid w:val="00482A4F"/>
+  </w:style>
+  <w:style w:type="paragraph" w:customStyle="1" w:styleId="B73C2B3B50D44DEF991A29F32908951D">
+    <w:name w:val="B73C2B3B50D44DEF991A29F32908951D"/>
+    <w:rsid w:val="00482A4F"/>
+  </w:style>
+  <w:style w:type="paragraph" w:customStyle="1" w:styleId="223CEE558B09480CA6141FB049D92A20">
+    <w:name w:val="223CEE558B09480CA6141FB049D92A20"/>
+    <w:rsid w:val="00482A4F"/>
+  </w:style>
+  <w:style w:type="paragraph" w:customStyle="1" w:styleId="5AAFAEC2D3C344E39A90A06977C5E3AB">
+    <w:name w:val="5AAFAEC2D3C344E39A90A06977C5E3AB"/>
+    <w:rsid w:val="00482A4F"/>
+  </w:style>
+  <w:style w:type="paragraph" w:customStyle="1" w:styleId="966103BC6AAA40A3BBF84D9B08ACB4BD">
+    <w:name w:val="966103BC6AAA40A3BBF84D9B08ACB4BD"/>
+    <w:rsid w:val="00CF1004"/>
+  </w:style>
+  <w:style w:type="paragraph" w:customStyle="1" w:styleId="E2987E49481B4A8988C0D5E41A0AFDB8">
+    <w:name w:val="E2987E49481B4A8988C0D5E41A0AFDB8"/>
+    <w:rsid w:val="00CF1004"/>
+  </w:style>
+  <w:style w:type="paragraph" w:customStyle="1" w:styleId="CE76057F9A8547B4A81853FA15C0E007">
+    <w:name w:val="CE76057F9A8547B4A81853FA15C0E007"/>
+    <w:rsid w:val="00CF1004"/>
   </w:style>
 </w:styles>
 </file>
@@ -34427,7 +36199,7 @@
 </file>
 
 <file path=customXml/itemProps1.xml><?xml version="1.0" encoding="utf-8"?>
-<ds:datastoreItem xmlns:ds="http://schemas.openxmlformats.org/officeDocument/2006/customXml" ds:itemID="{A4E5BC17-5E97-483D-A79D-08B0EF165F88}">
+<ds:datastoreItem xmlns:ds="http://schemas.openxmlformats.org/officeDocument/2006/customXml" ds:itemID="{7831FB2C-8AB7-4C03-BF3E-409884F84B19}">
   <ds:schemaRefs>
     <ds:schemaRef ds:uri="http://schemas.openxmlformats.org/officeDocument/2006/bibliography"/>
   </ds:schemaRefs>

</xml_diff>